<commit_message>
Report: drop reference to co-authored commits; no Claude trailers in commits
</commit_message>
<xml_diff>
--- a/report/Sentari_Project_Report.docx
+++ b/report/Sentari_Project_Report.docx
@@ -275,7 +275,7 @@
     <w:sdt>
       <w:sdtPr>
         <w:alias w:val="Table of Contents"/>
-        <w:id w:val="1020669408"/>
+        <w:id w:val="-1067182064"/>
       </w:sdtPr>
       <w:sdtEndPr>
         <w:rPr>
@@ -307,7 +307,7 @@
           <w:r>
             <w:fldChar w:fldCharType="separate"/>
           </w:r>
-          <w:hyperlink w:anchor="_Toc241179090" w:history="1">
+          <w:hyperlink w:anchor="_Toc241461295" w:history="1">
             <w:r>
               <w:rPr>
                 <w:rStyle w:val="Hyperlink"/>
@@ -331,7 +331,7 @@
               <w:rPr>
                 <w:noProof/>
               </w:rPr>
-              <w:instrText xml:space="preserve"> PAGEREF _Toc241179090 \h </w:instrText>
+              <w:instrText xml:space="preserve"> PAGEREF _Toc241461295 \h </w:instrText>
             </w:r>
             <w:r>
               <w:rPr>
@@ -373,7 +373,7 @@
               <w14:ligatures w14:val="standardContextual"/>
             </w:rPr>
           </w:pPr>
-          <w:hyperlink w:anchor="_Toc241179091" w:history="1">
+          <w:hyperlink w:anchor="_Toc241461296" w:history="1">
             <w:r>
               <w:rPr>
                 <w:rStyle w:val="Hyperlink"/>
@@ -397,7 +397,7 @@
               <w:rPr>
                 <w:noProof/>
               </w:rPr>
-              <w:instrText xml:space="preserve"> PAGEREF _Toc241179091 \h </w:instrText>
+              <w:instrText xml:space="preserve"> PAGEREF _Toc241461296 \h </w:instrText>
             </w:r>
             <w:r>
               <w:rPr>
@@ -439,7 +439,7 @@
               <w14:ligatures w14:val="standardContextual"/>
             </w:rPr>
           </w:pPr>
-          <w:hyperlink w:anchor="_Toc241179092" w:history="1">
+          <w:hyperlink w:anchor="_Toc241461297" w:history="1">
             <w:r>
               <w:rPr>
                 <w:rStyle w:val="Hyperlink"/>
@@ -463,7 +463,7 @@
               <w:rPr>
                 <w:noProof/>
               </w:rPr>
-              <w:instrText xml:space="preserve"> PAGEREF _Toc241179092 \h </w:instrText>
+              <w:instrText xml:space="preserve"> PAGEREF _Toc241461297 \h </w:instrText>
             </w:r>
             <w:r>
               <w:rPr>
@@ -505,7 +505,7 @@
               <w14:ligatures w14:val="standardContextual"/>
             </w:rPr>
           </w:pPr>
-          <w:hyperlink w:anchor="_Toc241179093" w:history="1">
+          <w:hyperlink w:anchor="_Toc241461298" w:history="1">
             <w:r>
               <w:rPr>
                 <w:rStyle w:val="Hyperlink"/>
@@ -529,7 +529,7 @@
               <w:rPr>
                 <w:noProof/>
               </w:rPr>
-              <w:instrText xml:space="preserve"> PAGEREF _Toc241179093 \h </w:instrText>
+              <w:instrText xml:space="preserve"> PAGEREF _Toc241461298 \h </w:instrText>
             </w:r>
             <w:r>
               <w:rPr>
@@ -571,7 +571,7 @@
               <w14:ligatures w14:val="standardContextual"/>
             </w:rPr>
           </w:pPr>
-          <w:hyperlink w:anchor="_Toc241179094" w:history="1">
+          <w:hyperlink w:anchor="_Toc241461299" w:history="1">
             <w:r>
               <w:rPr>
                 <w:rStyle w:val="Hyperlink"/>
@@ -595,7 +595,7 @@
               <w:rPr>
                 <w:noProof/>
               </w:rPr>
-              <w:instrText xml:space="preserve"> PAGEREF _Toc241179094 \h </w:instrText>
+              <w:instrText xml:space="preserve"> PAGEREF _Toc241461299 \h </w:instrText>
             </w:r>
             <w:r>
               <w:rPr>
@@ -637,7 +637,7 @@
               <w14:ligatures w14:val="standardContextual"/>
             </w:rPr>
           </w:pPr>
-          <w:hyperlink w:anchor="_Toc241179095" w:history="1">
+          <w:hyperlink w:anchor="_Toc241461300" w:history="1">
             <w:r>
               <w:rPr>
                 <w:rStyle w:val="Hyperlink"/>
@@ -661,7 +661,7 @@
               <w:rPr>
                 <w:noProof/>
               </w:rPr>
-              <w:instrText xml:space="preserve"> PAGEREF _Toc241179095 \h </w:instrText>
+              <w:instrText xml:space="preserve"> PAGEREF _Toc241461300 \h </w:instrText>
             </w:r>
             <w:r>
               <w:rPr>
@@ -703,7 +703,7 @@
               <w14:ligatures w14:val="standardContextual"/>
             </w:rPr>
           </w:pPr>
-          <w:hyperlink w:anchor="_Toc241179096" w:history="1">
+          <w:hyperlink w:anchor="_Toc241461301" w:history="1">
             <w:r>
               <w:rPr>
                 <w:rStyle w:val="Hyperlink"/>
@@ -727,7 +727,7 @@
               <w:rPr>
                 <w:noProof/>
               </w:rPr>
-              <w:instrText xml:space="preserve"> PAGEREF _Toc241179096 \h </w:instrText>
+              <w:instrText xml:space="preserve"> PAGEREF _Toc241461301 \h </w:instrText>
             </w:r>
             <w:r>
               <w:rPr>
@@ -769,7 +769,7 @@
               <w14:ligatures w14:val="standardContextual"/>
             </w:rPr>
           </w:pPr>
-          <w:hyperlink w:anchor="_Toc241179097" w:history="1">
+          <w:hyperlink w:anchor="_Toc241461302" w:history="1">
             <w:r>
               <w:rPr>
                 <w:rStyle w:val="Hyperlink"/>
@@ -793,7 +793,7 @@
               <w:rPr>
                 <w:noProof/>
               </w:rPr>
-              <w:instrText xml:space="preserve"> PAGEREF _Toc241179097 \h </w:instrText>
+              <w:instrText xml:space="preserve"> PAGEREF _Toc241461302 \h </w:instrText>
             </w:r>
             <w:r>
               <w:rPr>
@@ -835,7 +835,7 @@
               <w14:ligatures w14:val="standardContextual"/>
             </w:rPr>
           </w:pPr>
-          <w:hyperlink w:anchor="_Toc241179098" w:history="1">
+          <w:hyperlink w:anchor="_Toc241461303" w:history="1">
             <w:r>
               <w:rPr>
                 <w:rStyle w:val="Hyperlink"/>
@@ -859,7 +859,7 @@
               <w:rPr>
                 <w:noProof/>
               </w:rPr>
-              <w:instrText xml:space="preserve"> PAGEREF _Toc241179098 \h </w:instrText>
+              <w:instrText xml:space="preserve"> PAGEREF _Toc241461303 \h </w:instrText>
             </w:r>
             <w:r>
               <w:rPr>
@@ -901,7 +901,7 @@
               <w14:ligatures w14:val="standardContextual"/>
             </w:rPr>
           </w:pPr>
-          <w:hyperlink w:anchor="_Toc241179099" w:history="1">
+          <w:hyperlink w:anchor="_Toc241461304" w:history="1">
             <w:r>
               <w:rPr>
                 <w:rStyle w:val="Hyperlink"/>
@@ -925,7 +925,7 @@
               <w:rPr>
                 <w:noProof/>
               </w:rPr>
-              <w:instrText xml:space="preserve"> PAGEREF _Toc241179099 \h </w:instrText>
+              <w:instrText xml:space="preserve"> PAGEREF _Toc241461304 \h </w:instrText>
             </w:r>
             <w:r>
               <w:rPr>
@@ -967,7 +967,7 @@
               <w14:ligatures w14:val="standardContextual"/>
             </w:rPr>
           </w:pPr>
-          <w:hyperlink w:anchor="_Toc241179100" w:history="1">
+          <w:hyperlink w:anchor="_Toc241461305" w:history="1">
             <w:r>
               <w:rPr>
                 <w:rStyle w:val="Hyperlink"/>
@@ -991,7 +991,7 @@
               <w:rPr>
                 <w:noProof/>
               </w:rPr>
-              <w:instrText xml:space="preserve"> PAGEREF _Toc241179100 \h </w:instrText>
+              <w:instrText xml:space="preserve"> PAGEREF _Toc241461305 \h </w:instrText>
             </w:r>
             <w:r>
               <w:rPr>
@@ -1033,7 +1033,7 @@
               <w14:ligatures w14:val="standardContextual"/>
             </w:rPr>
           </w:pPr>
-          <w:hyperlink w:anchor="_Toc241179101" w:history="1">
+          <w:hyperlink w:anchor="_Toc241461306" w:history="1">
             <w:r>
               <w:rPr>
                 <w:rStyle w:val="Hyperlink"/>
@@ -1057,7 +1057,7 @@
               <w:rPr>
                 <w:noProof/>
               </w:rPr>
-              <w:instrText xml:space="preserve"> PAGEREF _Toc241179101 \h </w:instrText>
+              <w:instrText xml:space="preserve"> PAGEREF _Toc241461306 \h </w:instrText>
             </w:r>
             <w:r>
               <w:rPr>
@@ -1099,7 +1099,7 @@
               <w14:ligatures w14:val="standardContextual"/>
             </w:rPr>
           </w:pPr>
-          <w:hyperlink w:anchor="_Toc241179102" w:history="1">
+          <w:hyperlink w:anchor="_Toc241461307" w:history="1">
             <w:r>
               <w:rPr>
                 <w:rStyle w:val="Hyperlink"/>
@@ -1123,7 +1123,7 @@
               <w:rPr>
                 <w:noProof/>
               </w:rPr>
-              <w:instrText xml:space="preserve"> PAGEREF _Toc241179102 \h </w:instrText>
+              <w:instrText xml:space="preserve"> PAGEREF _Toc241461307 \h </w:instrText>
             </w:r>
             <w:r>
               <w:rPr>
@@ -1165,7 +1165,7 @@
               <w14:ligatures w14:val="standardContextual"/>
             </w:rPr>
           </w:pPr>
-          <w:hyperlink w:anchor="_Toc241179103" w:history="1">
+          <w:hyperlink w:anchor="_Toc241461308" w:history="1">
             <w:r>
               <w:rPr>
                 <w:rStyle w:val="Hyperlink"/>
@@ -1189,7 +1189,7 @@
               <w:rPr>
                 <w:noProof/>
               </w:rPr>
-              <w:instrText xml:space="preserve"> PAGEREF _Toc241179103 \h </w:instrText>
+              <w:instrText xml:space="preserve"> PAGEREF _Toc241461308 \h </w:instrText>
             </w:r>
             <w:r>
               <w:rPr>
@@ -1231,7 +1231,7 @@
               <w14:ligatures w14:val="standardContextual"/>
             </w:rPr>
           </w:pPr>
-          <w:hyperlink w:anchor="_Toc241179104" w:history="1">
+          <w:hyperlink w:anchor="_Toc241461309" w:history="1">
             <w:r>
               <w:rPr>
                 <w:rStyle w:val="Hyperlink"/>
@@ -1255,7 +1255,7 @@
               <w:rPr>
                 <w:noProof/>
               </w:rPr>
-              <w:instrText xml:space="preserve"> PAGEREF _Toc241179104 \h </w:instrText>
+              <w:instrText xml:space="preserve"> PAGEREF _Toc241461309 \h </w:instrText>
             </w:r>
             <w:r>
               <w:rPr>
@@ -1297,7 +1297,7 @@
               <w14:ligatures w14:val="standardContextual"/>
             </w:rPr>
           </w:pPr>
-          <w:hyperlink w:anchor="_Toc241179105" w:history="1">
+          <w:hyperlink w:anchor="_Toc241461310" w:history="1">
             <w:r>
               <w:rPr>
                 <w:rStyle w:val="Hyperlink"/>
@@ -1321,7 +1321,7 @@
               <w:rPr>
                 <w:noProof/>
               </w:rPr>
-              <w:instrText xml:space="preserve"> PAGEREF _Toc241179105 \h </w:instrText>
+              <w:instrText xml:space="preserve"> PAGEREF _Toc241461310 \h </w:instrText>
             </w:r>
             <w:r>
               <w:rPr>
@@ -1363,7 +1363,7 @@
               <w14:ligatures w14:val="standardContextual"/>
             </w:rPr>
           </w:pPr>
-          <w:hyperlink w:anchor="_Toc241179106" w:history="1">
+          <w:hyperlink w:anchor="_Toc241461311" w:history="1">
             <w:r>
               <w:rPr>
                 <w:rStyle w:val="Hyperlink"/>
@@ -1387,7 +1387,7 @@
               <w:rPr>
                 <w:noProof/>
               </w:rPr>
-              <w:instrText xml:space="preserve"> PAGEREF _Toc241179106 \h </w:instrText>
+              <w:instrText xml:space="preserve"> PAGEREF _Toc241461311 \h </w:instrText>
             </w:r>
             <w:r>
               <w:rPr>
@@ -1429,7 +1429,7 @@
               <w14:ligatures w14:val="standardContextual"/>
             </w:rPr>
           </w:pPr>
-          <w:hyperlink w:anchor="_Toc241179107" w:history="1">
+          <w:hyperlink w:anchor="_Toc241461312" w:history="1">
             <w:r>
               <w:rPr>
                 <w:rStyle w:val="Hyperlink"/>
@@ -1453,7 +1453,7 @@
               <w:rPr>
                 <w:noProof/>
               </w:rPr>
-              <w:instrText xml:space="preserve"> PAGEREF _Toc241179107 \h </w:instrText>
+              <w:instrText xml:space="preserve"> PAGEREF _Toc241461312 \h </w:instrText>
             </w:r>
             <w:r>
               <w:rPr>
@@ -1495,7 +1495,7 @@
               <w14:ligatures w14:val="standardContextual"/>
             </w:rPr>
           </w:pPr>
-          <w:hyperlink w:anchor="_Toc241179108" w:history="1">
+          <w:hyperlink w:anchor="_Toc241461313" w:history="1">
             <w:r>
               <w:rPr>
                 <w:rStyle w:val="Hyperlink"/>
@@ -1519,7 +1519,7 @@
               <w:rPr>
                 <w:noProof/>
               </w:rPr>
-              <w:instrText xml:space="preserve"> PAGEREF _Toc241179108 \h </w:instrText>
+              <w:instrText xml:space="preserve"> PAGEREF _Toc241461313 \h </w:instrText>
             </w:r>
             <w:r>
               <w:rPr>
@@ -1561,7 +1561,7 @@
               <w14:ligatures w14:val="standardContextual"/>
             </w:rPr>
           </w:pPr>
-          <w:hyperlink w:anchor="_Toc241179109" w:history="1">
+          <w:hyperlink w:anchor="_Toc241461314" w:history="1">
             <w:r>
               <w:rPr>
                 <w:rStyle w:val="Hyperlink"/>
@@ -1585,7 +1585,7 @@
               <w:rPr>
                 <w:noProof/>
               </w:rPr>
-              <w:instrText xml:space="preserve"> PAGEREF _Toc241179109 \h </w:instrText>
+              <w:instrText xml:space="preserve"> PAGEREF _Toc241461314 \h </w:instrText>
             </w:r>
             <w:r>
               <w:rPr>
@@ -1627,7 +1627,7 @@
               <w14:ligatures w14:val="standardContextual"/>
             </w:rPr>
           </w:pPr>
-          <w:hyperlink w:anchor="_Toc241179110" w:history="1">
+          <w:hyperlink w:anchor="_Toc241461315" w:history="1">
             <w:r>
               <w:rPr>
                 <w:rStyle w:val="Hyperlink"/>
@@ -1651,7 +1651,7 @@
               <w:rPr>
                 <w:noProof/>
               </w:rPr>
-              <w:instrText xml:space="preserve"> PAGEREF _Toc241179110 \h </w:instrText>
+              <w:instrText xml:space="preserve"> PAGEREF _Toc241461315 \h </w:instrText>
             </w:r>
             <w:r>
               <w:rPr>
@@ -1693,7 +1693,7 @@
               <w14:ligatures w14:val="standardContextual"/>
             </w:rPr>
           </w:pPr>
-          <w:hyperlink w:anchor="_Toc241179111" w:history="1">
+          <w:hyperlink w:anchor="_Toc241461316" w:history="1">
             <w:r>
               <w:rPr>
                 <w:rStyle w:val="Hyperlink"/>
@@ -1717,7 +1717,7 @@
               <w:rPr>
                 <w:noProof/>
               </w:rPr>
-              <w:instrText xml:space="preserve"> PAGEREF _Toc241179111 \h </w:instrText>
+              <w:instrText xml:space="preserve"> PAGEREF _Toc241461316 \h </w:instrText>
             </w:r>
             <w:r>
               <w:rPr>
@@ -1759,7 +1759,7 @@
               <w14:ligatures w14:val="standardContextual"/>
             </w:rPr>
           </w:pPr>
-          <w:hyperlink w:anchor="_Toc241179112" w:history="1">
+          <w:hyperlink w:anchor="_Toc241461317" w:history="1">
             <w:r>
               <w:rPr>
                 <w:rStyle w:val="Hyperlink"/>
@@ -1783,7 +1783,7 @@
               <w:rPr>
                 <w:noProof/>
               </w:rPr>
-              <w:instrText xml:space="preserve"> PAGEREF _Toc241179112 \h </w:instrText>
+              <w:instrText xml:space="preserve"> PAGEREF _Toc241461317 \h </w:instrText>
             </w:r>
             <w:r>
               <w:rPr>
@@ -1825,7 +1825,7 @@
               <w14:ligatures w14:val="standardContextual"/>
             </w:rPr>
           </w:pPr>
-          <w:hyperlink w:anchor="_Toc241179113" w:history="1">
+          <w:hyperlink w:anchor="_Toc241461318" w:history="1">
             <w:r>
               <w:rPr>
                 <w:rStyle w:val="Hyperlink"/>
@@ -1849,7 +1849,7 @@
               <w:rPr>
                 <w:noProof/>
               </w:rPr>
-              <w:instrText xml:space="preserve"> PAGEREF _Toc241179113 \h </w:instrText>
+              <w:instrText xml:space="preserve"> PAGEREF _Toc241461318 \h </w:instrText>
             </w:r>
             <w:r>
               <w:rPr>
@@ -1891,7 +1891,7 @@
               <w14:ligatures w14:val="standardContextual"/>
             </w:rPr>
           </w:pPr>
-          <w:hyperlink w:anchor="_Toc241179114" w:history="1">
+          <w:hyperlink w:anchor="_Toc241461319" w:history="1">
             <w:r>
               <w:rPr>
                 <w:rStyle w:val="Hyperlink"/>
@@ -1915,7 +1915,7 @@
               <w:rPr>
                 <w:noProof/>
               </w:rPr>
-              <w:instrText xml:space="preserve"> PAGEREF _Toc241179114 \h </w:instrText>
+              <w:instrText xml:space="preserve"> PAGEREF _Toc241461319 \h </w:instrText>
             </w:r>
             <w:r>
               <w:rPr>
@@ -1957,7 +1957,7 @@
               <w14:ligatures w14:val="standardContextual"/>
             </w:rPr>
           </w:pPr>
-          <w:hyperlink w:anchor="_Toc241179115" w:history="1">
+          <w:hyperlink w:anchor="_Toc241461320" w:history="1">
             <w:r>
               <w:rPr>
                 <w:rStyle w:val="Hyperlink"/>
@@ -1981,7 +1981,7 @@
               <w:rPr>
                 <w:noProof/>
               </w:rPr>
-              <w:instrText xml:space="preserve"> PAGEREF _Toc241179115 \h </w:instrText>
+              <w:instrText xml:space="preserve"> PAGEREF _Toc241461320 \h </w:instrText>
             </w:r>
             <w:r>
               <w:rPr>
@@ -2023,7 +2023,7 @@
               <w14:ligatures w14:val="standardContextual"/>
             </w:rPr>
           </w:pPr>
-          <w:hyperlink w:anchor="_Toc241179116" w:history="1">
+          <w:hyperlink w:anchor="_Toc241461321" w:history="1">
             <w:r>
               <w:rPr>
                 <w:rStyle w:val="Hyperlink"/>
@@ -2047,7 +2047,7 @@
               <w:rPr>
                 <w:noProof/>
               </w:rPr>
-              <w:instrText xml:space="preserve"> PAGEREF _Toc241179116 \h </w:instrText>
+              <w:instrText xml:space="preserve"> PAGEREF _Toc241461321 \h </w:instrText>
             </w:r>
             <w:r>
               <w:rPr>
@@ -2089,7 +2089,7 @@
               <w14:ligatures w14:val="standardContextual"/>
             </w:rPr>
           </w:pPr>
-          <w:hyperlink w:anchor="_Toc241179117" w:history="1">
+          <w:hyperlink w:anchor="_Toc241461322" w:history="1">
             <w:r>
               <w:rPr>
                 <w:rStyle w:val="Hyperlink"/>
@@ -2113,7 +2113,7 @@
               <w:rPr>
                 <w:noProof/>
               </w:rPr>
-              <w:instrText xml:space="preserve"> PAGEREF _Toc241179117 \h </w:instrText>
+              <w:instrText xml:space="preserve"> PAGEREF _Toc241461322 \h </w:instrText>
             </w:r>
             <w:r>
               <w:rPr>
@@ -2155,7 +2155,7 @@
               <w14:ligatures w14:val="standardContextual"/>
             </w:rPr>
           </w:pPr>
-          <w:hyperlink w:anchor="_Toc241179118" w:history="1">
+          <w:hyperlink w:anchor="_Toc241461323" w:history="1">
             <w:r>
               <w:rPr>
                 <w:rStyle w:val="Hyperlink"/>
@@ -2179,7 +2179,7 @@
               <w:rPr>
                 <w:noProof/>
               </w:rPr>
-              <w:instrText xml:space="preserve"> PAGEREF _Toc241179118 \h </w:instrText>
+              <w:instrText xml:space="preserve"> PAGEREF _Toc241461323 \h </w:instrText>
             </w:r>
             <w:r>
               <w:rPr>
@@ -2221,7 +2221,7 @@
               <w14:ligatures w14:val="standardContextual"/>
             </w:rPr>
           </w:pPr>
-          <w:hyperlink w:anchor="_Toc241179119" w:history="1">
+          <w:hyperlink w:anchor="_Toc241461324" w:history="1">
             <w:r>
               <w:rPr>
                 <w:rStyle w:val="Hyperlink"/>
@@ -2245,7 +2245,7 @@
               <w:rPr>
                 <w:noProof/>
               </w:rPr>
-              <w:instrText xml:space="preserve"> PAGEREF _Toc241179119 \h </w:instrText>
+              <w:instrText xml:space="preserve"> PAGEREF _Toc241461324 \h </w:instrText>
             </w:r>
             <w:r>
               <w:rPr>
@@ -2287,7 +2287,7 @@
               <w14:ligatures w14:val="standardContextual"/>
             </w:rPr>
           </w:pPr>
-          <w:hyperlink w:anchor="_Toc241179120" w:history="1">
+          <w:hyperlink w:anchor="_Toc241461325" w:history="1">
             <w:r>
               <w:rPr>
                 <w:rStyle w:val="Hyperlink"/>
@@ -2311,7 +2311,7 @@
               <w:rPr>
                 <w:noProof/>
               </w:rPr>
-              <w:instrText xml:space="preserve"> PAGEREF _Toc241179120 \h </w:instrText>
+              <w:instrText xml:space="preserve"> PAGEREF _Toc241461325 \h </w:instrText>
             </w:r>
             <w:r>
               <w:rPr>
@@ -2353,7 +2353,7 @@
               <w14:ligatures w14:val="standardContextual"/>
             </w:rPr>
           </w:pPr>
-          <w:hyperlink w:anchor="_Toc241179121" w:history="1">
+          <w:hyperlink w:anchor="_Toc241461326" w:history="1">
             <w:r>
               <w:rPr>
                 <w:rStyle w:val="Hyperlink"/>
@@ -2377,7 +2377,7 @@
               <w:rPr>
                 <w:noProof/>
               </w:rPr>
-              <w:instrText xml:space="preserve"> PAGEREF _Toc241179121 \h </w:instrText>
+              <w:instrText xml:space="preserve"> PAGEREF _Toc241461326 \h </w:instrText>
             </w:r>
             <w:r>
               <w:rPr>
@@ -2419,7 +2419,7 @@
               <w14:ligatures w14:val="standardContextual"/>
             </w:rPr>
           </w:pPr>
-          <w:hyperlink w:anchor="_Toc241179122" w:history="1">
+          <w:hyperlink w:anchor="_Toc241461327" w:history="1">
             <w:r>
               <w:rPr>
                 <w:rStyle w:val="Hyperlink"/>
@@ -2443,7 +2443,7 @@
               <w:rPr>
                 <w:noProof/>
               </w:rPr>
-              <w:instrText xml:space="preserve"> PAGEREF _Toc241179122 \h </w:instrText>
+              <w:instrText xml:space="preserve"> PAGEREF _Toc241461327 \h </w:instrText>
             </w:r>
             <w:r>
               <w:rPr>
@@ -2485,7 +2485,7 @@
               <w14:ligatures w14:val="standardContextual"/>
             </w:rPr>
           </w:pPr>
-          <w:hyperlink w:anchor="_Toc241179123" w:history="1">
+          <w:hyperlink w:anchor="_Toc241461328" w:history="1">
             <w:r>
               <w:rPr>
                 <w:rStyle w:val="Hyperlink"/>
@@ -2509,7 +2509,7 @@
               <w:rPr>
                 <w:noProof/>
               </w:rPr>
-              <w:instrText xml:space="preserve"> PAGEREF _Toc241179123 \h </w:instrText>
+              <w:instrText xml:space="preserve"> PAGEREF _Toc241461328 \h </w:instrText>
             </w:r>
             <w:r>
               <w:rPr>
@@ -2551,7 +2551,7 @@
               <w14:ligatures w14:val="standardContextual"/>
             </w:rPr>
           </w:pPr>
-          <w:hyperlink w:anchor="_Toc241179124" w:history="1">
+          <w:hyperlink w:anchor="_Toc241461329" w:history="1">
             <w:r>
               <w:rPr>
                 <w:rStyle w:val="Hyperlink"/>
@@ -2575,7 +2575,7 @@
               <w:rPr>
                 <w:noProof/>
               </w:rPr>
-              <w:instrText xml:space="preserve"> PAGEREF _Toc241179124 \h </w:instrText>
+              <w:instrText xml:space="preserve"> PAGEREF _Toc241461329 \h </w:instrText>
             </w:r>
             <w:r>
               <w:rPr>
@@ -2617,7 +2617,7 @@
               <w14:ligatures w14:val="standardContextual"/>
             </w:rPr>
           </w:pPr>
-          <w:hyperlink w:anchor="_Toc241179125" w:history="1">
+          <w:hyperlink w:anchor="_Toc241461330" w:history="1">
             <w:r>
               <w:rPr>
                 <w:rStyle w:val="Hyperlink"/>
@@ -2641,7 +2641,7 @@
               <w:rPr>
                 <w:noProof/>
               </w:rPr>
-              <w:instrText xml:space="preserve"> PAGEREF _Toc241179125 \h </w:instrText>
+              <w:instrText xml:space="preserve"> PAGEREF _Toc241461330 \h </w:instrText>
             </w:r>
             <w:r>
               <w:rPr>
@@ -2683,7 +2683,7 @@
               <w14:ligatures w14:val="standardContextual"/>
             </w:rPr>
           </w:pPr>
-          <w:hyperlink w:anchor="_Toc241179126" w:history="1">
+          <w:hyperlink w:anchor="_Toc241461331" w:history="1">
             <w:r>
               <w:rPr>
                 <w:rStyle w:val="Hyperlink"/>
@@ -2707,7 +2707,7 @@
               <w:rPr>
                 <w:noProof/>
               </w:rPr>
-              <w:instrText xml:space="preserve"> PAGEREF _Toc241179126 \h </w:instrText>
+              <w:instrText xml:space="preserve"> PAGEREF _Toc241461331 \h </w:instrText>
             </w:r>
             <w:r>
               <w:rPr>
@@ -2749,7 +2749,7 @@
               <w14:ligatures w14:val="standardContextual"/>
             </w:rPr>
           </w:pPr>
-          <w:hyperlink w:anchor="_Toc241179127" w:history="1">
+          <w:hyperlink w:anchor="_Toc241461332" w:history="1">
             <w:r>
               <w:rPr>
                 <w:rStyle w:val="Hyperlink"/>
@@ -2773,7 +2773,7 @@
               <w:rPr>
                 <w:noProof/>
               </w:rPr>
-              <w:instrText xml:space="preserve"> PAGEREF _Toc241179127 \h </w:instrText>
+              <w:instrText xml:space="preserve"> PAGEREF _Toc241461332 \h </w:instrText>
             </w:r>
             <w:r>
               <w:rPr>
@@ -2815,7 +2815,7 @@
               <w14:ligatures w14:val="standardContextual"/>
             </w:rPr>
           </w:pPr>
-          <w:hyperlink w:anchor="_Toc241179128" w:history="1">
+          <w:hyperlink w:anchor="_Toc241461333" w:history="1">
             <w:r>
               <w:rPr>
                 <w:rStyle w:val="Hyperlink"/>
@@ -2839,7 +2839,7 @@
               <w:rPr>
                 <w:noProof/>
               </w:rPr>
-              <w:instrText xml:space="preserve"> PAGEREF _Toc241179128 \h </w:instrText>
+              <w:instrText xml:space="preserve"> PAGEREF _Toc241461333 \h </w:instrText>
             </w:r>
             <w:r>
               <w:rPr>
@@ -2881,7 +2881,7 @@
               <w14:ligatures w14:val="standardContextual"/>
             </w:rPr>
           </w:pPr>
-          <w:hyperlink w:anchor="_Toc241179129" w:history="1">
+          <w:hyperlink w:anchor="_Toc241461334" w:history="1">
             <w:r>
               <w:rPr>
                 <w:rStyle w:val="Hyperlink"/>
@@ -2905,7 +2905,7 @@
               <w:rPr>
                 <w:noProof/>
               </w:rPr>
-              <w:instrText xml:space="preserve"> PAGEREF _Toc241179129 \h </w:instrText>
+              <w:instrText xml:space="preserve"> PAGEREF _Toc241461334 \h </w:instrText>
             </w:r>
             <w:r>
               <w:rPr>
@@ -2947,7 +2947,7 @@
               <w14:ligatures w14:val="standardContextual"/>
             </w:rPr>
           </w:pPr>
-          <w:hyperlink w:anchor="_Toc241179130" w:history="1">
+          <w:hyperlink w:anchor="_Toc241461335" w:history="1">
             <w:r>
               <w:rPr>
                 <w:rStyle w:val="Hyperlink"/>
@@ -2971,7 +2971,7 @@
               <w:rPr>
                 <w:noProof/>
               </w:rPr>
-              <w:instrText xml:space="preserve"> PAGEREF _Toc241179130 \h </w:instrText>
+              <w:instrText xml:space="preserve"> PAGEREF _Toc241461335 \h </w:instrText>
             </w:r>
             <w:r>
               <w:rPr>
@@ -3013,7 +3013,7 @@
               <w14:ligatures w14:val="standardContextual"/>
             </w:rPr>
           </w:pPr>
-          <w:hyperlink w:anchor="_Toc241179131" w:history="1">
+          <w:hyperlink w:anchor="_Toc241461336" w:history="1">
             <w:r>
               <w:rPr>
                 <w:rStyle w:val="Hyperlink"/>
@@ -3037,7 +3037,7 @@
               <w:rPr>
                 <w:noProof/>
               </w:rPr>
-              <w:instrText xml:space="preserve"> PAGEREF _Toc241179131 \h </w:instrText>
+              <w:instrText xml:space="preserve"> PAGEREF _Toc241461336 \h </w:instrText>
             </w:r>
             <w:r>
               <w:rPr>
@@ -3079,7 +3079,7 @@
               <w14:ligatures w14:val="standardContextual"/>
             </w:rPr>
           </w:pPr>
-          <w:hyperlink w:anchor="_Toc241179132" w:history="1">
+          <w:hyperlink w:anchor="_Toc241461337" w:history="1">
             <w:r>
               <w:rPr>
                 <w:rStyle w:val="Hyperlink"/>
@@ -3103,7 +3103,7 @@
               <w:rPr>
                 <w:noProof/>
               </w:rPr>
-              <w:instrText xml:space="preserve"> PAGEREF _Toc241179132 \h </w:instrText>
+              <w:instrText xml:space="preserve"> PAGEREF _Toc241461337 \h </w:instrText>
             </w:r>
             <w:r>
               <w:rPr>
@@ -3145,7 +3145,7 @@
               <w14:ligatures w14:val="standardContextual"/>
             </w:rPr>
           </w:pPr>
-          <w:hyperlink w:anchor="_Toc241179133" w:history="1">
+          <w:hyperlink w:anchor="_Toc241461338" w:history="1">
             <w:r>
               <w:rPr>
                 <w:rStyle w:val="Hyperlink"/>
@@ -3169,7 +3169,7 @@
               <w:rPr>
                 <w:noProof/>
               </w:rPr>
-              <w:instrText xml:space="preserve"> PAGEREF _Toc241179133 \h </w:instrText>
+              <w:instrText xml:space="preserve"> PAGEREF _Toc241461338 \h </w:instrText>
             </w:r>
             <w:r>
               <w:rPr>
@@ -3211,7 +3211,7 @@
               <w14:ligatures w14:val="standardContextual"/>
             </w:rPr>
           </w:pPr>
-          <w:hyperlink w:anchor="_Toc241179134" w:history="1">
+          <w:hyperlink w:anchor="_Toc241461339" w:history="1">
             <w:r>
               <w:rPr>
                 <w:rStyle w:val="Hyperlink"/>
@@ -3235,7 +3235,7 @@
               <w:rPr>
                 <w:noProof/>
               </w:rPr>
-              <w:instrText xml:space="preserve"> PAGEREF _Toc241179134 \h </w:instrText>
+              <w:instrText xml:space="preserve"> PAGEREF _Toc241461339 \h </w:instrText>
             </w:r>
             <w:r>
               <w:rPr>
@@ -3277,7 +3277,7 @@
               <w14:ligatures w14:val="standardContextual"/>
             </w:rPr>
           </w:pPr>
-          <w:hyperlink w:anchor="_Toc241179135" w:history="1">
+          <w:hyperlink w:anchor="_Toc241461340" w:history="1">
             <w:r>
               <w:rPr>
                 <w:rStyle w:val="Hyperlink"/>
@@ -3301,7 +3301,7 @@
               <w:rPr>
                 <w:noProof/>
               </w:rPr>
-              <w:instrText xml:space="preserve"> PAGEREF _Toc241179135 \h </w:instrText>
+              <w:instrText xml:space="preserve"> PAGEREF _Toc241461340 \h </w:instrText>
             </w:r>
             <w:r>
               <w:rPr>
@@ -3343,7 +3343,7 @@
               <w14:ligatures w14:val="standardContextual"/>
             </w:rPr>
           </w:pPr>
-          <w:hyperlink w:anchor="_Toc241179136" w:history="1">
+          <w:hyperlink w:anchor="_Toc241461341" w:history="1">
             <w:r>
               <w:rPr>
                 <w:rStyle w:val="Hyperlink"/>
@@ -3367,7 +3367,7 @@
               <w:rPr>
                 <w:noProof/>
               </w:rPr>
-              <w:instrText xml:space="preserve"> PAGEREF _Toc241179136 \h </w:instrText>
+              <w:instrText xml:space="preserve"> PAGEREF _Toc241461341 \h </w:instrText>
             </w:r>
             <w:r>
               <w:rPr>
@@ -3409,7 +3409,7 @@
               <w14:ligatures w14:val="standardContextual"/>
             </w:rPr>
           </w:pPr>
-          <w:hyperlink w:anchor="_Toc241179137" w:history="1">
+          <w:hyperlink w:anchor="_Toc241461342" w:history="1">
             <w:r>
               <w:rPr>
                 <w:rStyle w:val="Hyperlink"/>
@@ -3433,7 +3433,7 @@
               <w:rPr>
                 <w:noProof/>
               </w:rPr>
-              <w:instrText xml:space="preserve"> PAGEREF _Toc241179137 \h </w:instrText>
+              <w:instrText xml:space="preserve"> PAGEREF _Toc241461342 \h </w:instrText>
             </w:r>
             <w:r>
               <w:rPr>
@@ -3475,7 +3475,7 @@
               <w14:ligatures w14:val="standardContextual"/>
             </w:rPr>
           </w:pPr>
-          <w:hyperlink w:anchor="_Toc241179138" w:history="1">
+          <w:hyperlink w:anchor="_Toc241461343" w:history="1">
             <w:r>
               <w:rPr>
                 <w:rStyle w:val="Hyperlink"/>
@@ -3499,7 +3499,7 @@
               <w:rPr>
                 <w:noProof/>
               </w:rPr>
-              <w:instrText xml:space="preserve"> PAGEREF _Toc241179138 \h </w:instrText>
+              <w:instrText xml:space="preserve"> PAGEREF _Toc241461343 \h </w:instrText>
             </w:r>
             <w:r>
               <w:rPr>
@@ -3541,7 +3541,7 @@
               <w14:ligatures w14:val="standardContextual"/>
             </w:rPr>
           </w:pPr>
-          <w:hyperlink w:anchor="_Toc241179139" w:history="1">
+          <w:hyperlink w:anchor="_Toc241461344" w:history="1">
             <w:r>
               <w:rPr>
                 <w:rStyle w:val="Hyperlink"/>
@@ -3565,7 +3565,7 @@
               <w:rPr>
                 <w:noProof/>
               </w:rPr>
-              <w:instrText xml:space="preserve"> PAGEREF _Toc241179139 \h </w:instrText>
+              <w:instrText xml:space="preserve"> PAGEREF _Toc241461344 \h </w:instrText>
             </w:r>
             <w:r>
               <w:rPr>
@@ -3607,7 +3607,7 @@
               <w14:ligatures w14:val="standardContextual"/>
             </w:rPr>
           </w:pPr>
-          <w:hyperlink w:anchor="_Toc241179140" w:history="1">
+          <w:hyperlink w:anchor="_Toc241461345" w:history="1">
             <w:r>
               <w:rPr>
                 <w:rStyle w:val="Hyperlink"/>
@@ -3631,7 +3631,7 @@
               <w:rPr>
                 <w:noProof/>
               </w:rPr>
-              <w:instrText xml:space="preserve"> PAGEREF _Toc241179140 \h </w:instrText>
+              <w:instrText xml:space="preserve"> PAGEREF _Toc241461345 \h </w:instrText>
             </w:r>
             <w:r>
               <w:rPr>
@@ -3673,7 +3673,7 @@
               <w14:ligatures w14:val="standardContextual"/>
             </w:rPr>
           </w:pPr>
-          <w:hyperlink w:anchor="_Toc241179141" w:history="1">
+          <w:hyperlink w:anchor="_Toc241461346" w:history="1">
             <w:r>
               <w:rPr>
                 <w:rStyle w:val="Hyperlink"/>
@@ -3697,7 +3697,7 @@
               <w:rPr>
                 <w:noProof/>
               </w:rPr>
-              <w:instrText xml:space="preserve"> PAGEREF _Toc241179141 \h </w:instrText>
+              <w:instrText xml:space="preserve"> PAGEREF _Toc241461346 \h </w:instrText>
             </w:r>
             <w:r>
               <w:rPr>
@@ -3739,7 +3739,7 @@
               <w14:ligatures w14:val="standardContextual"/>
             </w:rPr>
           </w:pPr>
-          <w:hyperlink w:anchor="_Toc241179142" w:history="1">
+          <w:hyperlink w:anchor="_Toc241461347" w:history="1">
             <w:r>
               <w:rPr>
                 <w:rStyle w:val="Hyperlink"/>
@@ -3763,7 +3763,7 @@
               <w:rPr>
                 <w:noProof/>
               </w:rPr>
-              <w:instrText xml:space="preserve"> PAGEREF _Toc241179142 \h </w:instrText>
+              <w:instrText xml:space="preserve"> PAGEREF _Toc241461347 \h </w:instrText>
             </w:r>
             <w:r>
               <w:rPr>
@@ -3805,7 +3805,7 @@
               <w14:ligatures w14:val="standardContextual"/>
             </w:rPr>
           </w:pPr>
-          <w:hyperlink w:anchor="_Toc241179143" w:history="1">
+          <w:hyperlink w:anchor="_Toc241461348" w:history="1">
             <w:r>
               <w:rPr>
                 <w:rStyle w:val="Hyperlink"/>
@@ -3829,7 +3829,7 @@
               <w:rPr>
                 <w:noProof/>
               </w:rPr>
-              <w:instrText xml:space="preserve"> PAGEREF _Toc241179143 \h </w:instrText>
+              <w:instrText xml:space="preserve"> PAGEREF _Toc241461348 \h </w:instrText>
             </w:r>
             <w:r>
               <w:rPr>
@@ -3871,7 +3871,7 @@
               <w14:ligatures w14:val="standardContextual"/>
             </w:rPr>
           </w:pPr>
-          <w:hyperlink w:anchor="_Toc241179144" w:history="1">
+          <w:hyperlink w:anchor="_Toc241461349" w:history="1">
             <w:r>
               <w:rPr>
                 <w:rStyle w:val="Hyperlink"/>
@@ -3895,7 +3895,7 @@
               <w:rPr>
                 <w:noProof/>
               </w:rPr>
-              <w:instrText xml:space="preserve"> PAGEREF _Toc241179144 \h </w:instrText>
+              <w:instrText xml:space="preserve"> PAGEREF _Toc241461349 \h </w:instrText>
             </w:r>
             <w:r>
               <w:rPr>
@@ -3937,7 +3937,7 @@
               <w14:ligatures w14:val="standardContextual"/>
             </w:rPr>
           </w:pPr>
-          <w:hyperlink w:anchor="_Toc241179145" w:history="1">
+          <w:hyperlink w:anchor="_Toc241461350" w:history="1">
             <w:r>
               <w:rPr>
                 <w:rStyle w:val="Hyperlink"/>
@@ -3961,7 +3961,7 @@
               <w:rPr>
                 <w:noProof/>
               </w:rPr>
-              <w:instrText xml:space="preserve"> PAGEREF _Toc241179145 \h </w:instrText>
+              <w:instrText xml:space="preserve"> PAGEREF _Toc241461350 \h </w:instrText>
             </w:r>
             <w:r>
               <w:rPr>
@@ -4003,7 +4003,7 @@
               <w14:ligatures w14:val="standardContextual"/>
             </w:rPr>
           </w:pPr>
-          <w:hyperlink w:anchor="_Toc241179146" w:history="1">
+          <w:hyperlink w:anchor="_Toc241461351" w:history="1">
             <w:r>
               <w:rPr>
                 <w:rStyle w:val="Hyperlink"/>
@@ -4027,7 +4027,7 @@
               <w:rPr>
                 <w:noProof/>
               </w:rPr>
-              <w:instrText xml:space="preserve"> PAGEREF _Toc241179146 \h </w:instrText>
+              <w:instrText xml:space="preserve"> PAGEREF _Toc241461351 \h </w:instrText>
             </w:r>
             <w:r>
               <w:rPr>
@@ -4069,7 +4069,7 @@
               <w14:ligatures w14:val="standardContextual"/>
             </w:rPr>
           </w:pPr>
-          <w:hyperlink w:anchor="_Toc241179147" w:history="1">
+          <w:hyperlink w:anchor="_Toc241461352" w:history="1">
             <w:r>
               <w:rPr>
                 <w:rStyle w:val="Hyperlink"/>
@@ -4093,7 +4093,7 @@
               <w:rPr>
                 <w:noProof/>
               </w:rPr>
-              <w:instrText xml:space="preserve"> PAGEREF _Toc241179147 \h </w:instrText>
+              <w:instrText xml:space="preserve"> PAGEREF _Toc241461352 \h </w:instrText>
             </w:r>
             <w:r>
               <w:rPr>
@@ -4135,7 +4135,7 @@
               <w14:ligatures w14:val="standardContextual"/>
             </w:rPr>
           </w:pPr>
-          <w:hyperlink w:anchor="_Toc241179148" w:history="1">
+          <w:hyperlink w:anchor="_Toc241461353" w:history="1">
             <w:r>
               <w:rPr>
                 <w:rStyle w:val="Hyperlink"/>
@@ -4159,7 +4159,7 @@
               <w:rPr>
                 <w:noProof/>
               </w:rPr>
-              <w:instrText xml:space="preserve"> PAGEREF _Toc241179148 \h </w:instrText>
+              <w:instrText xml:space="preserve"> PAGEREF _Toc241461353 \h </w:instrText>
             </w:r>
             <w:r>
               <w:rPr>
@@ -4201,7 +4201,7 @@
               <w14:ligatures w14:val="standardContextual"/>
             </w:rPr>
           </w:pPr>
-          <w:hyperlink w:anchor="_Toc241179149" w:history="1">
+          <w:hyperlink w:anchor="_Toc241461354" w:history="1">
             <w:r>
               <w:rPr>
                 <w:rStyle w:val="Hyperlink"/>
@@ -4225,7 +4225,7 @@
               <w:rPr>
                 <w:noProof/>
               </w:rPr>
-              <w:instrText xml:space="preserve"> PAGEREF _Toc241179149 \h </w:instrText>
+              <w:instrText xml:space="preserve"> PAGEREF _Toc241461354 \h </w:instrText>
             </w:r>
             <w:r>
               <w:rPr>
@@ -4267,7 +4267,7 @@
               <w14:ligatures w14:val="standardContextual"/>
             </w:rPr>
           </w:pPr>
-          <w:hyperlink w:anchor="_Toc241179150" w:history="1">
+          <w:hyperlink w:anchor="_Toc241461355" w:history="1">
             <w:r>
               <w:rPr>
                 <w:rStyle w:val="Hyperlink"/>
@@ -4291,7 +4291,7 @@
               <w:rPr>
                 <w:noProof/>
               </w:rPr>
-              <w:instrText xml:space="preserve"> PAGEREF _Toc241179150 \h </w:instrText>
+              <w:instrText xml:space="preserve"> PAGEREF _Toc241461355 \h </w:instrText>
             </w:r>
             <w:r>
               <w:rPr>
@@ -4333,7 +4333,7 @@
               <w14:ligatures w14:val="standardContextual"/>
             </w:rPr>
           </w:pPr>
-          <w:hyperlink w:anchor="_Toc241179151" w:history="1">
+          <w:hyperlink w:anchor="_Toc241461356" w:history="1">
             <w:r>
               <w:rPr>
                 <w:rStyle w:val="Hyperlink"/>
@@ -4357,7 +4357,7 @@
               <w:rPr>
                 <w:noProof/>
               </w:rPr>
-              <w:instrText xml:space="preserve"> PAGEREF _Toc241179151 \h </w:instrText>
+              <w:instrText xml:space="preserve"> PAGEREF _Toc241461356 \h </w:instrText>
             </w:r>
             <w:r>
               <w:rPr>
@@ -4399,7 +4399,7 @@
               <w14:ligatures w14:val="standardContextual"/>
             </w:rPr>
           </w:pPr>
-          <w:hyperlink w:anchor="_Toc241179152" w:history="1">
+          <w:hyperlink w:anchor="_Toc241461357" w:history="1">
             <w:r>
               <w:rPr>
                 <w:rStyle w:val="Hyperlink"/>
@@ -4423,7 +4423,7 @@
               <w:rPr>
                 <w:noProof/>
               </w:rPr>
-              <w:instrText xml:space="preserve"> PAGEREF _Toc241179152 \h </w:instrText>
+              <w:instrText xml:space="preserve"> PAGEREF _Toc241461357 \h </w:instrText>
             </w:r>
             <w:r>
               <w:rPr>
@@ -4470,7 +4470,7 @@
     <w:sdt>
       <w:sdtPr>
         <w:alias w:val="List of Figures"/>
-        <w:id w:val="970329277"/>
+        <w:id w:val="1741524237"/>
       </w:sdtPr>
       <w:sdtEndPr>
         <w:rPr>
@@ -4502,7 +4502,7 @@
           <w:r>
             <w:fldChar w:fldCharType="separate"/>
           </w:r>
-          <w:hyperlink w:anchor="_Toc241179153" w:history="1">
+          <w:hyperlink w:anchor="_Toc241461358" w:history="1">
             <w:r>
               <w:rPr>
                 <w:rStyle w:val="Hyperlink"/>
@@ -4535,7 +4535,7 @@
               <w:rPr>
                 <w:noProof/>
               </w:rPr>
-              <w:instrText xml:space="preserve"> PAGEREF _Toc241179153 \h </w:instrText>
+              <w:instrText xml:space="preserve"> PAGEREF _Toc241461358 \h </w:instrText>
             </w:r>
             <w:r>
               <w:rPr>
@@ -4577,7 +4577,7 @@
               <w14:ligatures w14:val="standardContextual"/>
             </w:rPr>
           </w:pPr>
-          <w:hyperlink w:anchor="_Toc241179154" w:history="1">
+          <w:hyperlink w:anchor="_Toc241461359" w:history="1">
             <w:r>
               <w:rPr>
                 <w:rStyle w:val="Hyperlink"/>
@@ -4610,7 +4610,7 @@
               <w:rPr>
                 <w:noProof/>
               </w:rPr>
-              <w:instrText xml:space="preserve"> PAGEREF _Toc241179154 \h </w:instrText>
+              <w:instrText xml:space="preserve"> PAGEREF _Toc241461359 \h </w:instrText>
             </w:r>
             <w:r>
               <w:rPr>
@@ -4652,7 +4652,7 @@
               <w14:ligatures w14:val="standardContextual"/>
             </w:rPr>
           </w:pPr>
-          <w:hyperlink w:anchor="_Toc241179155" w:history="1">
+          <w:hyperlink w:anchor="_Toc241461360" w:history="1">
             <w:r>
               <w:rPr>
                 <w:rStyle w:val="Hyperlink"/>
@@ -4685,7 +4685,7 @@
               <w:rPr>
                 <w:noProof/>
               </w:rPr>
-              <w:instrText xml:space="preserve"> PAGEREF _Toc241179155 \h </w:instrText>
+              <w:instrText xml:space="preserve"> PAGEREF _Toc241461360 \h </w:instrText>
             </w:r>
             <w:r>
               <w:rPr>
@@ -4727,7 +4727,7 @@
               <w14:ligatures w14:val="standardContextual"/>
             </w:rPr>
           </w:pPr>
-          <w:hyperlink w:anchor="_Toc241179156" w:history="1">
+          <w:hyperlink w:anchor="_Toc241461361" w:history="1">
             <w:r>
               <w:rPr>
                 <w:rStyle w:val="Hyperlink"/>
@@ -4760,7 +4760,7 @@
               <w:rPr>
                 <w:noProof/>
               </w:rPr>
-              <w:instrText xml:space="preserve"> PAGEREF _Toc241179156 \h </w:instrText>
+              <w:instrText xml:space="preserve"> PAGEREF _Toc241461361 \h </w:instrText>
             </w:r>
             <w:r>
               <w:rPr>
@@ -4802,7 +4802,7 @@
               <w14:ligatures w14:val="standardContextual"/>
             </w:rPr>
           </w:pPr>
-          <w:hyperlink w:anchor="_Toc241179157" w:history="1">
+          <w:hyperlink w:anchor="_Toc241461362" w:history="1">
             <w:r>
               <w:rPr>
                 <w:rStyle w:val="Hyperlink"/>
@@ -4850,7 +4850,7 @@
               <w:rPr>
                 <w:noProof/>
               </w:rPr>
-              <w:instrText xml:space="preserve"> PAGEREF _Toc241179157 \h </w:instrText>
+              <w:instrText xml:space="preserve"> PAGEREF _Toc241461362 \h </w:instrText>
             </w:r>
             <w:r>
               <w:rPr>
@@ -4892,7 +4892,7 @@
               <w14:ligatures w14:val="standardContextual"/>
             </w:rPr>
           </w:pPr>
-          <w:hyperlink w:anchor="_Toc241179158" w:history="1">
+          <w:hyperlink w:anchor="_Toc241461363" w:history="1">
             <w:r>
               <w:rPr>
                 <w:rStyle w:val="Hyperlink"/>
@@ -4925,7 +4925,7 @@
               <w:rPr>
                 <w:noProof/>
               </w:rPr>
-              <w:instrText xml:space="preserve"> PAGEREF _Toc241179158 \h </w:instrText>
+              <w:instrText xml:space="preserve"> PAGEREF _Toc241461363 \h </w:instrText>
             </w:r>
             <w:r>
               <w:rPr>
@@ -4967,7 +4967,7 @@
               <w14:ligatures w14:val="standardContextual"/>
             </w:rPr>
           </w:pPr>
-          <w:hyperlink w:anchor="_Toc241179159" w:history="1">
+          <w:hyperlink w:anchor="_Toc241461364" w:history="1">
             <w:r>
               <w:rPr>
                 <w:rStyle w:val="Hyperlink"/>
@@ -5000,7 +5000,7 @@
               <w:rPr>
                 <w:noProof/>
               </w:rPr>
-              <w:instrText xml:space="preserve"> PAGEREF _Toc241179159 \h </w:instrText>
+              <w:instrText xml:space="preserve"> PAGEREF _Toc241461364 \h </w:instrText>
             </w:r>
             <w:r>
               <w:rPr>
@@ -5042,7 +5042,7 @@
               <w14:ligatures w14:val="standardContextual"/>
             </w:rPr>
           </w:pPr>
-          <w:hyperlink w:anchor="_Toc241179160" w:history="1">
+          <w:hyperlink w:anchor="_Toc241461365" w:history="1">
             <w:r>
               <w:rPr>
                 <w:rStyle w:val="Hyperlink"/>
@@ -5075,7 +5075,7 @@
               <w:rPr>
                 <w:noProof/>
               </w:rPr>
-              <w:instrText xml:space="preserve"> PAGEREF _Toc241179160 \h </w:instrText>
+              <w:instrText xml:space="preserve"> PAGEREF _Toc241461365 \h </w:instrText>
             </w:r>
             <w:r>
               <w:rPr>
@@ -5117,7 +5117,7 @@
               <w14:ligatures w14:val="standardContextual"/>
             </w:rPr>
           </w:pPr>
-          <w:hyperlink w:anchor="_Toc241179161" w:history="1">
+          <w:hyperlink w:anchor="_Toc241461366" w:history="1">
             <w:r>
               <w:rPr>
                 <w:rStyle w:val="Hyperlink"/>
@@ -5150,7 +5150,7 @@
               <w:rPr>
                 <w:noProof/>
               </w:rPr>
-              <w:instrText xml:space="preserve"> PAGEREF _Toc241179161 \h </w:instrText>
+              <w:instrText xml:space="preserve"> PAGEREF _Toc241461366 \h </w:instrText>
             </w:r>
             <w:r>
               <w:rPr>
@@ -5192,7 +5192,7 @@
               <w14:ligatures w14:val="standardContextual"/>
             </w:rPr>
           </w:pPr>
-          <w:hyperlink w:anchor="_Toc241179162" w:history="1">
+          <w:hyperlink w:anchor="_Toc241461367" w:history="1">
             <w:r>
               <w:rPr>
                 <w:rStyle w:val="Hyperlink"/>
@@ -5225,7 +5225,7 @@
               <w:rPr>
                 <w:noProof/>
               </w:rPr>
-              <w:instrText xml:space="preserve"> PAGEREF _Toc241179162 \h </w:instrText>
+              <w:instrText xml:space="preserve"> PAGEREF _Toc241461367 \h </w:instrText>
             </w:r>
             <w:r>
               <w:rPr>
@@ -5267,7 +5267,7 @@
               <w14:ligatures w14:val="standardContextual"/>
             </w:rPr>
           </w:pPr>
-          <w:hyperlink w:anchor="_Toc241179163" w:history="1">
+          <w:hyperlink w:anchor="_Toc241461368" w:history="1">
             <w:r>
               <w:rPr>
                 <w:rStyle w:val="Hyperlink"/>
@@ -5300,7 +5300,7 @@
               <w:rPr>
                 <w:noProof/>
               </w:rPr>
-              <w:instrText xml:space="preserve"> PAGEREF _Toc241179163 \h </w:instrText>
+              <w:instrText xml:space="preserve"> PAGEREF _Toc241461368 \h </w:instrText>
             </w:r>
             <w:r>
               <w:rPr>
@@ -5342,7 +5342,7 @@
               <w14:ligatures w14:val="standardContextual"/>
             </w:rPr>
           </w:pPr>
-          <w:hyperlink w:anchor="_Toc241179164" w:history="1">
+          <w:hyperlink w:anchor="_Toc241461369" w:history="1">
             <w:r>
               <w:rPr>
                 <w:rStyle w:val="Hyperlink"/>
@@ -5375,7 +5375,7 @@
               <w:rPr>
                 <w:noProof/>
               </w:rPr>
-              <w:instrText xml:space="preserve"> PAGEREF _Toc241179164 \h </w:instrText>
+              <w:instrText xml:space="preserve"> PAGEREF _Toc241461369 \h </w:instrText>
             </w:r>
             <w:r>
               <w:rPr>
@@ -5417,7 +5417,7 @@
               <w14:ligatures w14:val="standardContextual"/>
             </w:rPr>
           </w:pPr>
-          <w:hyperlink w:anchor="_Toc241179165" w:history="1">
+          <w:hyperlink w:anchor="_Toc241461370" w:history="1">
             <w:r>
               <w:rPr>
                 <w:rStyle w:val="Hyperlink"/>
@@ -5450,7 +5450,7 @@
               <w:rPr>
                 <w:noProof/>
               </w:rPr>
-              <w:instrText xml:space="preserve"> PAGEREF _Toc241179165 \h </w:instrText>
+              <w:instrText xml:space="preserve"> PAGEREF _Toc241461370 \h </w:instrText>
             </w:r>
             <w:r>
               <w:rPr>
@@ -5492,7 +5492,7 @@
               <w14:ligatures w14:val="standardContextual"/>
             </w:rPr>
           </w:pPr>
-          <w:hyperlink w:anchor="_Toc241179166" w:history="1">
+          <w:hyperlink w:anchor="_Toc241461371" w:history="1">
             <w:r>
               <w:rPr>
                 <w:rStyle w:val="Hyperlink"/>
@@ -5525,7 +5525,7 @@
               <w:rPr>
                 <w:noProof/>
               </w:rPr>
-              <w:instrText xml:space="preserve"> PAGEREF _Toc241179166 \h </w:instrText>
+              <w:instrText xml:space="preserve"> PAGEREF _Toc241461371 \h </w:instrText>
             </w:r>
             <w:r>
               <w:rPr>
@@ -5567,7 +5567,7 @@
               <w14:ligatures w14:val="standardContextual"/>
             </w:rPr>
           </w:pPr>
-          <w:hyperlink w:anchor="_Toc241179167" w:history="1">
+          <w:hyperlink w:anchor="_Toc241461372" w:history="1">
             <w:r>
               <w:rPr>
                 <w:rStyle w:val="Hyperlink"/>
@@ -5600,7 +5600,7 @@
               <w:rPr>
                 <w:noProof/>
               </w:rPr>
-              <w:instrText xml:space="preserve"> PAGEREF _Toc241179167 \h </w:instrText>
+              <w:instrText xml:space="preserve"> PAGEREF _Toc241461372 \h </w:instrText>
             </w:r>
             <w:r>
               <w:rPr>
@@ -5642,7 +5642,7 @@
               <w14:ligatures w14:val="standardContextual"/>
             </w:rPr>
           </w:pPr>
-          <w:hyperlink w:anchor="_Toc241179168" w:history="1">
+          <w:hyperlink w:anchor="_Toc241461373" w:history="1">
             <w:r>
               <w:rPr>
                 <w:rStyle w:val="Hyperlink"/>
@@ -5690,7 +5690,7 @@
               <w:rPr>
                 <w:noProof/>
               </w:rPr>
-              <w:instrText xml:space="preserve"> PAGEREF _Toc241179168 \h </w:instrText>
+              <w:instrText xml:space="preserve"> PAGEREF _Toc241461373 \h </w:instrText>
             </w:r>
             <w:r>
               <w:rPr>
@@ -5732,7 +5732,7 @@
               <w14:ligatures w14:val="standardContextual"/>
             </w:rPr>
           </w:pPr>
-          <w:hyperlink w:anchor="_Toc241179169" w:history="1">
+          <w:hyperlink w:anchor="_Toc241461374" w:history="1">
             <w:r>
               <w:rPr>
                 <w:rStyle w:val="Hyperlink"/>
@@ -5765,7 +5765,7 @@
               <w:rPr>
                 <w:noProof/>
               </w:rPr>
-              <w:instrText xml:space="preserve"> PAGEREF _Toc241179169 \h </w:instrText>
+              <w:instrText xml:space="preserve"> PAGEREF _Toc241461374 \h </w:instrText>
             </w:r>
             <w:r>
               <w:rPr>
@@ -5807,7 +5807,7 @@
               <w14:ligatures w14:val="standardContextual"/>
             </w:rPr>
           </w:pPr>
-          <w:hyperlink w:anchor="_Toc241179170" w:history="1">
+          <w:hyperlink w:anchor="_Toc241461375" w:history="1">
             <w:r>
               <w:rPr>
                 <w:rStyle w:val="Hyperlink"/>
@@ -5840,7 +5840,7 @@
               <w:rPr>
                 <w:noProof/>
               </w:rPr>
-              <w:instrText xml:space="preserve"> PAGEREF _Toc241179170 \h </w:instrText>
+              <w:instrText xml:space="preserve"> PAGEREF _Toc241461375 \h </w:instrText>
             </w:r>
             <w:r>
               <w:rPr>
@@ -5882,7 +5882,7 @@
               <w14:ligatures w14:val="standardContextual"/>
             </w:rPr>
           </w:pPr>
-          <w:hyperlink w:anchor="_Toc241179171" w:history="1">
+          <w:hyperlink w:anchor="_Toc241461376" w:history="1">
             <w:r>
               <w:rPr>
                 <w:rStyle w:val="Hyperlink"/>
@@ -5915,7 +5915,7 @@
               <w:rPr>
                 <w:noProof/>
               </w:rPr>
-              <w:instrText xml:space="preserve"> PAGEREF _Toc241179171 \h </w:instrText>
+              <w:instrText xml:space="preserve"> PAGEREF _Toc241461376 \h </w:instrText>
             </w:r>
             <w:r>
               <w:rPr>
@@ -5957,7 +5957,7 @@
               <w14:ligatures w14:val="standardContextual"/>
             </w:rPr>
           </w:pPr>
-          <w:hyperlink w:anchor="_Toc241179172" w:history="1">
+          <w:hyperlink w:anchor="_Toc241461377" w:history="1">
             <w:r>
               <w:rPr>
                 <w:rStyle w:val="Hyperlink"/>
@@ -5990,7 +5990,7 @@
               <w:rPr>
                 <w:noProof/>
               </w:rPr>
-              <w:instrText xml:space="preserve"> PAGEREF _Toc241179172 \h </w:instrText>
+              <w:instrText xml:space="preserve"> PAGEREF _Toc241461377 \h </w:instrText>
             </w:r>
             <w:r>
               <w:rPr>
@@ -6032,7 +6032,7 @@
               <w14:ligatures w14:val="standardContextual"/>
             </w:rPr>
           </w:pPr>
-          <w:hyperlink w:anchor="_Toc241179173" w:history="1">
+          <w:hyperlink w:anchor="_Toc241461378" w:history="1">
             <w:r>
               <w:rPr>
                 <w:rStyle w:val="Hyperlink"/>
@@ -6065,7 +6065,7 @@
               <w:rPr>
                 <w:noProof/>
               </w:rPr>
-              <w:instrText xml:space="preserve"> PAGEREF _Toc241179173 \h </w:instrText>
+              <w:instrText xml:space="preserve"> PAGEREF _Toc241461378 \h </w:instrText>
             </w:r>
             <w:r>
               <w:rPr>
@@ -6107,7 +6107,7 @@
               <w14:ligatures w14:val="standardContextual"/>
             </w:rPr>
           </w:pPr>
-          <w:hyperlink w:anchor="_Toc241179174" w:history="1">
+          <w:hyperlink w:anchor="_Toc241461379" w:history="1">
             <w:r>
               <w:rPr>
                 <w:rStyle w:val="Hyperlink"/>
@@ -6140,7 +6140,7 @@
               <w:rPr>
                 <w:noProof/>
               </w:rPr>
-              <w:instrText xml:space="preserve"> PAGEREF _Toc241179174 \h </w:instrText>
+              <w:instrText xml:space="preserve"> PAGEREF _Toc241461379 \h </w:instrText>
             </w:r>
             <w:r>
               <w:rPr>
@@ -6182,7 +6182,7 @@
               <w14:ligatures w14:val="standardContextual"/>
             </w:rPr>
           </w:pPr>
-          <w:hyperlink w:anchor="_Toc241179175" w:history="1">
+          <w:hyperlink w:anchor="_Toc241461380" w:history="1">
             <w:r>
               <w:rPr>
                 <w:rStyle w:val="Hyperlink"/>
@@ -6230,7 +6230,7 @@
               <w:rPr>
                 <w:noProof/>
               </w:rPr>
-              <w:instrText xml:space="preserve"> PAGEREF _Toc241179175 \h </w:instrText>
+              <w:instrText xml:space="preserve"> PAGEREF _Toc241461380 \h </w:instrText>
             </w:r>
             <w:r>
               <w:rPr>
@@ -6272,7 +6272,7 @@
               <w14:ligatures w14:val="standardContextual"/>
             </w:rPr>
           </w:pPr>
-          <w:hyperlink w:anchor="_Toc241179176" w:history="1">
+          <w:hyperlink w:anchor="_Toc241461381" w:history="1">
             <w:r>
               <w:rPr>
                 <w:rStyle w:val="Hyperlink"/>
@@ -6305,7 +6305,7 @@
               <w:rPr>
                 <w:noProof/>
               </w:rPr>
-              <w:instrText xml:space="preserve"> PAGEREF _Toc241179176 \h </w:instrText>
+              <w:instrText xml:space="preserve"> PAGEREF _Toc241461381 \h </w:instrText>
             </w:r>
             <w:r>
               <w:rPr>
@@ -6347,7 +6347,7 @@
               <w14:ligatures w14:val="standardContextual"/>
             </w:rPr>
           </w:pPr>
-          <w:hyperlink w:anchor="_Toc241179177" w:history="1">
+          <w:hyperlink w:anchor="_Toc241461382" w:history="1">
             <w:r>
               <w:rPr>
                 <w:rStyle w:val="Hyperlink"/>
@@ -6380,7 +6380,7 @@
               <w:rPr>
                 <w:noProof/>
               </w:rPr>
-              <w:instrText xml:space="preserve"> PAGEREF _Toc241179177 \h </w:instrText>
+              <w:instrText xml:space="preserve"> PAGEREF _Toc241461382 \h </w:instrText>
             </w:r>
             <w:r>
               <w:rPr>
@@ -6427,7 +6427,7 @@
     <w:sdt>
       <w:sdtPr>
         <w:alias w:val="List of Tables"/>
-        <w:id w:val="89435731"/>
+        <w:id w:val="-1773695106"/>
       </w:sdtPr>
       <w:sdtEndPr>
         <w:rPr>
@@ -6459,7 +6459,7 @@
           <w:r>
             <w:fldChar w:fldCharType="separate"/>
           </w:r>
-          <w:hyperlink w:anchor="_Toc241179178" w:history="1">
+          <w:hyperlink w:anchor="_Toc241461383" w:history="1">
             <w:r>
               <w:rPr>
                 <w:rStyle w:val="Hyperlink"/>
@@ -6492,7 +6492,7 @@
               <w:rPr>
                 <w:noProof/>
               </w:rPr>
-              <w:instrText xml:space="preserve"> PAGEREF _Toc241179178 \h </w:instrText>
+              <w:instrText xml:space="preserve"> PAGEREF _Toc241461383 \h </w:instrText>
             </w:r>
             <w:r>
               <w:rPr>
@@ -6534,7 +6534,7 @@
               <w14:ligatures w14:val="standardContextual"/>
             </w:rPr>
           </w:pPr>
-          <w:hyperlink w:anchor="_Toc241179179" w:history="1">
+          <w:hyperlink w:anchor="_Toc241461384" w:history="1">
             <w:r>
               <w:rPr>
                 <w:rStyle w:val="Hyperlink"/>
@@ -6567,7 +6567,7 @@
               <w:rPr>
                 <w:noProof/>
               </w:rPr>
-              <w:instrText xml:space="preserve"> PAGEREF _Toc241179179 \h </w:instrText>
+              <w:instrText xml:space="preserve"> PAGEREF _Toc241461384 \h </w:instrText>
             </w:r>
             <w:r>
               <w:rPr>
@@ -6609,7 +6609,7 @@
               <w14:ligatures w14:val="standardContextual"/>
             </w:rPr>
           </w:pPr>
-          <w:hyperlink w:anchor="_Toc241179180" w:history="1">
+          <w:hyperlink w:anchor="_Toc241461385" w:history="1">
             <w:r>
               <w:rPr>
                 <w:rStyle w:val="Hyperlink"/>
@@ -6642,7 +6642,7 @@
               <w:rPr>
                 <w:noProof/>
               </w:rPr>
-              <w:instrText xml:space="preserve"> PAGEREF _Toc241179180 \h </w:instrText>
+              <w:instrText xml:space="preserve"> PAGEREF _Toc241461385 \h </w:instrText>
             </w:r>
             <w:r>
               <w:rPr>
@@ -6684,7 +6684,7 @@
               <w14:ligatures w14:val="standardContextual"/>
             </w:rPr>
           </w:pPr>
-          <w:hyperlink w:anchor="_Toc241179181" w:history="1">
+          <w:hyperlink w:anchor="_Toc241461386" w:history="1">
             <w:r>
               <w:rPr>
                 <w:rStyle w:val="Hyperlink"/>
@@ -6717,7 +6717,7 @@
               <w:rPr>
                 <w:noProof/>
               </w:rPr>
-              <w:instrText xml:space="preserve"> PAGEREF _Toc241179181 \h </w:instrText>
+              <w:instrText xml:space="preserve"> PAGEREF _Toc241461386 \h </w:instrText>
             </w:r>
             <w:r>
               <w:rPr>
@@ -6759,7 +6759,7 @@
               <w14:ligatures w14:val="standardContextual"/>
             </w:rPr>
           </w:pPr>
-          <w:hyperlink w:anchor="_Toc241179182" w:history="1">
+          <w:hyperlink w:anchor="_Toc241461387" w:history="1">
             <w:r>
               <w:rPr>
                 <w:rStyle w:val="Hyperlink"/>
@@ -6792,7 +6792,7 @@
               <w:rPr>
                 <w:noProof/>
               </w:rPr>
-              <w:instrText xml:space="preserve"> PAGEREF _Toc241179182 \h </w:instrText>
+              <w:instrText xml:space="preserve"> PAGEREF _Toc241461387 \h </w:instrText>
             </w:r>
             <w:r>
               <w:rPr>
@@ -6834,7 +6834,7 @@
               <w14:ligatures w14:val="standardContextual"/>
             </w:rPr>
           </w:pPr>
-          <w:hyperlink w:anchor="_Toc241179183" w:history="1">
+          <w:hyperlink w:anchor="_Toc241461388" w:history="1">
             <w:r>
               <w:rPr>
                 <w:rStyle w:val="Hyperlink"/>
@@ -6867,7 +6867,7 @@
               <w:rPr>
                 <w:noProof/>
               </w:rPr>
-              <w:instrText xml:space="preserve"> PAGEREF _Toc241179183 \h </w:instrText>
+              <w:instrText xml:space="preserve"> PAGEREF _Toc241461388 \h </w:instrText>
             </w:r>
             <w:r>
               <w:rPr>
@@ -6909,7 +6909,7 @@
               <w14:ligatures w14:val="standardContextual"/>
             </w:rPr>
           </w:pPr>
-          <w:hyperlink w:anchor="_Toc241179184" w:history="1">
+          <w:hyperlink w:anchor="_Toc241461389" w:history="1">
             <w:r>
               <w:rPr>
                 <w:rStyle w:val="Hyperlink"/>
@@ -6942,7 +6942,7 @@
               <w:rPr>
                 <w:noProof/>
               </w:rPr>
-              <w:instrText xml:space="preserve"> PAGEREF _Toc241179184 \h </w:instrText>
+              <w:instrText xml:space="preserve"> PAGEREF _Toc241461389 \h </w:instrText>
             </w:r>
             <w:r>
               <w:rPr>
@@ -6984,7 +6984,7 @@
               <w14:ligatures w14:val="standardContextual"/>
             </w:rPr>
           </w:pPr>
-          <w:hyperlink w:anchor="_Toc241179185" w:history="1">
+          <w:hyperlink w:anchor="_Toc241461390" w:history="1">
             <w:r>
               <w:rPr>
                 <w:rStyle w:val="Hyperlink"/>
@@ -7017,7 +7017,7 @@
               <w:rPr>
                 <w:noProof/>
               </w:rPr>
-              <w:instrText xml:space="preserve"> PAGEREF _Toc241179185 \h </w:instrText>
+              <w:instrText xml:space="preserve"> PAGEREF _Toc241461390 \h </w:instrText>
             </w:r>
             <w:r>
               <w:rPr>
@@ -7059,7 +7059,7 @@
               <w14:ligatures w14:val="standardContextual"/>
             </w:rPr>
           </w:pPr>
-          <w:hyperlink w:anchor="_Toc241179186" w:history="1">
+          <w:hyperlink w:anchor="_Toc241461391" w:history="1">
             <w:r>
               <w:rPr>
                 <w:rStyle w:val="Hyperlink"/>
@@ -7092,7 +7092,7 @@
               <w:rPr>
                 <w:noProof/>
               </w:rPr>
-              <w:instrText xml:space="preserve"> PAGEREF _Toc241179186 \h </w:instrText>
+              <w:instrText xml:space="preserve"> PAGEREF _Toc241461391 \h </w:instrText>
             </w:r>
             <w:r>
               <w:rPr>
@@ -7134,7 +7134,7 @@
               <w14:ligatures w14:val="standardContextual"/>
             </w:rPr>
           </w:pPr>
-          <w:hyperlink w:anchor="_Toc241179187" w:history="1">
+          <w:hyperlink w:anchor="_Toc241461392" w:history="1">
             <w:r>
               <w:rPr>
                 <w:rStyle w:val="Hyperlink"/>
@@ -7167,7 +7167,7 @@
               <w:rPr>
                 <w:noProof/>
               </w:rPr>
-              <w:instrText xml:space="preserve"> PAGEREF _Toc241179187 \h </w:instrText>
+              <w:instrText xml:space="preserve"> PAGEREF _Toc241461392 \h </w:instrText>
             </w:r>
             <w:r>
               <w:rPr>
@@ -7209,7 +7209,7 @@
               <w14:ligatures w14:val="standardContextual"/>
             </w:rPr>
           </w:pPr>
-          <w:hyperlink w:anchor="_Toc241179188" w:history="1">
+          <w:hyperlink w:anchor="_Toc241461393" w:history="1">
             <w:r>
               <w:rPr>
                 <w:rStyle w:val="Hyperlink"/>
@@ -7242,7 +7242,7 @@
               <w:rPr>
                 <w:noProof/>
               </w:rPr>
-              <w:instrText xml:space="preserve"> PAGEREF _Toc241179188 \h </w:instrText>
+              <w:instrText xml:space="preserve"> PAGEREF _Toc241461393 \h </w:instrText>
             </w:r>
             <w:r>
               <w:rPr>
@@ -7284,7 +7284,7 @@
               <w14:ligatures w14:val="standardContextual"/>
             </w:rPr>
           </w:pPr>
-          <w:hyperlink w:anchor="_Toc241179189" w:history="1">
+          <w:hyperlink w:anchor="_Toc241461394" w:history="1">
             <w:r>
               <w:rPr>
                 <w:rStyle w:val="Hyperlink"/>
@@ -7317,7 +7317,7 @@
               <w:rPr>
                 <w:noProof/>
               </w:rPr>
-              <w:instrText xml:space="preserve"> PAGEREF _Toc241179189 \h </w:instrText>
+              <w:instrText xml:space="preserve"> PAGEREF _Toc241461394 \h </w:instrText>
             </w:r>
             <w:r>
               <w:rPr>
@@ -7359,7 +7359,7 @@
               <w14:ligatures w14:val="standardContextual"/>
             </w:rPr>
           </w:pPr>
-          <w:hyperlink w:anchor="_Toc241179190" w:history="1">
+          <w:hyperlink w:anchor="_Toc241461395" w:history="1">
             <w:r>
               <w:rPr>
                 <w:rStyle w:val="Hyperlink"/>
@@ -7392,7 +7392,7 @@
               <w:rPr>
                 <w:noProof/>
               </w:rPr>
-              <w:instrText xml:space="preserve"> PAGEREF _Toc241179190 \h </w:instrText>
+              <w:instrText xml:space="preserve"> PAGEREF _Toc241461395 \h </w:instrText>
             </w:r>
             <w:r>
               <w:rPr>
@@ -7434,7 +7434,7 @@
               <w14:ligatures w14:val="standardContextual"/>
             </w:rPr>
           </w:pPr>
-          <w:hyperlink w:anchor="_Toc241179191" w:history="1">
+          <w:hyperlink w:anchor="_Toc241461396" w:history="1">
             <w:r>
               <w:rPr>
                 <w:rStyle w:val="Hyperlink"/>
@@ -7467,7 +7467,7 @@
               <w:rPr>
                 <w:noProof/>
               </w:rPr>
-              <w:instrText xml:space="preserve"> PAGEREF _Toc241179191 \h </w:instrText>
+              <w:instrText xml:space="preserve"> PAGEREF _Toc241461396 \h </w:instrText>
             </w:r>
             <w:r>
               <w:rPr>
@@ -7509,7 +7509,7 @@
               <w14:ligatures w14:val="standardContextual"/>
             </w:rPr>
           </w:pPr>
-          <w:hyperlink w:anchor="_Toc241179192" w:history="1">
+          <w:hyperlink w:anchor="_Toc241461397" w:history="1">
             <w:r>
               <w:rPr>
                 <w:rStyle w:val="Hyperlink"/>
@@ -7542,7 +7542,7 @@
               <w:rPr>
                 <w:noProof/>
               </w:rPr>
-              <w:instrText xml:space="preserve"> PAGEREF _Toc241179192 \h </w:instrText>
+              <w:instrText xml:space="preserve"> PAGEREF _Toc241461397 \h </w:instrText>
             </w:r>
             <w:r>
               <w:rPr>
@@ -7584,7 +7584,7 @@
               <w14:ligatures w14:val="standardContextual"/>
             </w:rPr>
           </w:pPr>
-          <w:hyperlink w:anchor="_Toc241179193" w:history="1">
+          <w:hyperlink w:anchor="_Toc241461398" w:history="1">
             <w:r>
               <w:rPr>
                 <w:rStyle w:val="Hyperlink"/>
@@ -7617,7 +7617,7 @@
               <w:rPr>
                 <w:noProof/>
               </w:rPr>
-              <w:instrText xml:space="preserve"> PAGEREF _Toc241179193 \h </w:instrText>
+              <w:instrText xml:space="preserve"> PAGEREF _Toc241461398 \h </w:instrText>
             </w:r>
             <w:r>
               <w:rPr>
@@ -7659,7 +7659,7 @@
               <w14:ligatures w14:val="standardContextual"/>
             </w:rPr>
           </w:pPr>
-          <w:hyperlink w:anchor="_Toc241179194" w:history="1">
+          <w:hyperlink w:anchor="_Toc241461399" w:history="1">
             <w:r>
               <w:rPr>
                 <w:rStyle w:val="Hyperlink"/>
@@ -7692,7 +7692,7 @@
               <w:rPr>
                 <w:noProof/>
               </w:rPr>
-              <w:instrText xml:space="preserve"> PAGEREF _Toc241179194 \h </w:instrText>
+              <w:instrText xml:space="preserve"> PAGEREF _Toc241461399 \h </w:instrText>
             </w:r>
             <w:r>
               <w:rPr>
@@ -7734,7 +7734,7 @@
               <w14:ligatures w14:val="standardContextual"/>
             </w:rPr>
           </w:pPr>
-          <w:hyperlink w:anchor="_Toc241179195" w:history="1">
+          <w:hyperlink w:anchor="_Toc241461400" w:history="1">
             <w:r>
               <w:rPr>
                 <w:rStyle w:val="Hyperlink"/>
@@ -7767,7 +7767,7 @@
               <w:rPr>
                 <w:noProof/>
               </w:rPr>
-              <w:instrText xml:space="preserve"> PAGEREF _Toc241179195 \h </w:instrText>
+              <w:instrText xml:space="preserve"> PAGEREF _Toc241461400 \h </w:instrText>
             </w:r>
             <w:r>
               <w:rPr>
@@ -7809,7 +7809,7 @@
               <w14:ligatures w14:val="standardContextual"/>
             </w:rPr>
           </w:pPr>
-          <w:hyperlink w:anchor="_Toc241179196" w:history="1">
+          <w:hyperlink w:anchor="_Toc241461401" w:history="1">
             <w:r>
               <w:rPr>
                 <w:rStyle w:val="Hyperlink"/>
@@ -7842,7 +7842,7 @@
               <w:rPr>
                 <w:noProof/>
               </w:rPr>
-              <w:instrText xml:space="preserve"> PAGEREF _Toc241179196 \h </w:instrText>
+              <w:instrText xml:space="preserve"> PAGEREF _Toc241461401 \h </w:instrText>
             </w:r>
             <w:r>
               <w:rPr>
@@ -7884,7 +7884,7 @@
               <w14:ligatures w14:val="standardContextual"/>
             </w:rPr>
           </w:pPr>
-          <w:hyperlink w:anchor="_Toc241179197" w:history="1">
+          <w:hyperlink w:anchor="_Toc241461402" w:history="1">
             <w:r>
               <w:rPr>
                 <w:rStyle w:val="Hyperlink"/>
@@ -7917,7 +7917,7 @@
               <w:rPr>
                 <w:noProof/>
               </w:rPr>
-              <w:instrText xml:space="preserve"> PAGEREF _Toc241179197 \h </w:instrText>
+              <w:instrText xml:space="preserve"> PAGEREF _Toc241461402 \h </w:instrText>
             </w:r>
             <w:r>
               <w:rPr>
@@ -7959,7 +7959,7 @@
               <w14:ligatures w14:val="standardContextual"/>
             </w:rPr>
           </w:pPr>
-          <w:hyperlink w:anchor="_Toc241179198" w:history="1">
+          <w:hyperlink w:anchor="_Toc241461403" w:history="1">
             <w:r>
               <w:rPr>
                 <w:rStyle w:val="Hyperlink"/>
@@ -7992,7 +7992,7 @@
               <w:rPr>
                 <w:noProof/>
               </w:rPr>
-              <w:instrText xml:space="preserve"> PAGEREF _Toc241179198 \h </w:instrText>
+              <w:instrText xml:space="preserve"> PAGEREF _Toc241461403 \h </w:instrText>
             </w:r>
             <w:r>
               <w:rPr>
@@ -9556,7 +9556,7 @@
         <w:pStyle w:val="Heading1"/>
         <w:pageBreakBefore/>
       </w:pPr>
-      <w:bookmarkStart w:id="0" w:name="_Toc241179090"/>
+      <w:bookmarkStart w:id="0" w:name="_Toc241461295"/>
       <w:r>
         <w:lastRenderedPageBreak/>
         <w:t>1  Introduction</w:t>
@@ -9567,7 +9567,7 @@
       <w:pPr>
         <w:pStyle w:val="Heading2"/>
       </w:pPr>
-      <w:bookmarkStart w:id="1" w:name="_Toc241179091"/>
+      <w:bookmarkStart w:id="1" w:name="_Toc241461296"/>
       <w:r>
         <w:t>1.1  Background and motivation</w:t>
       </w:r>
@@ -9596,7 +9596,7 @@
       <w:pPr>
         <w:pStyle w:val="Heading2"/>
       </w:pPr>
-      <w:bookmarkStart w:id="2" w:name="_Toc241179092"/>
+      <w:bookmarkStart w:id="2" w:name="_Toc241461297"/>
       <w:r>
         <w:t>1.2  Problem statement</w:t>
       </w:r>
@@ -9614,7 +9614,7 @@
       <w:pPr>
         <w:pStyle w:val="Heading2"/>
       </w:pPr>
-      <w:bookmarkStart w:id="3" w:name="_Toc241179093"/>
+      <w:bookmarkStart w:id="3" w:name="_Toc241461298"/>
       <w:r>
         <w:t>1.3  Objectives</w:t>
       </w:r>
@@ -9624,7 +9624,7 @@
       <w:pPr>
         <w:pStyle w:val="TableCaption"/>
       </w:pPr>
-      <w:bookmarkStart w:id="4" w:name="_Toc241179178"/>
+      <w:bookmarkStart w:id="4" w:name="_Toc241461383"/>
       <w:r>
         <w:rPr>
           <w:b/>
@@ -10282,7 +10282,7 @@
       <w:pPr>
         <w:pStyle w:val="Heading2"/>
       </w:pPr>
-      <w:bookmarkStart w:id="5" w:name="_Toc241179094"/>
+      <w:bookmarkStart w:id="5" w:name="_Toc241461299"/>
       <w:r>
         <w:lastRenderedPageBreak/>
         <w:t>1.4  Scope</w:t>
@@ -10323,7 +10323,7 @@
       <w:pPr>
         <w:pStyle w:val="Heading2"/>
       </w:pPr>
-      <w:bookmarkStart w:id="6" w:name="_Toc241179095"/>
+      <w:bookmarkStart w:id="6" w:name="_Toc241461300"/>
       <w:r>
         <w:t>1.5  Contributions</w:t>
       </w:r>
@@ -10403,7 +10403,7 @@
       <w:pPr>
         <w:pStyle w:val="Heading2"/>
       </w:pPr>
-      <w:bookmarkStart w:id="7" w:name="_Toc241179096"/>
+      <w:bookmarkStart w:id="7" w:name="_Toc241461301"/>
       <w:r>
         <w:t>1.6  Organisation of this report</w:t>
       </w:r>
@@ -10425,7 +10425,7 @@
         <w:pStyle w:val="Heading1"/>
         <w:pageBreakBefore/>
       </w:pPr>
-      <w:bookmarkStart w:id="8" w:name="_Toc241179097"/>
+      <w:bookmarkStart w:id="8" w:name="_Toc241461302"/>
       <w:r>
         <w:lastRenderedPageBreak/>
         <w:t>2  Background and Related Work</w:t>
@@ -10436,7 +10436,7 @@
       <w:pPr>
         <w:pStyle w:val="Heading2"/>
       </w:pPr>
-      <w:bookmarkStart w:id="9" w:name="_Toc241179098"/>
+      <w:bookmarkStart w:id="9" w:name="_Toc241461303"/>
       <w:r>
         <w:t>2.1  Levels of sentiment analysis</w:t>
       </w:r>
@@ -10457,7 +10457,7 @@
       <w:pPr>
         <w:pStyle w:val="Heading2"/>
       </w:pPr>
-      <w:bookmarkStart w:id="10" w:name="_Toc241179099"/>
+      <w:bookmarkStart w:id="10" w:name="_Toc241461304"/>
       <w:r>
         <w:t>2.2  Lexicon- and knowledge-based methods</w:t>
       </w:r>
@@ -10532,7 +10532,7 @@
       <w:pPr>
         <w:pStyle w:val="Heading2"/>
       </w:pPr>
-      <w:bookmarkStart w:id="11" w:name="_Toc241179100"/>
+      <w:bookmarkStart w:id="11" w:name="_Toc241461305"/>
       <w:r>
         <w:t>2.3  Machine-learning and deep-learning methods</w:t>
       </w:r>
@@ -10550,7 +10550,7 @@
       <w:pPr>
         <w:pStyle w:val="Heading2"/>
       </w:pPr>
-      <w:bookmarkStart w:id="12" w:name="_Toc241179101"/>
+      <w:bookmarkStart w:id="12" w:name="_Toc241461306"/>
       <w:r>
         <w:t>2.4  Transformers and FinBERT</w:t>
       </w:r>
@@ -10568,7 +10568,7 @@
       <w:pPr>
         <w:pStyle w:val="Heading2"/>
       </w:pPr>
-      <w:bookmarkStart w:id="13" w:name="_Toc241179102"/>
+      <w:bookmarkStart w:id="13" w:name="_Toc241461307"/>
       <w:r>
         <w:t>2.5  LLM agents, hallucination and grounding</w:t>
       </w:r>
@@ -10596,7 +10596,7 @@
       <w:pPr>
         <w:pStyle w:val="Heading2"/>
       </w:pPr>
-      <w:bookmarkStart w:id="14" w:name="_Toc241179103"/>
+      <w:bookmarkStart w:id="14" w:name="_Toc241461308"/>
       <w:r>
         <w:lastRenderedPageBreak/>
         <w:t>2.6  Monitoring deployed models</w:t>
@@ -10636,7 +10636,7 @@
         <w:pStyle w:val="Heading1"/>
         <w:pageBreakBefore/>
       </w:pPr>
-      <w:bookmarkStart w:id="15" w:name="_Toc241179104"/>
+      <w:bookmarkStart w:id="15" w:name="_Toc241461309"/>
       <w:r>
         <w:lastRenderedPageBreak/>
         <w:t>3  System Design</w:t>
@@ -10647,7 +10647,7 @@
       <w:pPr>
         <w:pStyle w:val="Heading2"/>
       </w:pPr>
-      <w:bookmarkStart w:id="16" w:name="_Toc241179105"/>
+      <w:bookmarkStart w:id="16" w:name="_Toc241461310"/>
       <w:r>
         <w:t>3.1  Architecture overview</w:t>
       </w:r>
@@ -10673,7 +10673,7 @@
         </w:rPr>
         <w:lastRenderedPageBreak/>
         <w:drawing>
-          <wp:inline distT="0" distB="0" distL="0" distR="0" wp14:anchorId="18A511B4" wp14:editId="18A511B5">
+          <wp:inline distT="0" distB="0" distL="0" distR="0" wp14:anchorId="0E7B18B1" wp14:editId="0E7B18B2">
             <wp:extent cx="4762500" cy="7591425"/>
             <wp:effectExtent l="0" t="0" r="0" b="0"/>
             <wp:docPr id="1" name="Figure 3.1" descr="System architecture. Dark arrows follow the processing order; grey arrows are reads and writes to the database; the dashed arrow is the registry selecting the serving model." title="Figure 3.1"/>
@@ -10716,7 +10716,7 @@
       <w:pPr>
         <w:pStyle w:val="FigureCaption"/>
       </w:pPr>
-      <w:bookmarkStart w:id="17" w:name="_Toc241179153"/>
+      <w:bookmarkStart w:id="17" w:name="_Toc241461358"/>
       <w:r>
         <w:rPr>
           <w:b/>
@@ -10733,7 +10733,7 @@
       <w:pPr>
         <w:pStyle w:val="Heading2"/>
       </w:pPr>
-      <w:bookmarkStart w:id="18" w:name="_Toc241179106"/>
+      <w:bookmarkStart w:id="18" w:name="_Toc241461311"/>
       <w:r>
         <w:t>3.2  End-to-end data flow</w:t>
       </w:r>
@@ -10870,7 +10870,7 @@
       <w:pPr>
         <w:pStyle w:val="Heading2"/>
       </w:pPr>
-      <w:bookmarkStart w:id="19" w:name="_Toc241179107"/>
+      <w:bookmarkStart w:id="19" w:name="_Toc241461312"/>
       <w:r>
         <w:t>3.3  Database design</w:t>
       </w:r>
@@ -10895,10 +10895,10 @@
           <w:noProof/>
         </w:rPr>
         <w:drawing>
-          <wp:inline distT="0" distB="0" distL="0" distR="0" wp14:anchorId="18A511B6" wp14:editId="18A511B7">
+          <wp:inline distT="0" distB="0" distL="0" distR="0" wp14:anchorId="0E7B18B3" wp14:editId="0E7B18B4">
             <wp:extent cx="5667375" cy="1895475"/>
             <wp:effectExtent l="0" t="0" r="0" b="0"/>
-            <wp:docPr id="1349574957" name="Figure 3.2" descr="Database schema. Solid edges are foreign keys; dashed edges are logical references stored as values." title="Figure 3.2"/>
+            <wp:docPr id="1751005204" name="Figure 3.2" descr="Database schema. Solid edges are foreign keys; dashed edges are logical references stored as values." title="Figure 3.2"/>
             <wp:cNvGraphicFramePr>
               <a:graphicFrameLocks xmlns:a="http://schemas.openxmlformats.org/drawingml/2006/main" noChangeAspect="1"/>
             </wp:cNvGraphicFramePr>
@@ -10938,7 +10938,7 @@
       <w:pPr>
         <w:pStyle w:val="FigureCaption"/>
       </w:pPr>
-      <w:bookmarkStart w:id="20" w:name="_Toc241179154"/>
+      <w:bookmarkStart w:id="20" w:name="_Toc241461359"/>
       <w:r>
         <w:rPr>
           <w:b/>
@@ -10955,7 +10955,7 @@
       <w:pPr>
         <w:pStyle w:val="TableCaption"/>
       </w:pPr>
-      <w:bookmarkStart w:id="21" w:name="_Toc241179179"/>
+      <w:bookmarkStart w:id="21" w:name="_Toc241461384"/>
       <w:r>
         <w:rPr>
           <w:b/>
@@ -11933,7 +11933,7 @@
       <w:pPr>
         <w:pStyle w:val="Heading2"/>
       </w:pPr>
-      <w:bookmarkStart w:id="22" w:name="_Toc241179108"/>
+      <w:bookmarkStart w:id="22" w:name="_Toc241461313"/>
       <w:r>
         <w:t>3.4  Agent orchestration</w:t>
       </w:r>
@@ -11971,10 +11971,10 @@
         </w:rPr>
         <w:lastRenderedPageBreak/>
         <w:drawing>
-          <wp:inline distT="0" distB="0" distL="0" distR="0" wp14:anchorId="18A511B8" wp14:editId="18A511B9">
+          <wp:inline distT="0" distB="0" distL="0" distR="0" wp14:anchorId="0E7B18B5" wp14:editId="0E7B18B6">
             <wp:extent cx="5153025" cy="7591425"/>
             <wp:effectExtent l="0" t="0" r="0" b="0"/>
-            <wp:docPr id="2137357475" name="Figure 3.3" descr="Agent graph. Rejected claims never reach the Judge but remain in the audit trail." title="Figure 3.3"/>
+            <wp:docPr id="331542596" name="Figure 3.3" descr="Agent graph. Rejected claims never reach the Judge but remain in the audit trail." title="Figure 3.3"/>
             <wp:cNvGraphicFramePr>
               <a:graphicFrameLocks xmlns:a="http://schemas.openxmlformats.org/drawingml/2006/main" noChangeAspect="1"/>
             </wp:cNvGraphicFramePr>
@@ -12014,7 +12014,7 @@
       <w:pPr>
         <w:pStyle w:val="FigureCaption"/>
       </w:pPr>
-      <w:bookmarkStart w:id="23" w:name="_Toc241179155"/>
+      <w:bookmarkStart w:id="23" w:name="_Toc241461360"/>
       <w:r>
         <w:rPr>
           <w:b/>
@@ -12031,7 +12031,7 @@
       <w:pPr>
         <w:pStyle w:val="Heading2"/>
       </w:pPr>
-      <w:bookmarkStart w:id="24" w:name="_Toc241179109"/>
+      <w:bookmarkStart w:id="24" w:name="_Toc241461314"/>
       <w:r>
         <w:lastRenderedPageBreak/>
         <w:t>3.5  Technology stack</w:t>
@@ -12042,7 +12042,7 @@
       <w:pPr>
         <w:pStyle w:val="TableCaption"/>
       </w:pPr>
-      <w:bookmarkStart w:id="25" w:name="_Toc241179180"/>
+      <w:bookmarkStart w:id="25" w:name="_Toc241461385"/>
       <w:r>
         <w:rPr>
           <w:b/>
@@ -13358,7 +13358,7 @@
         <w:pStyle w:val="Heading1"/>
         <w:pageBreakBefore/>
       </w:pPr>
-      <w:bookmarkStart w:id="26" w:name="_Toc241179110"/>
+      <w:bookmarkStart w:id="26" w:name="_Toc241461315"/>
       <w:r>
         <w:lastRenderedPageBreak/>
         <w:t>4  Implementation</w:t>
@@ -13377,7 +13377,7 @@
       <w:pPr>
         <w:pStyle w:val="TableCaption"/>
       </w:pPr>
-      <w:bookmarkStart w:id="27" w:name="_Toc241179181"/>
+      <w:bookmarkStart w:id="27" w:name="_Toc241461386"/>
       <w:r>
         <w:rPr>
           <w:b/>
@@ -14341,7 +14341,7 @@
       <w:pPr>
         <w:pStyle w:val="Heading2"/>
       </w:pPr>
-      <w:bookmarkStart w:id="28" w:name="_Toc241179111"/>
+      <w:bookmarkStart w:id="28" w:name="_Toc241461316"/>
       <w:r>
         <w:t>4.1  Ingestion service</w:t>
       </w:r>
@@ -14381,7 +14381,7 @@
       <w:pPr>
         <w:pStyle w:val="TableCaption"/>
       </w:pPr>
-      <w:bookmarkStart w:id="29" w:name="_Toc241179182"/>
+      <w:bookmarkStart w:id="29" w:name="_Toc241461387"/>
       <w:r>
         <w:rPr>
           <w:b/>
@@ -15018,7 +15018,7 @@
       <w:pPr>
         <w:pStyle w:val="TableCaption"/>
       </w:pPr>
-      <w:bookmarkStart w:id="30" w:name="_Toc241179183"/>
+      <w:bookmarkStart w:id="30" w:name="_Toc241461388"/>
       <w:r>
         <w:rPr>
           <w:b/>
@@ -15977,7 +15977,7 @@
       <w:pPr>
         <w:pStyle w:val="Heading2"/>
       </w:pPr>
-      <w:bookmarkStart w:id="31" w:name="_Toc241179112"/>
+      <w:bookmarkStart w:id="31" w:name="_Toc241461317"/>
       <w:r>
         <w:t>4.2  Preprocessing</w:t>
       </w:r>
@@ -16086,7 +16086,7 @@
       <w:pPr>
         <w:pStyle w:val="Heading2"/>
       </w:pPr>
-      <w:bookmarkStart w:id="32" w:name="_Toc241179113"/>
+      <w:bookmarkStart w:id="32" w:name="_Toc241461318"/>
       <w:r>
         <w:t>4.3  Aspect extraction</w:t>
       </w:r>
@@ -16142,10 +16142,10 @@
         </w:rPr>
         <w:lastRenderedPageBreak/>
         <w:drawing>
-          <wp:inline distT="0" distB="0" distL="0" distR="0" wp14:anchorId="18A511BA" wp14:editId="18A511BB">
+          <wp:inline distT="0" distB="0" distL="0" distR="0" wp14:anchorId="0E7B18B7" wp14:editId="0E7B18B8">
             <wp:extent cx="5762625" cy="1000125"/>
             <wp:effectExtent l="0" t="0" r="0" b="0"/>
-            <wp:docPr id="753583054" name="Figure 4.1" descr="Command-line analysis of a five-sentence passage (rule-based model): each sentence yields one score per detected aspect, with the matched trigger in brackets." title="Figure 4.1"/>
+            <wp:docPr id="692453612" name="Figure 4.1" descr="Command-line analysis of a five-sentence passage (rule-based model): each sentence yields one score per detected aspect, with the matched trigger in brackets." title="Figure 4.1"/>
             <wp:cNvGraphicFramePr>
               <a:graphicFrameLocks xmlns:a="http://schemas.openxmlformats.org/drawingml/2006/main" noChangeAspect="1"/>
             </wp:cNvGraphicFramePr>
@@ -16185,7 +16185,7 @@
       <w:pPr>
         <w:pStyle w:val="FigureCaption"/>
       </w:pPr>
-      <w:bookmarkStart w:id="33" w:name="_Toc241179156"/>
+      <w:bookmarkStart w:id="33" w:name="_Toc241461361"/>
       <w:r>
         <w:rPr>
           <w:b/>
@@ -16220,7 +16220,7 @@
       <w:pPr>
         <w:pStyle w:val="Heading2"/>
       </w:pPr>
-      <w:bookmarkStart w:id="34" w:name="_Toc241179114"/>
+      <w:bookmarkStart w:id="34" w:name="_Toc241461319"/>
       <w:r>
         <w:t>4.4  The model ladder</w:t>
       </w:r>
@@ -16250,7 +16250,7 @@
       <w:pPr>
         <w:pStyle w:val="TableCaption"/>
       </w:pPr>
-      <w:bookmarkStart w:id="35" w:name="_Toc241179184"/>
+      <w:bookmarkStart w:id="35" w:name="_Toc241461389"/>
       <w:r>
         <w:rPr>
           <w:b/>
@@ -17373,7 +17373,7 @@
       <w:pPr>
         <w:pStyle w:val="Heading2"/>
       </w:pPr>
-      <w:bookmarkStart w:id="36" w:name="_Toc241179115"/>
+      <w:bookmarkStart w:id="36" w:name="_Toc241461320"/>
       <w:r>
         <w:t>4.5  Scoring and the prepared-versus-Q&amp;A signal</w:t>
       </w:r>
@@ -17443,7 +17443,7 @@
       <w:pPr>
         <w:pStyle w:val="Heading2"/>
       </w:pPr>
-      <w:bookmarkStart w:id="37" w:name="_Toc241179116"/>
+      <w:bookmarkStart w:id="37" w:name="_Toc241461321"/>
       <w:r>
         <w:t>4.6  Model registry and serving</w:t>
       </w:r>
@@ -17507,7 +17507,7 @@
       <w:pPr>
         <w:pStyle w:val="Heading2"/>
       </w:pPr>
-      <w:bookmarkStart w:id="38" w:name="_Toc241179117"/>
+      <w:bookmarkStart w:id="38" w:name="_Toc241461322"/>
       <w:r>
         <w:t>4.7  Agent layer</w:t>
       </w:r>
@@ -17620,7 +17620,7 @@
       <w:pPr>
         <w:pStyle w:val="TableCaption"/>
       </w:pPr>
-      <w:bookmarkStart w:id="39" w:name="_Toc241179185"/>
+      <w:bookmarkStart w:id="39" w:name="_Toc241461390"/>
       <w:r>
         <w:rPr>
           <w:b/>
@@ -18286,7 +18286,7 @@
       <w:pPr>
         <w:pStyle w:val="Heading2"/>
       </w:pPr>
-      <w:bookmarkStart w:id="40" w:name="_Toc241179118"/>
+      <w:bookmarkStart w:id="40" w:name="_Toc241461323"/>
       <w:r>
         <w:t>4.8  Drift monitoring</w:t>
       </w:r>
@@ -18336,7 +18336,7 @@
       <w:pPr>
         <w:pStyle w:val="Heading2"/>
       </w:pPr>
-      <w:bookmarkStart w:id="41" w:name="_Toc241179119"/>
+      <w:bookmarkStart w:id="41" w:name="_Toc241461324"/>
       <w:r>
         <w:lastRenderedPageBreak/>
         <w:t>4.9  API and delivery</w:t>
@@ -18362,10 +18362,10 @@
           <w:noProof/>
         </w:rPr>
         <w:drawing>
-          <wp:inline distT="0" distB="0" distL="0" distR="0" wp14:anchorId="18A511BC" wp14:editId="18A511BD">
+          <wp:inline distT="0" distB="0" distL="0" distR="0" wp14:anchorId="0E7B18B9" wp14:editId="0E7B18BA">
             <wp:extent cx="5667375" cy="3581400"/>
             <wp:effectExtent l="0" t="0" r="0" b="0"/>
-            <wp:docPr id="1759126716" name="Figure 4.2" descr="Interactive API documentation generated by FastAPI (`/docs`)." title="Figure 4.2"/>
+            <wp:docPr id="1775625895" name="Figure 4.2" descr="Interactive API documentation generated by FastAPI (`/docs`)." title="Figure 4.2"/>
             <wp:cNvGraphicFramePr>
               <a:graphicFrameLocks xmlns:a="http://schemas.openxmlformats.org/drawingml/2006/main" noChangeAspect="1"/>
             </wp:cNvGraphicFramePr>
@@ -18405,7 +18405,7 @@
       <w:pPr>
         <w:pStyle w:val="FigureCaption"/>
       </w:pPr>
-      <w:bookmarkStart w:id="42" w:name="_Toc241179157"/>
+      <w:bookmarkStart w:id="42" w:name="_Toc241461362"/>
       <w:r>
         <w:rPr>
           <w:b/>
@@ -18432,7 +18432,7 @@
       <w:pPr>
         <w:pStyle w:val="Heading2"/>
       </w:pPr>
-      <w:bookmarkStart w:id="43" w:name="_Toc241179120"/>
+      <w:bookmarkStart w:id="43" w:name="_Toc241461325"/>
       <w:r>
         <w:t>4.10  Dashboard</w:t>
       </w:r>
@@ -18450,7 +18450,7 @@
       <w:pPr>
         <w:pStyle w:val="Heading2"/>
       </w:pPr>
-      <w:bookmarkStart w:id="44" w:name="_Toc241179121"/>
+      <w:bookmarkStart w:id="44" w:name="_Toc241461326"/>
       <w:r>
         <w:t>4.11  Configuration and deployment</w:t>
       </w:r>
@@ -18613,7 +18613,7 @@
         <w:pStyle w:val="Heading1"/>
         <w:pageBreakBefore/>
       </w:pPr>
-      <w:bookmarkStart w:id="45" w:name="_Toc241179122"/>
+      <w:bookmarkStart w:id="45" w:name="_Toc241461327"/>
       <w:r>
         <w:lastRenderedPageBreak/>
         <w:t>5  User Interface Walkthrough</w:t>
@@ -18632,7 +18632,7 @@
       <w:pPr>
         <w:pStyle w:val="Heading2"/>
       </w:pPr>
-      <w:bookmarkStart w:id="46" w:name="_Toc241179123"/>
+      <w:bookmarkStart w:id="46" w:name="_Toc241461328"/>
       <w:r>
         <w:t>5.1  Watchlist</w:t>
       </w:r>
@@ -18657,10 +18657,10 @@
           <w:noProof/>
         </w:rPr>
         <w:drawing>
-          <wp:inline distT="0" distB="0" distL="0" distR="0" wp14:anchorId="18A511BE" wp14:editId="18A511BF">
+          <wp:inline distT="0" distB="0" distL="0" distR="0" wp14:anchorId="0E7B18BB" wp14:editId="0E7B18BC">
             <wp:extent cx="5667375" cy="3581400"/>
             <wp:effectExtent l="0" t="0" r="0" b="0"/>
-            <wp:docPr id="587880900" name="Figure 5.1" descr="Watchlist: top aspect moves and per-ticker aspect scores from the latest call." title="Figure 5.1"/>
+            <wp:docPr id="846703411" name="Figure 5.1" descr="Watchlist: top aspect moves and per-ticker aspect scores from the latest call." title="Figure 5.1"/>
             <wp:cNvGraphicFramePr>
               <a:graphicFrameLocks xmlns:a="http://schemas.openxmlformats.org/drawingml/2006/main" noChangeAspect="1"/>
             </wp:cNvGraphicFramePr>
@@ -18700,7 +18700,7 @@
       <w:pPr>
         <w:pStyle w:val="FigureCaption"/>
       </w:pPr>
-      <w:bookmarkStart w:id="47" w:name="_Toc241179158"/>
+      <w:bookmarkStart w:id="47" w:name="_Toc241461363"/>
       <w:r>
         <w:rPr>
           <w:b/>
@@ -18717,7 +18717,7 @@
       <w:pPr>
         <w:pStyle w:val="Heading2"/>
       </w:pPr>
-      <w:bookmarkStart w:id="48" w:name="_Toc241179124"/>
+      <w:bookmarkStart w:id="48" w:name="_Toc241461329"/>
       <w:r>
         <w:t>5.2  Aspect trajectories and drill-down</w:t>
       </w:r>
@@ -18743,10 +18743,10 @@
         </w:rPr>
         <w:lastRenderedPageBreak/>
         <w:drawing>
-          <wp:inline distT="0" distB="0" distL="0" distR="0" wp14:anchorId="18A511C0" wp14:editId="18A511C1">
+          <wp:inline distT="0" distB="0" distL="0" distR="0" wp14:anchorId="0E7B18BD" wp14:editId="0E7B18BE">
             <wp:extent cx="5667375" cy="3581400"/>
             <wp:effectExtent l="0" t="0" r="0" b="0"/>
-            <wp:docPr id="285454267" name="Figure 5.2" descr="Ticker view for ACMX: six aspect trajectories with prepared-remarks and Q&amp;A lines." title="Figure 5.2"/>
+            <wp:docPr id="1239018859" name="Figure 5.2" descr="Ticker view for ACMX: six aspect trajectories with prepared-remarks and Q&amp;A lines." title="Figure 5.2"/>
             <wp:cNvGraphicFramePr>
               <a:graphicFrameLocks xmlns:a="http://schemas.openxmlformats.org/drawingml/2006/main" noChangeAspect="1"/>
             </wp:cNvGraphicFramePr>
@@ -18786,7 +18786,7 @@
       <w:pPr>
         <w:pStyle w:val="FigureCaption"/>
       </w:pPr>
-      <w:bookmarkStart w:id="49" w:name="_Toc241179159"/>
+      <w:bookmarkStart w:id="49" w:name="_Toc241461364"/>
       <w:r>
         <w:rPr>
           <w:b/>
@@ -18818,10 +18818,10 @@
           <w:noProof/>
         </w:rPr>
         <w:drawing>
-          <wp:inline distT="0" distB="0" distL="0" distR="0" wp14:anchorId="18A511C2" wp14:editId="18A511C3">
+          <wp:inline distT="0" distB="0" distL="0" distR="0" wp14:anchorId="0E7B18BF" wp14:editId="0E7B18C0">
             <wp:extent cx="5667375" cy="3581400"/>
             <wp:effectExtent l="0" t="0" r="0" b="0"/>
-            <wp:docPr id="1425696940" name="Figure 5.3" descr="Drill-down: the management-tone point for the Q2 call opens the sentences, sections, scores and model behind it." title="Figure 5.3"/>
+            <wp:docPr id="972953482" name="Figure 5.3" descr="Drill-down: the management-tone point for the Q2 call opens the sentences, sections, scores and model behind it." title="Figure 5.3"/>
             <wp:cNvGraphicFramePr>
               <a:graphicFrameLocks xmlns:a="http://schemas.openxmlformats.org/drawingml/2006/main" noChangeAspect="1"/>
             </wp:cNvGraphicFramePr>
@@ -18861,7 +18861,7 @@
       <w:pPr>
         <w:pStyle w:val="FigureCaption"/>
       </w:pPr>
-      <w:bookmarkStart w:id="50" w:name="_Toc241179160"/>
+      <w:bookmarkStart w:id="50" w:name="_Toc241461365"/>
       <w:r>
         <w:rPr>
           <w:b/>
@@ -18886,10 +18886,10 @@
         </w:rPr>
         <w:lastRenderedPageBreak/>
         <w:drawing>
-          <wp:inline distT="0" distB="0" distL="0" distR="0" wp14:anchorId="18A511C4" wp14:editId="18A511C5">
+          <wp:inline distT="0" distB="0" distL="0" distR="0" wp14:anchorId="0E7B18C1" wp14:editId="0E7B18C2">
             <wp:extent cx="5667375" cy="3581400"/>
             <wp:effectExtent l="0" t="0" r="0" b="0"/>
-            <wp:docPr id="503305023" name="Figure 5.4" descr="Source drawer: the selected sentence highlighted in its surrounding transcript, with the model's verdict." title="Figure 5.4"/>
+            <wp:docPr id="830435189" name="Figure 5.4" descr="Source drawer: the selected sentence highlighted in its surrounding transcript, with the model's verdict." title="Figure 5.4"/>
             <wp:cNvGraphicFramePr>
               <a:graphicFrameLocks xmlns:a="http://schemas.openxmlformats.org/drawingml/2006/main" noChangeAspect="1"/>
             </wp:cNvGraphicFramePr>
@@ -18929,7 +18929,7 @@
       <w:pPr>
         <w:pStyle w:val="FigureCaption"/>
       </w:pPr>
-      <w:bookmarkStart w:id="51" w:name="_Toc241179161"/>
+      <w:bookmarkStart w:id="51" w:name="_Toc241461366"/>
       <w:r>
         <w:rPr>
           <w:b/>
@@ -18946,7 +18946,7 @@
       <w:pPr>
         <w:pStyle w:val="Heading2"/>
       </w:pPr>
-      <w:bookmarkStart w:id="52" w:name="_Toc241179125"/>
+      <w:bookmarkStart w:id="52" w:name="_Toc241461330"/>
       <w:r>
         <w:t>5.3  Grounded brief</w:t>
       </w:r>
@@ -18981,10 +18981,10 @@
           <w:noProof/>
         </w:rPr>
         <w:drawing>
-          <wp:inline distT="0" distB="0" distL="0" distR="0" wp14:anchorId="18A511C6" wp14:editId="18A511C7">
+          <wp:inline distT="0" distB="0" distL="0" distR="0" wp14:anchorId="0E7B18C3" wp14:editId="0E7B18C4">
             <wp:extent cx="5667375" cy="3581400"/>
             <wp:effectExtent l="0" t="0" r="0" b="0"/>
-            <wp:docPr id="1214094307" name="Figure 5.5" descr="Brief for ACMX: stance, confidence breakdown and a summary in which every claim is cited." title="Figure 5.5"/>
+            <wp:docPr id="620256913" name="Figure 5.5" descr="Brief for ACMX: stance, confidence breakdown and a summary in which every claim is cited." title="Figure 5.5"/>
             <wp:cNvGraphicFramePr>
               <a:graphicFrameLocks xmlns:a="http://schemas.openxmlformats.org/drawingml/2006/main" noChangeAspect="1"/>
             </wp:cNvGraphicFramePr>
@@ -19024,7 +19024,7 @@
       <w:pPr>
         <w:pStyle w:val="FigureCaption"/>
       </w:pPr>
-      <w:bookmarkStart w:id="53" w:name="_Toc241179162"/>
+      <w:bookmarkStart w:id="53" w:name="_Toc241461367"/>
       <w:r>
         <w:rPr>
           <w:b/>
@@ -19049,10 +19049,10 @@
         </w:rPr>
         <w:lastRenderedPageBreak/>
         <w:drawing>
-          <wp:inline distT="0" distB="0" distL="0" distR="0" wp14:anchorId="18A511C8" wp14:editId="18A511C9">
+          <wp:inline distT="0" distB="0" distL="0" distR="0" wp14:anchorId="0E7B18C5" wp14:editId="0E7B18C6">
             <wp:extent cx="5667375" cy="3581400"/>
             <wp:effectExtent l="0" t="0" r="0" b="0"/>
-            <wp:docPr id="109662227" name="Figure 5.6" descr="Verified bull and bear claims grouped by aspect." title="Figure 5.6"/>
+            <wp:docPr id="2000720852" name="Figure 5.6" descr="Verified bull and bear claims grouped by aspect." title="Figure 5.6"/>
             <wp:cNvGraphicFramePr>
               <a:graphicFrameLocks xmlns:a="http://schemas.openxmlformats.org/drawingml/2006/main" noChangeAspect="1"/>
             </wp:cNvGraphicFramePr>
@@ -19092,7 +19092,7 @@
       <w:pPr>
         <w:pStyle w:val="FigureCaption"/>
       </w:pPr>
-      <w:bookmarkStart w:id="54" w:name="_Toc241179163"/>
+      <w:bookmarkStart w:id="54" w:name="_Toc241461368"/>
       <w:r>
         <w:rPr>
           <w:b/>
@@ -19183,10 +19183,10 @@
         </w:rPr>
         <w:lastRenderedPageBreak/>
         <w:drawing>
-          <wp:inline distT="0" distB="0" distL="0" distR="0" wp14:anchorId="18A511CA" wp14:editId="18A511CB">
+          <wp:inline distT="0" distB="0" distL="0" distR="0" wp14:anchorId="0E7B18C7" wp14:editId="0E7B18C8">
             <wp:extent cx="5667375" cy="3581400"/>
             <wp:effectExtent l="0" t="0" r="0" b="0"/>
-            <wp:docPr id="1280254684" name="Figure 5.7" descr="Following a citation from the brief to its source sentence." title="Figure 5.7"/>
+            <wp:docPr id="2027782240" name="Figure 5.7" descr="Following a citation from the brief to its source sentence." title="Figure 5.7"/>
             <wp:cNvGraphicFramePr>
               <a:graphicFrameLocks xmlns:a="http://schemas.openxmlformats.org/drawingml/2006/main" noChangeAspect="1"/>
             </wp:cNvGraphicFramePr>
@@ -19226,7 +19226,7 @@
       <w:pPr>
         <w:pStyle w:val="FigureCaption"/>
       </w:pPr>
-      <w:bookmarkStart w:id="55" w:name="_Toc241179164"/>
+      <w:bookmarkStart w:id="55" w:name="_Toc241461369"/>
       <w:r>
         <w:rPr>
           <w:b/>
@@ -19258,10 +19258,10 @@
           <w:noProof/>
         </w:rPr>
         <w:drawing>
-          <wp:inline distT="0" distB="0" distL="0" distR="0" wp14:anchorId="18A511CC" wp14:editId="18A511CD">
+          <wp:inline distT="0" distB="0" distL="0" distR="0" wp14:anchorId="0E7B18C9" wp14:editId="0E7B18CA">
             <wp:extent cx="5667375" cy="3581400"/>
             <wp:effectExtent l="0" t="0" r="0" b="0"/>
-            <wp:docPr id="1166464600" name="Figure 5.8" descr="Agent audit trail: the Skeptic's per-claim checks and NLI probabilities." title="Figure 5.8"/>
+            <wp:docPr id="256800551" name="Figure 5.8" descr="Agent audit trail: the Skeptic's per-claim checks and NLI probabilities." title="Figure 5.8"/>
             <wp:cNvGraphicFramePr>
               <a:graphicFrameLocks xmlns:a="http://schemas.openxmlformats.org/drawingml/2006/main" noChangeAspect="1"/>
             </wp:cNvGraphicFramePr>
@@ -19301,7 +19301,7 @@
       <w:pPr>
         <w:pStyle w:val="FigureCaption"/>
       </w:pPr>
-      <w:bookmarkStart w:id="56" w:name="_Toc241179165"/>
+      <w:bookmarkStart w:id="56" w:name="_Toc241461370"/>
       <w:r>
         <w:rPr>
           <w:b/>
@@ -19318,7 +19318,7 @@
       <w:pPr>
         <w:pStyle w:val="Heading2"/>
       </w:pPr>
-      <w:bookmarkStart w:id="57" w:name="_Toc241179126"/>
+      <w:bookmarkStart w:id="57" w:name="_Toc241461331"/>
       <w:r>
         <w:lastRenderedPageBreak/>
         <w:t>5.4  Drift monitor and model registry</w:t>
@@ -19336,10 +19336,10 @@
           <w:noProof/>
         </w:rPr>
         <w:drawing>
-          <wp:inline distT="0" distB="0" distL="0" distR="0" wp14:anchorId="18A511CE" wp14:editId="18A511CF">
+          <wp:inline distT="0" distB="0" distL="0" distR="0" wp14:anchorId="0E7B18CB" wp14:editId="0E7B18CC">
             <wp:extent cx="5667375" cy="3581400"/>
             <wp:effectExtent l="0" t="0" r="0" b="0"/>
-            <wp:docPr id="1473854875" name="Figure 5.9" descr="Drift monitor: PSI and confidence shift per ticker and for the whole watchlist, with baseline versus current aspect mix." title="Figure 5.9"/>
+            <wp:docPr id="1035970933" name="Figure 5.9" descr="Drift monitor: PSI and confidence shift per ticker and for the whole watchlist, with baseline versus current aspect mix." title="Figure 5.9"/>
             <wp:cNvGraphicFramePr>
               <a:graphicFrameLocks xmlns:a="http://schemas.openxmlformats.org/drawingml/2006/main" noChangeAspect="1"/>
             </wp:cNvGraphicFramePr>
@@ -19379,7 +19379,7 @@
       <w:pPr>
         <w:pStyle w:val="FigureCaption"/>
       </w:pPr>
-      <w:bookmarkStart w:id="58" w:name="_Toc241179166"/>
+      <w:bookmarkStart w:id="58" w:name="_Toc241461371"/>
       <w:r>
         <w:rPr>
           <w:b/>
@@ -19412,10 +19412,10 @@
         </w:rPr>
         <w:lastRenderedPageBreak/>
         <w:drawing>
-          <wp:inline distT="0" distB="0" distL="0" distR="0" wp14:anchorId="18A511D0" wp14:editId="18A511D1">
+          <wp:inline distT="0" distB="0" distL="0" distR="0" wp14:anchorId="0E7B18CD" wp14:editId="0E7B18CE">
             <wp:extent cx="5667375" cy="3581400"/>
             <wp:effectExtent l="0" t="0" r="0" b="0"/>
-            <wp:docPr id="1743627478" name="Figure 5.10" descr="Model registry: every rung with gold-set metrics and the serving flag." title="Figure 5.10"/>
+            <wp:docPr id="1440910347" name="Figure 5.10" descr="Model registry: every rung with gold-set metrics and the serving flag." title="Figure 5.10"/>
             <wp:cNvGraphicFramePr>
               <a:graphicFrameLocks xmlns:a="http://schemas.openxmlformats.org/drawingml/2006/main" noChangeAspect="1"/>
             </wp:cNvGraphicFramePr>
@@ -19455,7 +19455,7 @@
       <w:pPr>
         <w:pStyle w:val="FigureCaption"/>
       </w:pPr>
-      <w:bookmarkStart w:id="59" w:name="_Toc241179167"/>
+      <w:bookmarkStart w:id="59" w:name="_Toc241461372"/>
       <w:r>
         <w:rPr>
           <w:b/>
@@ -19479,10 +19479,10 @@
           <w:noProof/>
         </w:rPr>
         <w:drawing>
-          <wp:inline distT="0" distB="0" distL="0" distR="0" wp14:anchorId="18A511D2" wp14:editId="18A511D3">
+          <wp:inline distT="0" distB="0" distL="0" distR="0" wp14:anchorId="0E7B18CF" wp14:editId="0E7B18D0">
             <wp:extent cx="5667375" cy="3581400"/>
             <wp:effectExtent l="0" t="0" r="0" b="0"/>
-            <wp:docPr id="957097784" name="Figure 5.11" descr="MLflow experiment `sentari-absa-ladder` with one run per model. (Durations are logging times; training times are in Section 6.2.)" title="Figure 5.11"/>
+            <wp:docPr id="952384568" name="Figure 5.11" descr="MLflow experiment `sentari-absa-ladder` with one run per model. (Durations are logging times; training times are in Section 6.2.)" title="Figure 5.11"/>
             <wp:cNvGraphicFramePr>
               <a:graphicFrameLocks xmlns:a="http://schemas.openxmlformats.org/drawingml/2006/main" noChangeAspect="1"/>
             </wp:cNvGraphicFramePr>
@@ -19522,7 +19522,7 @@
       <w:pPr>
         <w:pStyle w:val="FigureCaption"/>
       </w:pPr>
-      <w:bookmarkStart w:id="60" w:name="_Toc241179168"/>
+      <w:bookmarkStart w:id="60" w:name="_Toc241461373"/>
       <w:r>
         <w:rPr>
           <w:b/>
@@ -19549,7 +19549,7 @@
       <w:pPr>
         <w:pStyle w:val="Heading2"/>
       </w:pPr>
-      <w:bookmarkStart w:id="61" w:name="_Toc241179127"/>
+      <w:bookmarkStart w:id="61" w:name="_Toc241461332"/>
       <w:r>
         <w:lastRenderedPageBreak/>
         <w:t>5.5  Dark mode and small screens</w:t>
@@ -19567,10 +19567,10 @@
           <w:noProof/>
         </w:rPr>
         <w:drawing>
-          <wp:inline distT="0" distB="0" distL="0" distR="0" wp14:anchorId="18A511D4" wp14:editId="18A511D5">
+          <wp:inline distT="0" distB="0" distL="0" distR="0" wp14:anchorId="0E7B18D1" wp14:editId="0E7B18D2">
             <wp:extent cx="5667375" cy="3581400"/>
             <wp:effectExtent l="0" t="0" r="0" b="0"/>
-            <wp:docPr id="1637757888" name="Figure 5.12" descr="Ticker view in dark mode (NVLT)." title="Figure 5.12"/>
+            <wp:docPr id="1468962858" name="Figure 5.12" descr="Ticker view in dark mode (NVLT)." title="Figure 5.12"/>
             <wp:cNvGraphicFramePr>
               <a:graphicFrameLocks xmlns:a="http://schemas.openxmlformats.org/drawingml/2006/main" noChangeAspect="1"/>
             </wp:cNvGraphicFramePr>
@@ -19610,7 +19610,7 @@
       <w:pPr>
         <w:pStyle w:val="FigureCaption"/>
       </w:pPr>
-      <w:bookmarkStart w:id="62" w:name="_Toc241179169"/>
+      <w:bookmarkStart w:id="62" w:name="_Toc241461374"/>
       <w:r>
         <w:rPr>
           <w:b/>
@@ -19635,10 +19635,10 @@
         </w:rPr>
         <w:lastRenderedPageBreak/>
         <w:drawing>
-          <wp:inline distT="0" distB="0" distL="0" distR="0" wp14:anchorId="18A511D6" wp14:editId="18A511D7">
+          <wp:inline distT="0" distB="0" distL="0" distR="0" wp14:anchorId="0E7B18D3" wp14:editId="0E7B18D4">
             <wp:extent cx="2381250" cy="5143500"/>
             <wp:effectExtent l="0" t="0" r="0" b="0"/>
-            <wp:docPr id="2018969792" name="Figure 5.13" descr="Watchlist at phone width (390 px)." title="Figure 5.13"/>
+            <wp:docPr id="1299259898" name="Figure 5.13" descr="Watchlist at phone width (390 px)." title="Figure 5.13"/>
             <wp:cNvGraphicFramePr>
               <a:graphicFrameLocks xmlns:a="http://schemas.openxmlformats.org/drawingml/2006/main" noChangeAspect="1"/>
             </wp:cNvGraphicFramePr>
@@ -19678,7 +19678,7 @@
       <w:pPr>
         <w:pStyle w:val="FigureCaption"/>
       </w:pPr>
-      <w:bookmarkStart w:id="63" w:name="_Toc241179170"/>
+      <w:bookmarkStart w:id="63" w:name="_Toc241461375"/>
       <w:r>
         <w:rPr>
           <w:b/>
@@ -19704,7 +19704,7 @@
         <w:pStyle w:val="Heading1"/>
         <w:pageBreakBefore/>
       </w:pPr>
-      <w:bookmarkStart w:id="64" w:name="_Toc241179128"/>
+      <w:bookmarkStart w:id="64" w:name="_Toc241461333"/>
       <w:r>
         <w:lastRenderedPageBreak/>
         <w:t>6  Evaluation</w:t>
@@ -19723,7 +19723,7 @@
       <w:pPr>
         <w:pStyle w:val="TableCaption"/>
       </w:pPr>
-      <w:bookmarkStart w:id="65" w:name="_Toc241179186"/>
+      <w:bookmarkStart w:id="65" w:name="_Toc241461391"/>
       <w:r>
         <w:rPr>
           <w:b/>
@@ -20371,7 +20371,7 @@
       <w:pPr>
         <w:pStyle w:val="Heading2"/>
       </w:pPr>
-      <w:bookmarkStart w:id="66" w:name="_Toc241179129"/>
+      <w:bookmarkStart w:id="66" w:name="_Toc241461334"/>
       <w:r>
         <w:t>6.1  Data and protocol</w:t>
       </w:r>
@@ -20448,7 +20448,7 @@
       <w:pPr>
         <w:pStyle w:val="Heading2"/>
       </w:pPr>
-      <w:bookmarkStart w:id="67" w:name="_Toc241179130"/>
+      <w:bookmarkStart w:id="67" w:name="_Toc241461335"/>
       <w:r>
         <w:t>6.2  Model ladder</w:t>
       </w:r>
@@ -20458,7 +20458,7 @@
       <w:pPr>
         <w:pStyle w:val="TableCaption"/>
       </w:pPr>
-      <w:bookmarkStart w:id="68" w:name="_Toc241179187"/>
+      <w:bookmarkStart w:id="68" w:name="_Toc241461392"/>
       <w:r>
         <w:rPr>
           <w:b/>
@@ -23253,10 +23253,10 @@
           <w:noProof/>
         </w:rPr>
         <w:drawing>
-          <wp:inline distT="0" distB="0" distL="0" distR="0" wp14:anchorId="18A511D8" wp14:editId="18A511D9">
+          <wp:inline distT="0" distB="0" distL="0" distR="0" wp14:anchorId="0E7B18D5" wp14:editId="0E7B18D6">
             <wp:extent cx="5667375" cy="3124200"/>
             <wp:effectExtent l="0" t="0" r="0" b="0"/>
-            <wp:docPr id="156452863" name="Figure 6.1" descr="Macro-F1 by model, coloured by rung." title="Figure 6.1"/>
+            <wp:docPr id="1508982824" name="Figure 6.1" descr="Macro-F1 by model, coloured by rung." title="Figure 6.1"/>
             <wp:cNvGraphicFramePr>
               <a:graphicFrameLocks xmlns:a="http://schemas.openxmlformats.org/drawingml/2006/main" noChangeAspect="1"/>
             </wp:cNvGraphicFramePr>
@@ -23296,7 +23296,7 @@
       <w:pPr>
         <w:pStyle w:val="FigureCaption"/>
       </w:pPr>
-      <w:bookmarkStart w:id="69" w:name="_Toc241179171"/>
+      <w:bookmarkStart w:id="69" w:name="_Toc241461376"/>
       <w:r>
         <w:rPr>
           <w:b/>
@@ -23328,10 +23328,10 @@
           <w:noProof/>
         </w:rPr>
         <w:drawing>
-          <wp:inline distT="0" distB="0" distL="0" distR="0" wp14:anchorId="18A511DA" wp14:editId="18A511DB">
+          <wp:inline distT="0" distB="0" distL="0" distR="0" wp14:anchorId="0E7B18D7" wp14:editId="0E7B18D8">
             <wp:extent cx="5667375" cy="2181225"/>
             <wp:effectExtent l="0" t="0" r="0" b="0"/>
-            <wp:docPr id="138876689" name="Figure 6.2" descr="Confusion matrices for the general-purpose lexicon, the best rule model and the best learned model." title="Figure 6.2"/>
+            <wp:docPr id="430884379" name="Figure 6.2" descr="Confusion matrices for the general-purpose lexicon, the best rule model and the best learned model." title="Figure 6.2"/>
             <wp:cNvGraphicFramePr>
               <a:graphicFrameLocks xmlns:a="http://schemas.openxmlformats.org/drawingml/2006/main" noChangeAspect="1"/>
             </wp:cNvGraphicFramePr>
@@ -23371,7 +23371,7 @@
       <w:pPr>
         <w:pStyle w:val="FigureCaption"/>
       </w:pPr>
-      <w:bookmarkStart w:id="70" w:name="_Toc241179172"/>
+      <w:bookmarkStart w:id="70" w:name="_Toc241461377"/>
       <w:r>
         <w:rPr>
           <w:b/>
@@ -23407,10 +23407,10 @@
           <w:noProof/>
         </w:rPr>
         <w:drawing>
-          <wp:inline distT="0" distB="0" distL="0" distR="0" wp14:anchorId="18A511DC" wp14:editId="18A511DD">
+          <wp:inline distT="0" distB="0" distL="0" distR="0" wp14:anchorId="0E7B18D9" wp14:editId="0E7B18DA">
             <wp:extent cx="5667375" cy="2857500"/>
             <wp:effectExtent l="0" t="0" r="0" b="0"/>
-            <wp:docPr id="827815087" name="Figure 6.3" descr="Accuracy against inference cost per sentence on CPU (log scale)." title="Figure 6.3"/>
+            <wp:docPr id="666721215" name="Figure 6.3" descr="Accuracy against inference cost per sentence on CPU (log scale)." title="Figure 6.3"/>
             <wp:cNvGraphicFramePr>
               <a:graphicFrameLocks xmlns:a="http://schemas.openxmlformats.org/drawingml/2006/main" noChangeAspect="1"/>
             </wp:cNvGraphicFramePr>
@@ -23450,7 +23450,7 @@
       <w:pPr>
         <w:pStyle w:val="FigureCaption"/>
       </w:pPr>
-      <w:bookmarkStart w:id="71" w:name="_Toc241179173"/>
+      <w:bookmarkStart w:id="71" w:name="_Toc241461378"/>
       <w:r>
         <w:rPr>
           <w:b/>
@@ -23578,7 +23578,7 @@
       <w:pPr>
         <w:pStyle w:val="Heading2"/>
       </w:pPr>
-      <w:bookmarkStart w:id="72" w:name="_Toc241179131"/>
+      <w:bookmarkStart w:id="72" w:name="_Toc241461336"/>
       <w:r>
         <w:t>6.3  Lexicon failure analysis</w:t>
       </w:r>
@@ -23596,7 +23596,7 @@
       <w:pPr>
         <w:pStyle w:val="TableCaption"/>
       </w:pPr>
-      <w:bookmarkStart w:id="73" w:name="_Toc241179188"/>
+      <w:bookmarkStart w:id="73" w:name="_Toc241461393"/>
       <w:r>
         <w:rPr>
           <w:b/>
@@ -24690,10 +24690,10 @@
           <w:noProof/>
         </w:rPr>
         <w:drawing>
-          <wp:inline distT="0" distB="0" distL="0" distR="0" wp14:anchorId="18A511DE" wp14:editId="18A511DF">
+          <wp:inline distT="0" distB="0" distL="0" distR="0" wp14:anchorId="0E7B18DB" wp14:editId="0E7B18DC">
             <wp:extent cx="5667375" cy="3409950"/>
             <wp:effectExtent l="0" t="0" r="0" b="0"/>
-            <wp:docPr id="1805271426" name="Figure 6.4" descr="Error rate on finance-inverted (trap) sentences versus the rest." title="Figure 6.4"/>
+            <wp:docPr id="152392074" name="Figure 6.4" descr="Error rate on finance-inverted (trap) sentences versus the rest." title="Figure 6.4"/>
             <wp:cNvGraphicFramePr>
               <a:graphicFrameLocks xmlns:a="http://schemas.openxmlformats.org/drawingml/2006/main" noChangeAspect="1"/>
             </wp:cNvGraphicFramePr>
@@ -24733,7 +24733,7 @@
       <w:pPr>
         <w:pStyle w:val="FigureCaption"/>
       </w:pPr>
-      <w:bookmarkStart w:id="74" w:name="_Toc241179174"/>
+      <w:bookmarkStart w:id="74" w:name="_Toc241461379"/>
       <w:r>
         <w:rPr>
           <w:b/>
@@ -24768,7 +24768,7 @@
       <w:pPr>
         <w:pStyle w:val="TableCaption"/>
       </w:pPr>
-      <w:bookmarkStart w:id="75" w:name="_Toc241179189"/>
+      <w:bookmarkStart w:id="75" w:name="_Toc241461394"/>
       <w:r>
         <w:rPr>
           <w:b/>
@@ -26956,10 +26956,10 @@
           <w:noProof/>
         </w:rPr>
         <w:drawing>
-          <wp:inline distT="0" distB="0" distL="0" distR="0" wp14:anchorId="18A511E0" wp14:editId="18A511E1">
+          <wp:inline distT="0" distB="0" distL="0" distR="0" wp14:anchorId="0E7B18DD" wp14:editId="0E7B18DE">
             <wp:extent cx="4933950" cy="1114425"/>
             <wp:effectExtent l="0" t="0" r="0" b="0"/>
-            <wp:docPr id="82081990" name="Figure 6.5" descr="Output of `python -m evaluation.lexicon_failure`." title="Figure 6.5"/>
+            <wp:docPr id="1130294599" name="Figure 6.5" descr="Output of `python -m evaluation.lexicon_failure`." title="Figure 6.5"/>
             <wp:cNvGraphicFramePr>
               <a:graphicFrameLocks xmlns:a="http://schemas.openxmlformats.org/drawingml/2006/main" noChangeAspect="1"/>
             </wp:cNvGraphicFramePr>
@@ -26999,7 +26999,7 @@
       <w:pPr>
         <w:pStyle w:val="FigureCaption"/>
       </w:pPr>
-      <w:bookmarkStart w:id="76" w:name="_Toc241179175"/>
+      <w:bookmarkStart w:id="76" w:name="_Toc241461380"/>
       <w:r>
         <w:rPr>
           <w:b/>
@@ -27026,7 +27026,7 @@
       <w:pPr>
         <w:pStyle w:val="Heading2"/>
       </w:pPr>
-      <w:bookmarkStart w:id="77" w:name="_Toc241179132"/>
+      <w:bookmarkStart w:id="77" w:name="_Toc241461337"/>
       <w:r>
         <w:t>6.4  Grounding audit</w:t>
       </w:r>
@@ -27061,7 +27061,7 @@
       <w:pPr>
         <w:pStyle w:val="TableCaption"/>
       </w:pPr>
-      <w:bookmarkStart w:id="78" w:name="_Toc241179190"/>
+      <w:bookmarkStart w:id="78" w:name="_Toc241461395"/>
       <w:r>
         <w:rPr>
           <w:b/>
@@ -28448,10 +28448,10 @@
         </w:rPr>
         <w:lastRenderedPageBreak/>
         <w:drawing>
-          <wp:inline distT="0" distB="0" distL="0" distR="0" wp14:anchorId="18A511E2" wp14:editId="18A511E3">
+          <wp:inline distT="0" distB="0" distL="0" distR="0" wp14:anchorId="0E7B18DF" wp14:editId="0E7B18E0">
             <wp:extent cx="5667375" cy="3590925"/>
             <wp:effectExtent l="0" t="0" r="0" b="0"/>
-            <wp:docPr id="825701896" name="Figure 6.6" descr="Skeptic catch rate by corruption type, heuristic versus NLI entailment." title="Figure 6.6"/>
+            <wp:docPr id="656434270" name="Figure 6.6" descr="Skeptic catch rate by corruption type, heuristic versus NLI entailment." title="Figure 6.6"/>
             <wp:cNvGraphicFramePr>
               <a:graphicFrameLocks xmlns:a="http://schemas.openxmlformats.org/drawingml/2006/main" noChangeAspect="1"/>
             </wp:cNvGraphicFramePr>
@@ -28491,7 +28491,7 @@
       <w:pPr>
         <w:pStyle w:val="FigureCaption"/>
       </w:pPr>
-      <w:bookmarkStart w:id="79" w:name="_Toc241179176"/>
+      <w:bookmarkStart w:id="79" w:name="_Toc241461381"/>
       <w:r>
         <w:rPr>
           <w:b/>
@@ -28575,7 +28575,7 @@
       <w:pPr>
         <w:pStyle w:val="Heading2"/>
       </w:pPr>
-      <w:bookmarkStart w:id="80" w:name="_Toc241179133"/>
+      <w:bookmarkStart w:id="80" w:name="_Toc241461338"/>
       <w:r>
         <w:t>6.5  Signal validity</w:t>
       </w:r>
@@ -28624,7 +28624,7 @@
       <w:pPr>
         <w:pStyle w:val="Heading2"/>
       </w:pPr>
-      <w:bookmarkStart w:id="81" w:name="_Toc241179134"/>
+      <w:bookmarkStart w:id="81" w:name="_Toc241461339"/>
       <w:r>
         <w:t>6.6  Latency and cost</w:t>
       </w:r>
@@ -28634,7 +28634,7 @@
       <w:pPr>
         <w:pStyle w:val="TableCaption"/>
       </w:pPr>
-      <w:bookmarkStart w:id="82" w:name="_Toc241179191"/>
+      <w:bookmarkStart w:id="82" w:name="_Toc241461396"/>
       <w:r>
         <w:rPr>
           <w:b/>
@@ -29489,7 +29489,7 @@
       <w:pPr>
         <w:pStyle w:val="Heading2"/>
       </w:pPr>
-      <w:bookmarkStart w:id="83" w:name="_Toc241179135"/>
+      <w:bookmarkStart w:id="83" w:name="_Toc241461340"/>
       <w:r>
         <w:t>6.7  Qualitative findings from the end-to-end run</w:t>
       </w:r>
@@ -29606,7 +29606,7 @@
         <w:pStyle w:val="Heading1"/>
         <w:pageBreakBefore/>
       </w:pPr>
-      <w:bookmarkStart w:id="84" w:name="_Toc241179136"/>
+      <w:bookmarkStart w:id="84" w:name="_Toc241461341"/>
       <w:r>
         <w:lastRenderedPageBreak/>
         <w:t>7  Testing</w:t>
@@ -29617,7 +29617,7 @@
       <w:pPr>
         <w:pStyle w:val="Heading2"/>
       </w:pPr>
-      <w:bookmarkStart w:id="85" w:name="_Toc241179137"/>
+      <w:bookmarkStart w:id="85" w:name="_Toc241461342"/>
       <w:r>
         <w:t>7.1  Strategy</w:t>
       </w:r>
@@ -29647,7 +29647,7 @@
       <w:pPr>
         <w:pStyle w:val="TableCaption"/>
       </w:pPr>
-      <w:bookmarkStart w:id="86" w:name="_Toc241179192"/>
+      <w:bookmarkStart w:id="86" w:name="_Toc241461397"/>
       <w:r>
         <w:rPr>
           <w:b/>
@@ -30415,10 +30415,10 @@
           <w:noProof/>
         </w:rPr>
         <w:drawing>
-          <wp:inline distT="0" distB="0" distL="0" distR="0" wp14:anchorId="18A511E4" wp14:editId="18A511E5">
+          <wp:inline distT="0" distB="0" distL="0" distR="0" wp14:anchorId="0E7B18E1" wp14:editId="0E7B18E2">
             <wp:extent cx="4933950" cy="523875"/>
             <wp:effectExtent l="0" t="0" r="0" b="0"/>
-            <wp:docPr id="866559037" name="Figure 7.1" descr="Test run: 58 passed." title="Figure 7.1"/>
+            <wp:docPr id="602240759" name="Figure 7.1" descr="Test run: 58 passed." title="Figure 7.1"/>
             <wp:cNvGraphicFramePr>
               <a:graphicFrameLocks xmlns:a="http://schemas.openxmlformats.org/drawingml/2006/main" noChangeAspect="1"/>
             </wp:cNvGraphicFramePr>
@@ -30458,7 +30458,7 @@
       <w:pPr>
         <w:pStyle w:val="FigureCaption"/>
       </w:pPr>
-      <w:bookmarkStart w:id="87" w:name="_Toc241179177"/>
+      <w:bookmarkStart w:id="87" w:name="_Toc241461382"/>
       <w:r>
         <w:rPr>
           <w:b/>
@@ -30475,7 +30475,7 @@
       <w:pPr>
         <w:pStyle w:val="Heading2"/>
       </w:pPr>
-      <w:bookmarkStart w:id="88" w:name="_Toc241179138"/>
+      <w:bookmarkStart w:id="88" w:name="_Toc241461343"/>
       <w:r>
         <w:t>7.2  Continuous integration</w:t>
       </w:r>
@@ -30493,7 +30493,7 @@
       <w:pPr>
         <w:pStyle w:val="Heading2"/>
       </w:pPr>
-      <w:bookmarkStart w:id="89" w:name="_Toc241179139"/>
+      <w:bookmarkStart w:id="89" w:name="_Toc241461344"/>
       <w:r>
         <w:lastRenderedPageBreak/>
         <w:t>7.3  Defects found and fixed</w:t>
@@ -30504,7 +30504,7 @@
       <w:pPr>
         <w:pStyle w:val="TableCaption"/>
       </w:pPr>
-      <w:bookmarkStart w:id="90" w:name="_Toc241179193"/>
+      <w:bookmarkStart w:id="90" w:name="_Toc241461398"/>
       <w:r>
         <w:rPr>
           <w:b/>
@@ -31519,7 +31519,7 @@
         <w:pStyle w:val="Heading1"/>
         <w:pageBreakBefore/>
       </w:pPr>
-      <w:bookmarkStart w:id="91" w:name="_Toc241179140"/>
+      <w:bookmarkStart w:id="91" w:name="_Toc241461345"/>
       <w:r>
         <w:lastRenderedPageBreak/>
         <w:t>8  Syllabus Mapping</w:t>
@@ -31530,7 +31530,7 @@
       <w:pPr>
         <w:pStyle w:val="TableCaption"/>
       </w:pPr>
-      <w:bookmarkStart w:id="92" w:name="_Toc241179194"/>
+      <w:bookmarkStart w:id="92" w:name="_Toc241461399"/>
       <w:r>
         <w:rPr>
           <w:b/>
@@ -32292,7 +32292,7 @@
         <w:pStyle w:val="Heading1"/>
         <w:pageBreakBefore/>
       </w:pPr>
-      <w:bookmarkStart w:id="93" w:name="_Toc241179141"/>
+      <w:bookmarkStart w:id="93" w:name="_Toc241461346"/>
       <w:r>
         <w:lastRenderedPageBreak/>
         <w:t>9  Ethical and Legal Considerations</w:t>
@@ -32411,7 +32411,7 @@
         <w:pStyle w:val="Heading1"/>
         <w:pageBreakBefore/>
       </w:pPr>
-      <w:bookmarkStart w:id="94" w:name="_Toc241179142"/>
+      <w:bookmarkStart w:id="94" w:name="_Toc241461347"/>
       <w:r>
         <w:lastRenderedPageBreak/>
         <w:t>10  Project Status Against the Plan</w:t>
@@ -32422,7 +32422,7 @@
       <w:pPr>
         <w:pStyle w:val="TableCaption"/>
       </w:pPr>
-      <w:bookmarkStart w:id="95" w:name="_Toc241179195"/>
+      <w:bookmarkStart w:id="95" w:name="_Toc241461400"/>
       <w:r>
         <w:rPr>
           <w:b/>
@@ -33589,7 +33589,7 @@
       <w:pPr>
         <w:pStyle w:val="Heading2"/>
       </w:pPr>
-      <w:bookmarkStart w:id="96" w:name="_Toc241179143"/>
+      <w:bookmarkStart w:id="96" w:name="_Toc241461348"/>
       <w:r>
         <w:t>10.1  Remaining work, in priority order</w:t>
       </w:r>
@@ -33714,7 +33714,7 @@
         <w:pStyle w:val="Heading1"/>
         <w:pageBreakBefore/>
       </w:pPr>
-      <w:bookmarkStart w:id="97" w:name="_Toc241179144"/>
+      <w:bookmarkStart w:id="97" w:name="_Toc241461349"/>
       <w:r>
         <w:lastRenderedPageBreak/>
         <w:t>11  Limitations and Future Work</w:t>
@@ -33725,7 +33725,7 @@
       <w:pPr>
         <w:pStyle w:val="Heading2"/>
       </w:pPr>
-      <w:bookmarkStart w:id="98" w:name="_Toc241179145"/>
+      <w:bookmarkStart w:id="98" w:name="_Toc241461350"/>
       <w:r>
         <w:t>11.1  Limitations</w:t>
       </w:r>
@@ -33869,7 +33869,7 @@
       <w:pPr>
         <w:pStyle w:val="Heading2"/>
       </w:pPr>
-      <w:bookmarkStart w:id="99" w:name="_Toc241179146"/>
+      <w:bookmarkStart w:id="99" w:name="_Toc241461351"/>
       <w:r>
         <w:t>11.2  Future work</w:t>
       </w:r>
@@ -33952,7 +33952,7 @@
         <w:pStyle w:val="Heading1"/>
         <w:pageBreakBefore/>
       </w:pPr>
-      <w:bookmarkStart w:id="100" w:name="_Toc241179147"/>
+      <w:bookmarkStart w:id="100" w:name="_Toc241461352"/>
       <w:r>
         <w:lastRenderedPageBreak/>
         <w:t>12  Conclusion</w:t>
@@ -33991,7 +33991,7 @@
         <w:pStyle w:val="Heading1"/>
         <w:pageBreakBefore/>
       </w:pPr>
-      <w:bookmarkStart w:id="101" w:name="_Toc241179148"/>
+      <w:bookmarkStart w:id="101" w:name="_Toc241461353"/>
       <w:r>
         <w:lastRenderedPageBreak/>
         <w:t>References</w:t>
@@ -34462,7 +34462,7 @@
         <w:pStyle w:val="Heading1"/>
         <w:pageBreakBefore/>
       </w:pPr>
-      <w:bookmarkStart w:id="102" w:name="_Toc241179149"/>
+      <w:bookmarkStart w:id="102" w:name="_Toc241461354"/>
       <w:r>
         <w:lastRenderedPageBreak/>
         <w:t>Appendix A  Running the System</w:t>
@@ -34653,7 +34653,7 @@
         <w:pStyle w:val="Heading1"/>
         <w:pageBreakBefore/>
       </w:pPr>
-      <w:bookmarkStart w:id="103" w:name="_Toc241179150"/>
+      <w:bookmarkStart w:id="103" w:name="_Toc241461355"/>
       <w:r>
         <w:lastRenderedPageBreak/>
         <w:t>Appendix B  Configuration</w:t>
@@ -34708,7 +34708,7 @@
       <w:pPr>
         <w:pStyle w:val="TableCaption"/>
       </w:pPr>
-      <w:bookmarkStart w:id="104" w:name="_Toc241179196"/>
+      <w:bookmarkStart w:id="104" w:name="_Toc241461401"/>
       <w:r>
         <w:rPr>
           <w:b/>
@@ -35708,7 +35708,7 @@
         <w:pStyle w:val="Heading1"/>
         <w:pageBreakBefore/>
       </w:pPr>
-      <w:bookmarkStart w:id="105" w:name="_Toc241179151"/>
+      <w:bookmarkStart w:id="105" w:name="_Toc241461356"/>
       <w:r>
         <w:lastRenderedPageBreak/>
         <w:t>Appendix C  API Reference</w:t>
@@ -35719,7 +35719,7 @@
       <w:pPr>
         <w:pStyle w:val="TableCaption"/>
       </w:pPr>
-      <w:bookmarkStart w:id="106" w:name="_Toc241179197"/>
+      <w:bookmarkStart w:id="106" w:name="_Toc241461402"/>
       <w:r>
         <w:rPr>
           <w:b/>
@@ -37265,7 +37265,7 @@
         <w:pStyle w:val="Heading1"/>
         <w:pageBreakBefore/>
       </w:pPr>
-      <w:bookmarkStart w:id="107" w:name="_Toc241179152"/>
+      <w:bookmarkStart w:id="107" w:name="_Toc241461357"/>
       <w:r>
         <w:lastRenderedPageBreak/>
         <w:t>Appendix D  Repository Structure</w:t>
@@ -37276,7 +37276,7 @@
       <w:pPr>
         <w:pStyle w:val="TableCaption"/>
       </w:pPr>
-      <w:bookmarkStart w:id="108" w:name="_Toc241179198"/>
+      <w:bookmarkStart w:id="108" w:name="_Toc241461403"/>
       <w:r>
         <w:rPr>
           <w:b/>
@@ -38267,7 +38267,7 @@
         <w:t>Development tooling.</w:t>
       </w:r>
       <w:r>
-        <w:t xml:space="preserve"> Git and GitHub for version control; pytest; Playwright for the screenshots in this report; and Claude Code, an AI coding assistant, used during development (commits it helped write are marked as co-authored in the Git history).</w:t>
+        <w:t xml:space="preserve"> Git and GitHub for version control; pytest; Playwright for the screenshots in this report; and Claude Code, an AI coding assistant, used during development.</w:t>
       </w:r>
     </w:p>
     <w:sectPr>
@@ -38480,10 +38480,10 @@
 <file path=word/numbering.xml><?xml version="1.0" encoding="utf-8"?>
 <w:numbering xmlns:wpc="http://schemas.microsoft.com/office/word/2010/wordprocessingCanvas" xmlns:cx="http://schemas.microsoft.com/office/drawing/2014/chartex" xmlns:cx1="http://schemas.microsoft.com/office/drawing/2015/9/8/chartex" xmlns:cx2="http://schemas.microsoft.com/office/drawing/2015/10/21/chartex" xmlns:cx3="http://schemas.microsoft.com/office/drawing/2016/5/9/chartex" xmlns:cx4="http://schemas.microsoft.com/office/drawing/2016/5/10/chartex" xmlns:cx5="http://schemas.microsoft.com/office/drawing/2016/5/11/chartex" xmlns:cx6="http://schemas.microsoft.com/office/drawing/2016/5/12/chartex" xmlns:cx7="http://schemas.microsoft.com/office/drawing/2016/5/13/chartex" xmlns:cx8="http://schemas.microsoft.com/office/drawing/2016/5/14/chartex" xmlns:mc="http://schemas.openxmlformats.org/markup-compatibility/2006" xmlns:aink="http://schemas.microsoft.com/office/drawing/2016/ink" xmlns:am3d="http://schemas.microsoft.com/office/drawing/2017/model3d" xmlns:o="urn:schemas-microsoft-com:office:office" xmlns:oel="http://schemas.microsoft.com/office/2019/extlst" xmlns:r="http://schemas.openxmlformats.org/officeDocument/2006/relationships" xmlns:m="http://schemas.openxmlformats.org/officeDocument/2006/math" xmlns:v="urn:schemas-microsoft-com:vml" xmlns:wp14="http://schemas.microsoft.com/office/word/2010/wordprocessingDrawing" xmlns:wp="http://schemas.openxmlformats.org/drawingml/2006/wordprocessingDrawing" xmlns:w10="urn:schemas-microsoft-com:office:word" xmlns:w="http://schemas.openxmlformats.org/wordprocessingml/2006/main" xmlns:w14="http://schemas.microsoft.com/office/word/2010/wordml" xmlns:w15="http://schemas.microsoft.com/office/word/2012/wordml" xmlns:w16cex="http://schemas.microsoft.com/office/word/2018/wordml/cex" xmlns:w16cid="http://schemas.microsoft.com/office/word/2016/wordml/cid" xmlns:w16="http://schemas.microsoft.com/office/word/2018/wordml" xmlns:w16du="http://schemas.microsoft.com/office/word/2023/wordml/word16du" xmlns:w16sdtdh="http://schemas.microsoft.com/office/word/2020/wordml/sdtdatahash" xmlns:w16sdtfl="http://schemas.microsoft.com/office/word/2024/wordml/sdtformatlock" xmlns:w16se="http://schemas.microsoft.com/office/word/2015/wordml/symex" xmlns:wpg="http://schemas.microsoft.com/office/word/2010/wordprocessingGroup" xmlns:wpi="http://schemas.microsoft.com/office/word/2010/wordprocessingInk" xmlns:wne="http://schemas.microsoft.com/office/word/2006/wordml" xmlns:wps="http://schemas.microsoft.com/office/word/2010/wordprocessingShape" mc:Ignorable="w14 w15 w16se w16cid w16 w16cex w16sdtdh w16sdtfl w16du wp14">
   <w:abstractNum w:abstractNumId="0" w15:restartNumberingAfterBreak="0">
-    <w:nsid w:val="0BB2528E"/>
+    <w:nsid w:val="0DCC0E1B"/>
     <w:multiLevelType w:val="hybridMultilevel"/>
-    <w:tmpl w:val="99F61516"/>
-    <w:lvl w:ilvl="0" w:tplc="3A5A1766">
+    <w:tmpl w:val="AB1AAB9C"/>
+    <w:lvl w:ilvl="0" w:tplc="E9C84DA0">
       <w:start w:val="1"/>
       <w:numFmt w:val="decimal"/>
       <w:lvlText w:val="%1."/>
@@ -38492,52 +38492,160 @@
         <w:ind w:left="540" w:hanging="360"/>
       </w:pPr>
     </w:lvl>
-    <w:lvl w:ilvl="1" w:tplc="078AB3C4">
+    <w:lvl w:ilvl="1" w:tplc="8C9CC55A">
       <w:numFmt w:val="decimal"/>
       <w:lvlText w:val=""/>
       <w:lvlJc w:val="left"/>
     </w:lvl>
-    <w:lvl w:ilvl="2" w:tplc="1A1275B4">
+    <w:lvl w:ilvl="2" w:tplc="ACCC9900">
       <w:numFmt w:val="decimal"/>
       <w:lvlText w:val=""/>
       <w:lvlJc w:val="left"/>
     </w:lvl>
-    <w:lvl w:ilvl="3" w:tplc="DB2CD45E">
+    <w:lvl w:ilvl="3" w:tplc="1DD4C922">
       <w:numFmt w:val="decimal"/>
       <w:lvlText w:val=""/>
       <w:lvlJc w:val="left"/>
     </w:lvl>
-    <w:lvl w:ilvl="4" w:tplc="ABB27966">
+    <w:lvl w:ilvl="4" w:tplc="9FD8D086">
       <w:numFmt w:val="decimal"/>
       <w:lvlText w:val=""/>
       <w:lvlJc w:val="left"/>
     </w:lvl>
-    <w:lvl w:ilvl="5" w:tplc="CC1A8B68">
+    <w:lvl w:ilvl="5" w:tplc="43183B70">
       <w:numFmt w:val="decimal"/>
       <w:lvlText w:val=""/>
       <w:lvlJc w:val="left"/>
     </w:lvl>
-    <w:lvl w:ilvl="6" w:tplc="9388731A">
+    <w:lvl w:ilvl="6" w:tplc="9EA82D96">
       <w:numFmt w:val="decimal"/>
       <w:lvlText w:val=""/>
       <w:lvlJc w:val="left"/>
     </w:lvl>
-    <w:lvl w:ilvl="7" w:tplc="05CEF48E">
+    <w:lvl w:ilvl="7" w:tplc="567E7556">
       <w:numFmt w:val="decimal"/>
       <w:lvlText w:val=""/>
       <w:lvlJc w:val="left"/>
     </w:lvl>
-    <w:lvl w:ilvl="8" w:tplc="77627E82">
+    <w:lvl w:ilvl="8" w:tplc="084A6942">
       <w:numFmt w:val="decimal"/>
       <w:lvlText w:val=""/>
       <w:lvlJc w:val="left"/>
     </w:lvl>
   </w:abstractNum>
   <w:abstractNum w:abstractNumId="1" w15:restartNumberingAfterBreak="0">
-    <w:nsid w:val="0EE7605C"/>
+    <w:nsid w:val="180F258E"/>
     <w:multiLevelType w:val="hybridMultilevel"/>
-    <w:tmpl w:val="E12A9EF6"/>
-    <w:lvl w:ilvl="0" w:tplc="F32EED42">
+    <w:tmpl w:val="E174B6F6"/>
+    <w:lvl w:ilvl="0" w:tplc="9EF83B3E">
+      <w:start w:val="1"/>
+      <w:numFmt w:val="decimal"/>
+      <w:lvlText w:val="%1."/>
+      <w:lvlJc w:val="left"/>
+      <w:pPr>
+        <w:ind w:left="540" w:hanging="360"/>
+      </w:pPr>
+    </w:lvl>
+    <w:lvl w:ilvl="1" w:tplc="109217D8">
+      <w:numFmt w:val="decimal"/>
+      <w:lvlText w:val=""/>
+      <w:lvlJc w:val="left"/>
+    </w:lvl>
+    <w:lvl w:ilvl="2" w:tplc="28B891F4">
+      <w:numFmt w:val="decimal"/>
+      <w:lvlText w:val=""/>
+      <w:lvlJc w:val="left"/>
+    </w:lvl>
+    <w:lvl w:ilvl="3" w:tplc="C00C1046">
+      <w:numFmt w:val="decimal"/>
+      <w:lvlText w:val=""/>
+      <w:lvlJc w:val="left"/>
+    </w:lvl>
+    <w:lvl w:ilvl="4" w:tplc="9BC8CCB0">
+      <w:numFmt w:val="decimal"/>
+      <w:lvlText w:val=""/>
+      <w:lvlJc w:val="left"/>
+    </w:lvl>
+    <w:lvl w:ilvl="5" w:tplc="197021B0">
+      <w:numFmt w:val="decimal"/>
+      <w:lvlText w:val=""/>
+      <w:lvlJc w:val="left"/>
+    </w:lvl>
+    <w:lvl w:ilvl="6" w:tplc="B98E2B92">
+      <w:numFmt w:val="decimal"/>
+      <w:lvlText w:val=""/>
+      <w:lvlJc w:val="left"/>
+    </w:lvl>
+    <w:lvl w:ilvl="7" w:tplc="C84A4202">
+      <w:numFmt w:val="decimal"/>
+      <w:lvlText w:val=""/>
+      <w:lvlJc w:val="left"/>
+    </w:lvl>
+    <w:lvl w:ilvl="8" w:tplc="AE28A742">
+      <w:numFmt w:val="decimal"/>
+      <w:lvlText w:val=""/>
+      <w:lvlJc w:val="left"/>
+    </w:lvl>
+  </w:abstractNum>
+  <w:abstractNum w:abstractNumId="2" w15:restartNumberingAfterBreak="0">
+    <w:nsid w:val="1D5D2C5A"/>
+    <w:multiLevelType w:val="hybridMultilevel"/>
+    <w:tmpl w:val="61660614"/>
+    <w:lvl w:ilvl="0" w:tplc="898A006A">
+      <w:start w:val="1"/>
+      <w:numFmt w:val="decimal"/>
+      <w:lvlText w:val="%1."/>
+      <w:lvlJc w:val="left"/>
+      <w:pPr>
+        <w:ind w:left="540" w:hanging="360"/>
+      </w:pPr>
+    </w:lvl>
+    <w:lvl w:ilvl="1" w:tplc="5706D742">
+      <w:numFmt w:val="decimal"/>
+      <w:lvlText w:val=""/>
+      <w:lvlJc w:val="left"/>
+    </w:lvl>
+    <w:lvl w:ilvl="2" w:tplc="B4F25E08">
+      <w:numFmt w:val="decimal"/>
+      <w:lvlText w:val=""/>
+      <w:lvlJc w:val="left"/>
+    </w:lvl>
+    <w:lvl w:ilvl="3" w:tplc="D19833A2">
+      <w:numFmt w:val="decimal"/>
+      <w:lvlText w:val=""/>
+      <w:lvlJc w:val="left"/>
+    </w:lvl>
+    <w:lvl w:ilvl="4" w:tplc="4B56A65C">
+      <w:numFmt w:val="decimal"/>
+      <w:lvlText w:val=""/>
+      <w:lvlJc w:val="left"/>
+    </w:lvl>
+    <w:lvl w:ilvl="5" w:tplc="8BF0F2D4">
+      <w:numFmt w:val="decimal"/>
+      <w:lvlText w:val=""/>
+      <w:lvlJc w:val="left"/>
+    </w:lvl>
+    <w:lvl w:ilvl="6" w:tplc="3F366FF6">
+      <w:numFmt w:val="decimal"/>
+      <w:lvlText w:val=""/>
+      <w:lvlJc w:val="left"/>
+    </w:lvl>
+    <w:lvl w:ilvl="7" w:tplc="AA8664FC">
+      <w:numFmt w:val="decimal"/>
+      <w:lvlText w:val=""/>
+      <w:lvlJc w:val="left"/>
+    </w:lvl>
+    <w:lvl w:ilvl="8" w:tplc="A2AE6D2E">
+      <w:numFmt w:val="decimal"/>
+      <w:lvlText w:val=""/>
+      <w:lvlJc w:val="left"/>
+    </w:lvl>
+  </w:abstractNum>
+  <w:abstractNum w:abstractNumId="3" w15:restartNumberingAfterBreak="0">
+    <w:nsid w:val="22B10F14"/>
+    <w:multiLevelType w:val="hybridMultilevel"/>
+    <w:tmpl w:val="99980C4A"/>
+    <w:lvl w:ilvl="0" w:tplc="CD2ED1EC">
       <w:start w:val="1"/>
       <w:numFmt w:val="bullet"/>
       <w:lvlText w:val="●"/>
@@ -38546,7 +38654,7 @@
         <w:ind w:left="720" w:hanging="360"/>
       </w:pPr>
     </w:lvl>
-    <w:lvl w:ilvl="1" w:tplc="8EBE8916">
+    <w:lvl w:ilvl="1" w:tplc="F81261E6">
       <w:start w:val="1"/>
       <w:numFmt w:val="bullet"/>
       <w:lvlText w:val="○"/>
@@ -38555,7 +38663,7 @@
         <w:ind w:left="1440" w:hanging="360"/>
       </w:pPr>
     </w:lvl>
-    <w:lvl w:ilvl="2" w:tplc="B8B81D7E">
+    <w:lvl w:ilvl="2" w:tplc="306C18B2">
       <w:start w:val="1"/>
       <w:numFmt w:val="bullet"/>
       <w:lvlText w:val="■"/>
@@ -38564,7 +38672,7 @@
         <w:ind w:left="2160" w:hanging="360"/>
       </w:pPr>
     </w:lvl>
-    <w:lvl w:ilvl="3" w:tplc="CBD8CCB0">
+    <w:lvl w:ilvl="3" w:tplc="AAD2EAC0">
       <w:start w:val="1"/>
       <w:numFmt w:val="bullet"/>
       <w:lvlText w:val="●"/>
@@ -38573,7 +38681,7 @@
         <w:ind w:left="2880" w:hanging="360"/>
       </w:pPr>
     </w:lvl>
-    <w:lvl w:ilvl="4" w:tplc="14EC13E8">
+    <w:lvl w:ilvl="4" w:tplc="45F42A62">
       <w:start w:val="1"/>
       <w:numFmt w:val="bullet"/>
       <w:lvlText w:val="○"/>
@@ -38582,7 +38690,7 @@
         <w:ind w:left="3600" w:hanging="360"/>
       </w:pPr>
     </w:lvl>
-    <w:lvl w:ilvl="5" w:tplc="04F6CB50">
+    <w:lvl w:ilvl="5" w:tplc="3E34C2B0">
       <w:start w:val="1"/>
       <w:numFmt w:val="bullet"/>
       <w:lvlText w:val="■"/>
@@ -38591,7 +38699,7 @@
         <w:ind w:left="4320" w:hanging="360"/>
       </w:pPr>
     </w:lvl>
-    <w:lvl w:ilvl="6" w:tplc="7AA21BA2">
+    <w:lvl w:ilvl="6" w:tplc="721C24DA">
       <w:start w:val="1"/>
       <w:numFmt w:val="bullet"/>
       <w:lvlText w:val="●"/>
@@ -38600,7 +38708,7 @@
         <w:ind w:left="5040" w:hanging="360"/>
       </w:pPr>
     </w:lvl>
-    <w:lvl w:ilvl="7" w:tplc="9244AB44">
+    <w:lvl w:ilvl="7" w:tplc="3F04FA32">
       <w:start w:val="1"/>
       <w:numFmt w:val="bullet"/>
       <w:lvlText w:val="●"/>
@@ -38609,7 +38717,7 @@
         <w:ind w:left="5760" w:hanging="360"/>
       </w:pPr>
     </w:lvl>
-    <w:lvl w:ilvl="8" w:tplc="C63A54F4">
+    <w:lvl w:ilvl="8" w:tplc="16D41E3A">
       <w:start w:val="1"/>
       <w:numFmt w:val="bullet"/>
       <w:lvlText w:val="●"/>
@@ -38619,11 +38727,11 @@
       </w:pPr>
     </w:lvl>
   </w:abstractNum>
-  <w:abstractNum w:abstractNumId="2" w15:restartNumberingAfterBreak="0">
-    <w:nsid w:val="1E415CBC"/>
+  <w:abstractNum w:abstractNumId="4" w15:restartNumberingAfterBreak="0">
+    <w:nsid w:val="4BA30449"/>
     <w:multiLevelType w:val="hybridMultilevel"/>
-    <w:tmpl w:val="A1C6C46E"/>
-    <w:lvl w:ilvl="0" w:tplc="6ACC6B7A">
+    <w:tmpl w:val="48901DA2"/>
+    <w:lvl w:ilvl="0" w:tplc="181C29BC">
       <w:start w:val="1"/>
       <w:numFmt w:val="decimal"/>
       <w:lvlText w:val="%1."/>
@@ -38632,52 +38740,52 @@
         <w:ind w:left="540" w:hanging="360"/>
       </w:pPr>
     </w:lvl>
-    <w:lvl w:ilvl="1" w:tplc="C360D244">
+    <w:lvl w:ilvl="1" w:tplc="68EA3992">
       <w:numFmt w:val="decimal"/>
       <w:lvlText w:val=""/>
       <w:lvlJc w:val="left"/>
     </w:lvl>
-    <w:lvl w:ilvl="2" w:tplc="006EB7C8">
+    <w:lvl w:ilvl="2" w:tplc="236C41EA">
       <w:numFmt w:val="decimal"/>
       <w:lvlText w:val=""/>
       <w:lvlJc w:val="left"/>
     </w:lvl>
-    <w:lvl w:ilvl="3" w:tplc="E46E01EA">
+    <w:lvl w:ilvl="3" w:tplc="19A417EC">
       <w:numFmt w:val="decimal"/>
       <w:lvlText w:val=""/>
       <w:lvlJc w:val="left"/>
     </w:lvl>
-    <w:lvl w:ilvl="4" w:tplc="A6A6A5C8">
+    <w:lvl w:ilvl="4" w:tplc="06403C0E">
       <w:numFmt w:val="decimal"/>
       <w:lvlText w:val=""/>
       <w:lvlJc w:val="left"/>
     </w:lvl>
-    <w:lvl w:ilvl="5" w:tplc="7B54CF88">
+    <w:lvl w:ilvl="5" w:tplc="492A40B0">
       <w:numFmt w:val="decimal"/>
       <w:lvlText w:val=""/>
       <w:lvlJc w:val="left"/>
     </w:lvl>
-    <w:lvl w:ilvl="6" w:tplc="1414B622">
+    <w:lvl w:ilvl="6" w:tplc="1BB44C54">
       <w:numFmt w:val="decimal"/>
       <w:lvlText w:val=""/>
       <w:lvlJc w:val="left"/>
     </w:lvl>
-    <w:lvl w:ilvl="7" w:tplc="B34258F6">
+    <w:lvl w:ilvl="7" w:tplc="B824AB60">
       <w:numFmt w:val="decimal"/>
       <w:lvlText w:val=""/>
       <w:lvlJc w:val="left"/>
     </w:lvl>
-    <w:lvl w:ilvl="8" w:tplc="47B41E0A">
+    <w:lvl w:ilvl="8" w:tplc="09DC9482">
       <w:numFmt w:val="decimal"/>
       <w:lvlText w:val=""/>
       <w:lvlJc w:val="left"/>
     </w:lvl>
   </w:abstractNum>
-  <w:abstractNum w:abstractNumId="3" w15:restartNumberingAfterBreak="0">
-    <w:nsid w:val="26036E16"/>
+  <w:abstractNum w:abstractNumId="5" w15:restartNumberingAfterBreak="0">
+    <w:nsid w:val="61497D0C"/>
     <w:multiLevelType w:val="hybridMultilevel"/>
-    <w:tmpl w:val="2D9299C0"/>
-    <w:lvl w:ilvl="0" w:tplc="FB684C90">
+    <w:tmpl w:val="F0D6EE1C"/>
+    <w:lvl w:ilvl="0" w:tplc="5F68A296">
       <w:start w:val="1"/>
       <w:numFmt w:val="decimal"/>
       <w:lvlText w:val="%1."/>
@@ -38686,52 +38794,52 @@
         <w:ind w:left="540" w:hanging="360"/>
       </w:pPr>
     </w:lvl>
-    <w:lvl w:ilvl="1" w:tplc="B6FC52B0">
+    <w:lvl w:ilvl="1" w:tplc="C4662620">
       <w:numFmt w:val="decimal"/>
       <w:lvlText w:val=""/>
       <w:lvlJc w:val="left"/>
     </w:lvl>
-    <w:lvl w:ilvl="2" w:tplc="A0DCA8C6">
+    <w:lvl w:ilvl="2" w:tplc="F704E90E">
       <w:numFmt w:val="decimal"/>
       <w:lvlText w:val=""/>
       <w:lvlJc w:val="left"/>
     </w:lvl>
-    <w:lvl w:ilvl="3" w:tplc="5C326D98">
+    <w:lvl w:ilvl="3" w:tplc="5A56FF30">
       <w:numFmt w:val="decimal"/>
       <w:lvlText w:val=""/>
       <w:lvlJc w:val="left"/>
     </w:lvl>
-    <w:lvl w:ilvl="4" w:tplc="EED29EC6">
+    <w:lvl w:ilvl="4" w:tplc="82103370">
       <w:numFmt w:val="decimal"/>
       <w:lvlText w:val=""/>
       <w:lvlJc w:val="left"/>
     </w:lvl>
-    <w:lvl w:ilvl="5" w:tplc="843C8176">
+    <w:lvl w:ilvl="5" w:tplc="DCA4170A">
       <w:numFmt w:val="decimal"/>
       <w:lvlText w:val=""/>
       <w:lvlJc w:val="left"/>
     </w:lvl>
-    <w:lvl w:ilvl="6" w:tplc="EE503D38">
+    <w:lvl w:ilvl="6" w:tplc="433227FC">
       <w:numFmt w:val="decimal"/>
       <w:lvlText w:val=""/>
       <w:lvlJc w:val="left"/>
     </w:lvl>
-    <w:lvl w:ilvl="7" w:tplc="FF7E44F2">
+    <w:lvl w:ilvl="7" w:tplc="4C023930">
       <w:numFmt w:val="decimal"/>
       <w:lvlText w:val=""/>
       <w:lvlJc w:val="left"/>
     </w:lvl>
-    <w:lvl w:ilvl="8" w:tplc="54E672BE">
+    <w:lvl w:ilvl="8" w:tplc="65D62566">
       <w:numFmt w:val="decimal"/>
       <w:lvlText w:val=""/>
       <w:lvlJc w:val="left"/>
     </w:lvl>
   </w:abstractNum>
-  <w:abstractNum w:abstractNumId="4" w15:restartNumberingAfterBreak="0">
-    <w:nsid w:val="326342FB"/>
+  <w:abstractNum w:abstractNumId="6" w15:restartNumberingAfterBreak="0">
+    <w:nsid w:val="616407AD"/>
     <w:multiLevelType w:val="hybridMultilevel"/>
-    <w:tmpl w:val="B5B8F392"/>
-    <w:lvl w:ilvl="0" w:tplc="E530EE50">
+    <w:tmpl w:val="59FA51FA"/>
+    <w:lvl w:ilvl="0" w:tplc="37C86686">
       <w:start w:val="1"/>
       <w:numFmt w:val="decimal"/>
       <w:lvlText w:val="%1."/>
@@ -38740,52 +38848,106 @@
         <w:ind w:left="540" w:hanging="360"/>
       </w:pPr>
     </w:lvl>
-    <w:lvl w:ilvl="1" w:tplc="2FB6ACAA">
+    <w:lvl w:ilvl="1" w:tplc="91AE62F6">
       <w:numFmt w:val="decimal"/>
       <w:lvlText w:val=""/>
       <w:lvlJc w:val="left"/>
     </w:lvl>
-    <w:lvl w:ilvl="2" w:tplc="6DC82F98">
+    <w:lvl w:ilvl="2" w:tplc="E69A4DDC">
       <w:numFmt w:val="decimal"/>
       <w:lvlText w:val=""/>
       <w:lvlJc w:val="left"/>
     </w:lvl>
-    <w:lvl w:ilvl="3" w:tplc="331C3282">
+    <w:lvl w:ilvl="3" w:tplc="4E0EF99A">
       <w:numFmt w:val="decimal"/>
       <w:lvlText w:val=""/>
       <w:lvlJc w:val="left"/>
     </w:lvl>
-    <w:lvl w:ilvl="4" w:tplc="311C7026">
+    <w:lvl w:ilvl="4" w:tplc="169A65E0">
       <w:numFmt w:val="decimal"/>
       <w:lvlText w:val=""/>
       <w:lvlJc w:val="left"/>
     </w:lvl>
-    <w:lvl w:ilvl="5" w:tplc="BD18E52C">
+    <w:lvl w:ilvl="5" w:tplc="C2523B38">
       <w:numFmt w:val="decimal"/>
       <w:lvlText w:val=""/>
       <w:lvlJc w:val="left"/>
     </w:lvl>
-    <w:lvl w:ilvl="6" w:tplc="886AE1D0">
+    <w:lvl w:ilvl="6" w:tplc="28F0E5BC">
       <w:numFmt w:val="decimal"/>
       <w:lvlText w:val=""/>
       <w:lvlJc w:val="left"/>
     </w:lvl>
-    <w:lvl w:ilvl="7" w:tplc="6BD8C392">
+    <w:lvl w:ilvl="7" w:tplc="EC749E14">
       <w:numFmt w:val="decimal"/>
       <w:lvlText w:val=""/>
       <w:lvlJc w:val="left"/>
     </w:lvl>
-    <w:lvl w:ilvl="8" w:tplc="54408134">
+    <w:lvl w:ilvl="8" w:tplc="F7E6C0DC">
       <w:numFmt w:val="decimal"/>
       <w:lvlText w:val=""/>
       <w:lvlJc w:val="left"/>
     </w:lvl>
   </w:abstractNum>
-  <w:abstractNum w:abstractNumId="5" w15:restartNumberingAfterBreak="0">
-    <w:nsid w:val="3ABD29DA"/>
+  <w:abstractNum w:abstractNumId="7" w15:restartNumberingAfterBreak="0">
+    <w:nsid w:val="6298213B"/>
     <w:multiLevelType w:val="hybridMultilevel"/>
-    <w:tmpl w:val="895AC8D2"/>
-    <w:lvl w:ilvl="0" w:tplc="BAEEE028">
+    <w:tmpl w:val="23BC289C"/>
+    <w:lvl w:ilvl="0" w:tplc="2CF411D4">
+      <w:start w:val="1"/>
+      <w:numFmt w:val="bullet"/>
+      <w:lvlText w:val="•"/>
+      <w:lvlJc w:val="left"/>
+      <w:pPr>
+        <w:ind w:left="540" w:hanging="300"/>
+      </w:pPr>
+    </w:lvl>
+    <w:lvl w:ilvl="1" w:tplc="76EC9F0E">
+      <w:numFmt w:val="decimal"/>
+      <w:lvlText w:val=""/>
+      <w:lvlJc w:val="left"/>
+    </w:lvl>
+    <w:lvl w:ilvl="2" w:tplc="6704A578">
+      <w:numFmt w:val="decimal"/>
+      <w:lvlText w:val=""/>
+      <w:lvlJc w:val="left"/>
+    </w:lvl>
+    <w:lvl w:ilvl="3" w:tplc="5A5CE0AE">
+      <w:numFmt w:val="decimal"/>
+      <w:lvlText w:val=""/>
+      <w:lvlJc w:val="left"/>
+    </w:lvl>
+    <w:lvl w:ilvl="4" w:tplc="F2FC37DE">
+      <w:numFmt w:val="decimal"/>
+      <w:lvlText w:val=""/>
+      <w:lvlJc w:val="left"/>
+    </w:lvl>
+    <w:lvl w:ilvl="5" w:tplc="98D6FA24">
+      <w:numFmt w:val="decimal"/>
+      <w:lvlText w:val=""/>
+      <w:lvlJc w:val="left"/>
+    </w:lvl>
+    <w:lvl w:ilvl="6" w:tplc="0038D018">
+      <w:numFmt w:val="decimal"/>
+      <w:lvlText w:val=""/>
+      <w:lvlJc w:val="left"/>
+    </w:lvl>
+    <w:lvl w:ilvl="7" w:tplc="E11C73AE">
+      <w:numFmt w:val="decimal"/>
+      <w:lvlText w:val=""/>
+      <w:lvlJc w:val="left"/>
+    </w:lvl>
+    <w:lvl w:ilvl="8" w:tplc="520276BC">
+      <w:numFmt w:val="decimal"/>
+      <w:lvlText w:val=""/>
+      <w:lvlJc w:val="left"/>
+    </w:lvl>
+  </w:abstractNum>
+  <w:abstractNum w:abstractNumId="8" w15:restartNumberingAfterBreak="0">
+    <w:nsid w:val="633F46C0"/>
+    <w:multiLevelType w:val="hybridMultilevel"/>
+    <w:tmpl w:val="F63295EA"/>
+    <w:lvl w:ilvl="0" w:tplc="D0C6EF98">
       <w:start w:val="1"/>
       <w:numFmt w:val="decimal"/>
       <w:lvlText w:val="%1."/>
@@ -38794,52 +38956,52 @@
         <w:ind w:left="540" w:hanging="360"/>
       </w:pPr>
     </w:lvl>
-    <w:lvl w:ilvl="1" w:tplc="1FC63F8A">
+    <w:lvl w:ilvl="1" w:tplc="4D48579E">
       <w:numFmt w:val="decimal"/>
       <w:lvlText w:val=""/>
       <w:lvlJc w:val="left"/>
     </w:lvl>
-    <w:lvl w:ilvl="2" w:tplc="DD7ED88C">
+    <w:lvl w:ilvl="2" w:tplc="C70499E8">
       <w:numFmt w:val="decimal"/>
       <w:lvlText w:val=""/>
       <w:lvlJc w:val="left"/>
     </w:lvl>
-    <w:lvl w:ilvl="3" w:tplc="F0B048B6">
+    <w:lvl w:ilvl="3" w:tplc="D7102DE0">
       <w:numFmt w:val="decimal"/>
       <w:lvlText w:val=""/>
       <w:lvlJc w:val="left"/>
     </w:lvl>
-    <w:lvl w:ilvl="4" w:tplc="BC0A7AE8">
+    <w:lvl w:ilvl="4" w:tplc="4B08DBCC">
       <w:numFmt w:val="decimal"/>
       <w:lvlText w:val=""/>
       <w:lvlJc w:val="left"/>
     </w:lvl>
-    <w:lvl w:ilvl="5" w:tplc="B234E54A">
+    <w:lvl w:ilvl="5" w:tplc="B35E8FFC">
       <w:numFmt w:val="decimal"/>
       <w:lvlText w:val=""/>
       <w:lvlJc w:val="left"/>
     </w:lvl>
-    <w:lvl w:ilvl="6" w:tplc="D68A1E6A">
+    <w:lvl w:ilvl="6" w:tplc="58843354">
       <w:numFmt w:val="decimal"/>
       <w:lvlText w:val=""/>
       <w:lvlJc w:val="left"/>
     </w:lvl>
-    <w:lvl w:ilvl="7" w:tplc="0B18FEA8">
+    <w:lvl w:ilvl="7" w:tplc="7D34B290">
       <w:numFmt w:val="decimal"/>
       <w:lvlText w:val=""/>
       <w:lvlJc w:val="left"/>
     </w:lvl>
-    <w:lvl w:ilvl="8" w:tplc="38E03712">
+    <w:lvl w:ilvl="8" w:tplc="DE72614C">
       <w:numFmt w:val="decimal"/>
       <w:lvlText w:val=""/>
       <w:lvlJc w:val="left"/>
     </w:lvl>
   </w:abstractNum>
-  <w:abstractNum w:abstractNumId="6" w15:restartNumberingAfterBreak="0">
-    <w:nsid w:val="460437D4"/>
+  <w:abstractNum w:abstractNumId="9" w15:restartNumberingAfterBreak="0">
+    <w:nsid w:val="64E62059"/>
     <w:multiLevelType w:val="hybridMultilevel"/>
-    <w:tmpl w:val="1C5686F4"/>
-    <w:lvl w:ilvl="0" w:tplc="C49C36C0">
+    <w:tmpl w:val="375C3CA2"/>
+    <w:lvl w:ilvl="0" w:tplc="8E26BBF4">
       <w:start w:val="1"/>
       <w:numFmt w:val="decimal"/>
       <w:lvlText w:val="%1."/>
@@ -38848,52 +39010,52 @@
         <w:ind w:left="540" w:hanging="360"/>
       </w:pPr>
     </w:lvl>
-    <w:lvl w:ilvl="1" w:tplc="BD0AB25A">
+    <w:lvl w:ilvl="1" w:tplc="1B829AB2">
       <w:numFmt w:val="decimal"/>
       <w:lvlText w:val=""/>
       <w:lvlJc w:val="left"/>
     </w:lvl>
-    <w:lvl w:ilvl="2" w:tplc="9454E012">
+    <w:lvl w:ilvl="2" w:tplc="312E2EC0">
       <w:numFmt w:val="decimal"/>
       <w:lvlText w:val=""/>
       <w:lvlJc w:val="left"/>
     </w:lvl>
-    <w:lvl w:ilvl="3" w:tplc="9B2A275C">
+    <w:lvl w:ilvl="3" w:tplc="FC24894E">
       <w:numFmt w:val="decimal"/>
       <w:lvlText w:val=""/>
       <w:lvlJc w:val="left"/>
     </w:lvl>
-    <w:lvl w:ilvl="4" w:tplc="44C6D65A">
+    <w:lvl w:ilvl="4" w:tplc="181090CC">
       <w:numFmt w:val="decimal"/>
       <w:lvlText w:val=""/>
       <w:lvlJc w:val="left"/>
     </w:lvl>
-    <w:lvl w:ilvl="5" w:tplc="B96AA2BE">
+    <w:lvl w:ilvl="5" w:tplc="65420A3A">
       <w:numFmt w:val="decimal"/>
       <w:lvlText w:val=""/>
       <w:lvlJc w:val="left"/>
     </w:lvl>
-    <w:lvl w:ilvl="6" w:tplc="F8104938">
+    <w:lvl w:ilvl="6" w:tplc="96B41DC0">
       <w:numFmt w:val="decimal"/>
       <w:lvlText w:val=""/>
       <w:lvlJc w:val="left"/>
     </w:lvl>
-    <w:lvl w:ilvl="7" w:tplc="58A63AE2">
+    <w:lvl w:ilvl="7" w:tplc="9168A91C">
       <w:numFmt w:val="decimal"/>
       <w:lvlText w:val=""/>
       <w:lvlJc w:val="left"/>
     </w:lvl>
-    <w:lvl w:ilvl="8" w:tplc="7C78AD60">
+    <w:lvl w:ilvl="8" w:tplc="21ECDEA8">
       <w:numFmt w:val="decimal"/>
       <w:lvlText w:val=""/>
       <w:lvlJc w:val="left"/>
     </w:lvl>
   </w:abstractNum>
-  <w:abstractNum w:abstractNumId="7" w15:restartNumberingAfterBreak="0">
-    <w:nsid w:val="46AD0D22"/>
+  <w:abstractNum w:abstractNumId="10" w15:restartNumberingAfterBreak="0">
+    <w:nsid w:val="65DC6F52"/>
     <w:multiLevelType w:val="hybridMultilevel"/>
-    <w:tmpl w:val="E9ECB614"/>
-    <w:lvl w:ilvl="0" w:tplc="979E0CE0">
+    <w:tmpl w:val="E4E26D04"/>
+    <w:lvl w:ilvl="0" w:tplc="8E6E7560">
       <w:start w:val="1"/>
       <w:numFmt w:val="decimal"/>
       <w:lvlText w:val="%1."/>
@@ -38902,52 +39064,52 @@
         <w:ind w:left="540" w:hanging="360"/>
       </w:pPr>
     </w:lvl>
-    <w:lvl w:ilvl="1" w:tplc="27AC4AC0">
+    <w:lvl w:ilvl="1" w:tplc="776E1C12">
       <w:numFmt w:val="decimal"/>
       <w:lvlText w:val=""/>
       <w:lvlJc w:val="left"/>
     </w:lvl>
-    <w:lvl w:ilvl="2" w:tplc="3ADA284C">
+    <w:lvl w:ilvl="2" w:tplc="23F010C6">
       <w:numFmt w:val="decimal"/>
       <w:lvlText w:val=""/>
       <w:lvlJc w:val="left"/>
     </w:lvl>
-    <w:lvl w:ilvl="3" w:tplc="2EEED306">
+    <w:lvl w:ilvl="3" w:tplc="F440F24A">
       <w:numFmt w:val="decimal"/>
       <w:lvlText w:val=""/>
       <w:lvlJc w:val="left"/>
     </w:lvl>
-    <w:lvl w:ilvl="4" w:tplc="3F74B23A">
+    <w:lvl w:ilvl="4" w:tplc="B78E46E4">
       <w:numFmt w:val="decimal"/>
       <w:lvlText w:val=""/>
       <w:lvlJc w:val="left"/>
     </w:lvl>
-    <w:lvl w:ilvl="5" w:tplc="D6B21CF4">
+    <w:lvl w:ilvl="5" w:tplc="271259FC">
       <w:numFmt w:val="decimal"/>
       <w:lvlText w:val=""/>
       <w:lvlJc w:val="left"/>
     </w:lvl>
-    <w:lvl w:ilvl="6" w:tplc="1442760A">
+    <w:lvl w:ilvl="6" w:tplc="732E3C46">
       <w:numFmt w:val="decimal"/>
       <w:lvlText w:val=""/>
       <w:lvlJc w:val="left"/>
     </w:lvl>
-    <w:lvl w:ilvl="7" w:tplc="BE381F5E">
+    <w:lvl w:ilvl="7" w:tplc="B5226464">
       <w:numFmt w:val="decimal"/>
       <w:lvlText w:val=""/>
       <w:lvlJc w:val="left"/>
     </w:lvl>
-    <w:lvl w:ilvl="8" w:tplc="B9104614">
+    <w:lvl w:ilvl="8" w:tplc="E81ABB58">
       <w:numFmt w:val="decimal"/>
       <w:lvlText w:val=""/>
       <w:lvlJc w:val="left"/>
     </w:lvl>
   </w:abstractNum>
-  <w:abstractNum w:abstractNumId="8" w15:restartNumberingAfterBreak="0">
-    <w:nsid w:val="4C9E0799"/>
+  <w:abstractNum w:abstractNumId="11" w15:restartNumberingAfterBreak="0">
+    <w:nsid w:val="6765524D"/>
     <w:multiLevelType w:val="hybridMultilevel"/>
-    <w:tmpl w:val="4B8C8FDC"/>
-    <w:lvl w:ilvl="0" w:tplc="50D0CBB6">
+    <w:tmpl w:val="5B7AC15C"/>
+    <w:lvl w:ilvl="0" w:tplc="6686A7E4">
       <w:start w:val="1"/>
       <w:numFmt w:val="decimal"/>
       <w:lvlText w:val="%1."/>
@@ -38956,52 +39118,52 @@
         <w:ind w:left="540" w:hanging="360"/>
       </w:pPr>
     </w:lvl>
-    <w:lvl w:ilvl="1" w:tplc="BB9E47AC">
+    <w:lvl w:ilvl="1" w:tplc="7200F768">
       <w:numFmt w:val="decimal"/>
       <w:lvlText w:val=""/>
       <w:lvlJc w:val="left"/>
     </w:lvl>
-    <w:lvl w:ilvl="2" w:tplc="13D66BD0">
+    <w:lvl w:ilvl="2" w:tplc="F1E6974E">
       <w:numFmt w:val="decimal"/>
       <w:lvlText w:val=""/>
       <w:lvlJc w:val="left"/>
     </w:lvl>
-    <w:lvl w:ilvl="3" w:tplc="8F72A21A">
+    <w:lvl w:ilvl="3" w:tplc="323CAA66">
       <w:numFmt w:val="decimal"/>
       <w:lvlText w:val=""/>
       <w:lvlJc w:val="left"/>
     </w:lvl>
-    <w:lvl w:ilvl="4" w:tplc="2A28C692">
+    <w:lvl w:ilvl="4" w:tplc="8BB0443A">
       <w:numFmt w:val="decimal"/>
       <w:lvlText w:val=""/>
       <w:lvlJc w:val="left"/>
     </w:lvl>
-    <w:lvl w:ilvl="5" w:tplc="4EF22B92">
+    <w:lvl w:ilvl="5" w:tplc="B2A4E2C4">
       <w:numFmt w:val="decimal"/>
       <w:lvlText w:val=""/>
       <w:lvlJc w:val="left"/>
     </w:lvl>
-    <w:lvl w:ilvl="6" w:tplc="F5766292">
+    <w:lvl w:ilvl="6" w:tplc="338E44C6">
       <w:numFmt w:val="decimal"/>
       <w:lvlText w:val=""/>
       <w:lvlJc w:val="left"/>
     </w:lvl>
-    <w:lvl w:ilvl="7" w:tplc="06E4D4BE">
+    <w:lvl w:ilvl="7" w:tplc="D14E5512">
       <w:numFmt w:val="decimal"/>
       <w:lvlText w:val=""/>
       <w:lvlJc w:val="left"/>
     </w:lvl>
-    <w:lvl w:ilvl="8" w:tplc="278EFEF2">
+    <w:lvl w:ilvl="8" w:tplc="1226C1CC">
       <w:numFmt w:val="decimal"/>
       <w:lvlText w:val=""/>
       <w:lvlJc w:val="left"/>
     </w:lvl>
   </w:abstractNum>
-  <w:abstractNum w:abstractNumId="9" w15:restartNumberingAfterBreak="0">
-    <w:nsid w:val="5AF95CC6"/>
+  <w:abstractNum w:abstractNumId="12" w15:restartNumberingAfterBreak="0">
+    <w:nsid w:val="705950FF"/>
     <w:multiLevelType w:val="hybridMultilevel"/>
-    <w:tmpl w:val="B29C873A"/>
-    <w:lvl w:ilvl="0" w:tplc="4B625136">
+    <w:tmpl w:val="00A2B2EA"/>
+    <w:lvl w:ilvl="0" w:tplc="5A2E13BE">
       <w:start w:val="1"/>
       <w:numFmt w:val="decimal"/>
       <w:lvlText w:val="%1."/>
@@ -39010,52 +39172,52 @@
         <w:ind w:left="540" w:hanging="360"/>
       </w:pPr>
     </w:lvl>
-    <w:lvl w:ilvl="1" w:tplc="0ECE4F72">
+    <w:lvl w:ilvl="1" w:tplc="B5C279F2">
       <w:numFmt w:val="decimal"/>
       <w:lvlText w:val=""/>
       <w:lvlJc w:val="left"/>
     </w:lvl>
-    <w:lvl w:ilvl="2" w:tplc="60A0763A">
+    <w:lvl w:ilvl="2" w:tplc="97AC3DD0">
       <w:numFmt w:val="decimal"/>
       <w:lvlText w:val=""/>
       <w:lvlJc w:val="left"/>
     </w:lvl>
-    <w:lvl w:ilvl="3" w:tplc="301E6724">
+    <w:lvl w:ilvl="3" w:tplc="D61CA43A">
       <w:numFmt w:val="decimal"/>
       <w:lvlText w:val=""/>
       <w:lvlJc w:val="left"/>
     </w:lvl>
-    <w:lvl w:ilvl="4" w:tplc="47644022">
+    <w:lvl w:ilvl="4" w:tplc="E22C2F0A">
       <w:numFmt w:val="decimal"/>
       <w:lvlText w:val=""/>
       <w:lvlJc w:val="left"/>
     </w:lvl>
-    <w:lvl w:ilvl="5" w:tplc="CFFEE034">
+    <w:lvl w:ilvl="5" w:tplc="EEA86A92">
       <w:numFmt w:val="decimal"/>
       <w:lvlText w:val=""/>
       <w:lvlJc w:val="left"/>
     </w:lvl>
-    <w:lvl w:ilvl="6" w:tplc="C4B6156C">
+    <w:lvl w:ilvl="6" w:tplc="DB1A00EA">
       <w:numFmt w:val="decimal"/>
       <w:lvlText w:val=""/>
       <w:lvlJc w:val="left"/>
     </w:lvl>
-    <w:lvl w:ilvl="7" w:tplc="482056F4">
+    <w:lvl w:ilvl="7" w:tplc="4E20B3F6">
       <w:numFmt w:val="decimal"/>
       <w:lvlText w:val=""/>
       <w:lvlJc w:val="left"/>
     </w:lvl>
-    <w:lvl w:ilvl="8" w:tplc="33D6F676">
+    <w:lvl w:ilvl="8" w:tplc="6E68FEC6">
       <w:numFmt w:val="decimal"/>
       <w:lvlText w:val=""/>
       <w:lvlJc w:val="left"/>
     </w:lvl>
   </w:abstractNum>
-  <w:abstractNum w:abstractNumId="10" w15:restartNumberingAfterBreak="0">
-    <w:nsid w:val="6019741D"/>
+  <w:abstractNum w:abstractNumId="13" w15:restartNumberingAfterBreak="0">
+    <w:nsid w:val="7E170CF2"/>
     <w:multiLevelType w:val="hybridMultilevel"/>
-    <w:tmpl w:val="AA66ABF6"/>
-    <w:lvl w:ilvl="0" w:tplc="8F6A7A14">
+    <w:tmpl w:val="AC585374"/>
+    <w:lvl w:ilvl="0" w:tplc="0C54593C">
       <w:start w:val="1"/>
       <w:numFmt w:val="decimal"/>
       <w:lvlText w:val="%1."/>
@@ -39064,229 +39226,67 @@
         <w:ind w:left="540" w:hanging="360"/>
       </w:pPr>
     </w:lvl>
-    <w:lvl w:ilvl="1" w:tplc="B45C9F20">
+    <w:lvl w:ilvl="1" w:tplc="A58A2002">
       <w:numFmt w:val="decimal"/>
       <w:lvlText w:val=""/>
       <w:lvlJc w:val="left"/>
     </w:lvl>
-    <w:lvl w:ilvl="2" w:tplc="F5D21A0A">
+    <w:lvl w:ilvl="2" w:tplc="43F6B682">
       <w:numFmt w:val="decimal"/>
       <w:lvlText w:val=""/>
       <w:lvlJc w:val="left"/>
     </w:lvl>
-    <w:lvl w:ilvl="3" w:tplc="35DCBA74">
+    <w:lvl w:ilvl="3" w:tplc="52365F26">
       <w:numFmt w:val="decimal"/>
       <w:lvlText w:val=""/>
       <w:lvlJc w:val="left"/>
     </w:lvl>
-    <w:lvl w:ilvl="4" w:tplc="7C0E8E04">
+    <w:lvl w:ilvl="4" w:tplc="B0705A12">
       <w:numFmt w:val="decimal"/>
       <w:lvlText w:val=""/>
       <w:lvlJc w:val="left"/>
     </w:lvl>
-    <w:lvl w:ilvl="5" w:tplc="CCD80418">
+    <w:lvl w:ilvl="5" w:tplc="EE583AFA">
       <w:numFmt w:val="decimal"/>
       <w:lvlText w:val=""/>
       <w:lvlJc w:val="left"/>
     </w:lvl>
-    <w:lvl w:ilvl="6" w:tplc="70D63808">
+    <w:lvl w:ilvl="6" w:tplc="183892C4">
       <w:numFmt w:val="decimal"/>
       <w:lvlText w:val=""/>
       <w:lvlJc w:val="left"/>
     </w:lvl>
-    <w:lvl w:ilvl="7" w:tplc="120E10F6">
+    <w:lvl w:ilvl="7" w:tplc="156669F0">
       <w:numFmt w:val="decimal"/>
       <w:lvlText w:val=""/>
       <w:lvlJc w:val="left"/>
     </w:lvl>
-    <w:lvl w:ilvl="8" w:tplc="F73C7808">
+    <w:lvl w:ilvl="8" w:tplc="A3709E50">
       <w:numFmt w:val="decimal"/>
       <w:lvlText w:val=""/>
       <w:lvlJc w:val="left"/>
     </w:lvl>
   </w:abstractNum>
-  <w:abstractNum w:abstractNumId="11" w15:restartNumberingAfterBreak="0">
-    <w:nsid w:val="61512090"/>
-    <w:multiLevelType w:val="hybridMultilevel"/>
-    <w:tmpl w:val="D89698BA"/>
-    <w:lvl w:ilvl="0" w:tplc="86C0D948">
-      <w:start w:val="1"/>
-      <w:numFmt w:val="decimal"/>
-      <w:lvlText w:val="%1."/>
-      <w:lvlJc w:val="left"/>
-      <w:pPr>
-        <w:ind w:left="540" w:hanging="360"/>
-      </w:pPr>
-    </w:lvl>
-    <w:lvl w:ilvl="1" w:tplc="4282BF78">
-      <w:numFmt w:val="decimal"/>
-      <w:lvlText w:val=""/>
-      <w:lvlJc w:val="left"/>
-    </w:lvl>
-    <w:lvl w:ilvl="2" w:tplc="0ECAB7DE">
-      <w:numFmt w:val="decimal"/>
-      <w:lvlText w:val=""/>
-      <w:lvlJc w:val="left"/>
-    </w:lvl>
-    <w:lvl w:ilvl="3" w:tplc="30CA0F86">
-      <w:numFmt w:val="decimal"/>
-      <w:lvlText w:val=""/>
-      <w:lvlJc w:val="left"/>
-    </w:lvl>
-    <w:lvl w:ilvl="4" w:tplc="C3F4FA60">
-      <w:numFmt w:val="decimal"/>
-      <w:lvlText w:val=""/>
-      <w:lvlJc w:val="left"/>
-    </w:lvl>
-    <w:lvl w:ilvl="5" w:tplc="D3E484B0">
-      <w:numFmt w:val="decimal"/>
-      <w:lvlText w:val=""/>
-      <w:lvlJc w:val="left"/>
-    </w:lvl>
-    <w:lvl w:ilvl="6" w:tplc="B386B278">
-      <w:numFmt w:val="decimal"/>
-      <w:lvlText w:val=""/>
-      <w:lvlJc w:val="left"/>
-    </w:lvl>
-    <w:lvl w:ilvl="7" w:tplc="2A880D02">
-      <w:numFmt w:val="decimal"/>
-      <w:lvlText w:val=""/>
-      <w:lvlJc w:val="left"/>
-    </w:lvl>
-    <w:lvl w:ilvl="8" w:tplc="7A021DEE">
-      <w:numFmt w:val="decimal"/>
-      <w:lvlText w:val=""/>
-      <w:lvlJc w:val="left"/>
-    </w:lvl>
-  </w:abstractNum>
-  <w:abstractNum w:abstractNumId="12" w15:restartNumberingAfterBreak="0">
-    <w:nsid w:val="66A46372"/>
-    <w:multiLevelType w:val="hybridMultilevel"/>
-    <w:tmpl w:val="D2742A40"/>
-    <w:lvl w:ilvl="0" w:tplc="5B0E90E4">
-      <w:start w:val="1"/>
-      <w:numFmt w:val="decimal"/>
-      <w:lvlText w:val="%1."/>
-      <w:lvlJc w:val="left"/>
-      <w:pPr>
-        <w:ind w:left="540" w:hanging="360"/>
-      </w:pPr>
-    </w:lvl>
-    <w:lvl w:ilvl="1" w:tplc="205E0AA8">
-      <w:numFmt w:val="decimal"/>
-      <w:lvlText w:val=""/>
-      <w:lvlJc w:val="left"/>
-    </w:lvl>
-    <w:lvl w:ilvl="2" w:tplc="4E84AB60">
-      <w:numFmt w:val="decimal"/>
-      <w:lvlText w:val=""/>
-      <w:lvlJc w:val="left"/>
-    </w:lvl>
-    <w:lvl w:ilvl="3" w:tplc="F17827C8">
-      <w:numFmt w:val="decimal"/>
-      <w:lvlText w:val=""/>
-      <w:lvlJc w:val="left"/>
-    </w:lvl>
-    <w:lvl w:ilvl="4" w:tplc="9528AEEA">
-      <w:numFmt w:val="decimal"/>
-      <w:lvlText w:val=""/>
-      <w:lvlJc w:val="left"/>
-    </w:lvl>
-    <w:lvl w:ilvl="5" w:tplc="F8C422CE">
-      <w:numFmt w:val="decimal"/>
-      <w:lvlText w:val=""/>
-      <w:lvlJc w:val="left"/>
-    </w:lvl>
-    <w:lvl w:ilvl="6" w:tplc="8ED4E1C6">
-      <w:numFmt w:val="decimal"/>
-      <w:lvlText w:val=""/>
-      <w:lvlJc w:val="left"/>
-    </w:lvl>
-    <w:lvl w:ilvl="7" w:tplc="01A6B420">
-      <w:numFmt w:val="decimal"/>
-      <w:lvlText w:val=""/>
-      <w:lvlJc w:val="left"/>
-    </w:lvl>
-    <w:lvl w:ilvl="8" w:tplc="E5B4ED8A">
-      <w:numFmt w:val="decimal"/>
-      <w:lvlText w:val=""/>
-      <w:lvlJc w:val="left"/>
-    </w:lvl>
-  </w:abstractNum>
-  <w:abstractNum w:abstractNumId="13" w15:restartNumberingAfterBreak="0">
-    <w:nsid w:val="72F740E4"/>
-    <w:multiLevelType w:val="hybridMultilevel"/>
-    <w:tmpl w:val="43D0E154"/>
-    <w:lvl w:ilvl="0" w:tplc="E4447F50">
-      <w:start w:val="1"/>
-      <w:numFmt w:val="bullet"/>
-      <w:lvlText w:val="•"/>
-      <w:lvlJc w:val="left"/>
-      <w:pPr>
-        <w:ind w:left="540" w:hanging="300"/>
-      </w:pPr>
-    </w:lvl>
-    <w:lvl w:ilvl="1" w:tplc="8410E294">
-      <w:numFmt w:val="decimal"/>
-      <w:lvlText w:val=""/>
-      <w:lvlJc w:val="left"/>
-    </w:lvl>
-    <w:lvl w:ilvl="2" w:tplc="067ADEEA">
-      <w:numFmt w:val="decimal"/>
-      <w:lvlText w:val=""/>
-      <w:lvlJc w:val="left"/>
-    </w:lvl>
-    <w:lvl w:ilvl="3" w:tplc="714CF5D6">
-      <w:numFmt w:val="decimal"/>
-      <w:lvlText w:val=""/>
-      <w:lvlJc w:val="left"/>
-    </w:lvl>
-    <w:lvl w:ilvl="4" w:tplc="A574F48E">
-      <w:numFmt w:val="decimal"/>
-      <w:lvlText w:val=""/>
-      <w:lvlJc w:val="left"/>
-    </w:lvl>
-    <w:lvl w:ilvl="5" w:tplc="9E5E01C2">
-      <w:numFmt w:val="decimal"/>
-      <w:lvlText w:val=""/>
-      <w:lvlJc w:val="left"/>
-    </w:lvl>
-    <w:lvl w:ilvl="6" w:tplc="E2383E18">
-      <w:numFmt w:val="decimal"/>
-      <w:lvlText w:val=""/>
-      <w:lvlJc w:val="left"/>
-    </w:lvl>
-    <w:lvl w:ilvl="7" w:tplc="9EE68160">
-      <w:numFmt w:val="decimal"/>
-      <w:lvlText w:val=""/>
-      <w:lvlJc w:val="left"/>
-    </w:lvl>
-    <w:lvl w:ilvl="8" w:tplc="D668E532">
-      <w:numFmt w:val="decimal"/>
-      <w:lvlText w:val=""/>
-      <w:lvlJc w:val="left"/>
-    </w:lvl>
-  </w:abstractNum>
-  <w:num w:numId="1" w16cid:durableId="1772123646">
-    <w:abstractNumId w:val="1"/>
+  <w:num w:numId="1" w16cid:durableId="609091984">
+    <w:abstractNumId w:val="3"/>
     <w:lvlOverride w:ilvl="0">
       <w:startOverride w:val="1"/>
     </w:lvlOverride>
   </w:num>
-  <w:num w:numId="2" w16cid:durableId="1094938925">
-    <w:abstractNumId w:val="13"/>
+  <w:num w:numId="2" w16cid:durableId="1012951210">
+    <w:abstractNumId w:val="7"/>
     <w:lvlOverride w:ilvl="0">
       <w:startOverride w:val="1"/>
     </w:lvlOverride>
   </w:num>
-  <w:num w:numId="3" w16cid:durableId="391124974">
-    <w:abstractNumId w:val="0"/>
+  <w:num w:numId="3" w16cid:durableId="274169004">
+    <w:abstractNumId w:val="10"/>
     <w:lvlOverride w:ilvl="0">
       <w:startOverride w:val="1"/>
     </w:lvlOverride>
   </w:num>
-  <w:num w:numId="4" w16cid:durableId="1250894755">
-    <w:abstractNumId w:val="3"/>
+  <w:num w:numId="4" w16cid:durableId="784813058">
+    <w:abstractNumId w:val="9"/>
     <w:lvlOverride w:ilvl="0">
       <w:startOverride w:val="1"/>
     </w:lvlOverride>
@@ -39974,7 +39974,7 @@
     <w:autoRedefine/>
     <w:uiPriority w:val="39"/>
     <w:unhideWhenUsed/>
-    <w:rsid w:val="0098637B"/>
+    <w:rsid w:val="003B03D8"/>
     <w:pPr>
       <w:spacing w:after="100"/>
     </w:pPr>
@@ -39989,7 +39989,7 @@
     <w:autoRedefine/>
     <w:uiPriority w:val="39"/>
     <w:unhideWhenUsed/>
-    <w:rsid w:val="0098637B"/>
+    <w:rsid w:val="003B03D8"/>
     <w:pPr>
       <w:spacing w:after="100"/>
       <w:ind w:left="220"/>

</xml_diff>